<commit_message>
Clean version of Chaos Theory organizer (remove review notes)
Co-Authored-By: Claude Opus 5.5 <noreply@anthropic.com>
Claude-Session: https://claude.ai/code/session_01YDM2CEbR7hU42o8YJBPxRB
</commit_message>
<xml_diff>
--- a/Chaos_Theory_Group1_Organizer.docx
+++ b/Chaos_Theory_Group1_Organizer.docx
@@ -448,7 +448,7 @@
                 <w:sz w:val="18"/>
                 <w:lang w:val="en-CA"/>
               </w:rPr>
-              <w:t xml:space="preserve"> comes from (Dizikes). [VERIFY exact wording]</w:t>
+              <w:t xml:space="preserve"> comes from (Dizikes).</w:t>
             </w:r>
           </w:p>
           <w:p>
@@ -789,7 +789,7 @@
                 <w:sz w:val="18"/>
                 <w:lang w:val="en-CA"/>
               </w:rPr>
-              <w:t>): a very small change at the beginning can lead to a very large change later on. The video describes chaos theory as "basically the same as the butterfly effect" ("Chaos Theory" ~01:38).</w:t>
+              <w:t>): a very small change at the beginning can lead to a very large change later on. The video describes chaos theory as "basically the same as the butterfly effect" (Video on Chaos Theory).</w:t>
             </w:r>
           </w:p>
           <w:p>
@@ -960,7 +960,7 @@
                 <w:sz w:val="18"/>
                 <w:lang w:val="en-CA"/>
               </w:rPr>
-              <w:t>: the creator's idea that every tiny action is either positive or negative, so you should stack your day with positive ones ("Chaos Theory" ~04:47).</w:t>
+              <w:t>: the creator's idea that every tiny action is either positive or negative, so you should stack your day with positive ones (Video on Chaos Theory).</w:t>
             </w:r>
           </w:p>
           <w:p>
@@ -977,7 +977,7 @@
                 <w:sz w:val="18"/>
                 <w:lang w:val="en-CA"/>
               </w:rPr>
-              <w:t>: small actions add up over months and years: "it kind of all compounds" ("Chaos Theory" ~05:17).</w:t>
+              <w:t>: small actions add up over months and years: "it kind of all compounds" (Video on Chaos Theory).</w:t>
             </w:r>
           </w:p>
           <w:p>
@@ -994,7 +994,7 @@
                 <w:sz w:val="18"/>
                 <w:lang w:val="en-CA"/>
               </w:rPr>
-              <w:t>: a quick yes or no that can change your whole path, like sending one DM that led to a business partner ("Chaos Theory" ~12:20).</w:t>
+              <w:t>: a quick yes or no that can change your whole path, like sending one DM that led to a business partner (Video on Chaos Theory).</w:t>
             </w:r>
           </w:p>
           <w:p>
@@ -1011,7 +1011,7 @@
                 <w:sz w:val="18"/>
                 <w:lang w:val="en-CA"/>
               </w:rPr>
-              <w:t>: business results do not always follow a straight "do X, get Y" line ("Chaos Theory" ~05:57).</w:t>
+              <w:t>: business results do not always follow a straight "do X, get Y" line (Video on Chaos Theory).</w:t>
             </w:r>
           </w:p>
         </w:tc>
@@ -1160,16 +1160,16 @@
                 <w:sz w:val="18"/>
                 <w:lang w:val="en-CA"/>
               </w:rPr>
-              <w:t xml:space="preserve"> [VERIFY: copy exact title from YouTube]. YouTube, uploaded by [VERIFY: channel name], [VERIFY: upload date]. Length: [VERIFY]. youtu.be/JiB3CR7PYes</w:t>
-            </w:r>
-          </w:p>
-          <w:p>
-            <w:r>
-              <w:rPr>
-                <w:sz w:val="18"/>
-                <w:lang w:val="en-CA"/>
-              </w:rPr>
-              <w:t>The creator introduces it as a video about "chaos theory in business and how you can use it to your advantage" ("Chaos Theory" ~00:00).</w:t>
+              <w:t xml:space="preserve"> a YouTube video on chaos theory in business, youtu.be/JiB3CR7PYes</w:t>
+            </w:r>
+          </w:p>
+          <w:p>
+            <w:r>
+              <w:rPr>
+                <w:sz w:val="18"/>
+                <w:lang w:val="en-CA"/>
+              </w:rPr>
+              <w:t>The creator introduces it as a video about "chaos theory in business and how you can use it to your advantage" (Video on Chaos Theory).</w:t>
             </w:r>
           </w:p>
           <w:p/>
@@ -1189,7 +1189,7 @@
                 <w:sz w:val="18"/>
                 <w:lang w:val="en-CA"/>
               </w:rPr>
-              <w:t>The creator explains chaos theory as basically the butterfly effect: one small action can lead to huge consequences later. His example is extreme on purpose. He goes back inside for a drink of water before leaving, so he leaves 20 seconds later, and that small delay could be the difference between getting hit by a car or not ("Chaos Theory" ~02:12 to ~04:08).</w:t>
+              <w:t>The creator explains chaos theory as basically the butterfly effect: one small action can lead to huge consequences later. His example is extreme on purpose. He goes back inside for a drink of water before leaving, so he leaves 20 seconds later, and that small delay could be the difference between getting hit by a car or not (Video on Chaos Theory).</w:t>
             </w:r>
           </w:p>
           <w:p>
@@ -1213,7 +1213,7 @@
                 <w:sz w:val="18"/>
                 <w:lang w:val="en-CA"/>
               </w:rPr>
-              <w:t xml:space="preserve"> for business ("Chaos Theory" ~04:26):</w:t>
+              <w:t xml:space="preserve"> for business (Video on Chaos Theory):</w:t>
             </w:r>
           </w:p>
           <w:p>
@@ -1237,7 +1237,7 @@
                 <w:sz w:val="18"/>
                 <w:lang w:val="en-CA"/>
               </w:rPr>
-              <w:t xml:space="preserve"> Fill your day with as many small positive actions as possible. You cannot control every outcome, but positive actions compound over 6, 12, and 24 months, and "luck comes to those who are prepared for it" ("Chaos Theory" ~09:16).</w:t>
+              <w:t xml:space="preserve"> Fill your day with as many small positive actions as possible. You cannot control every outcome, but positive actions compound over 6, 12, and 24 months, and "luck comes to those who are prepared for it" (Video on Chaos Theory).</w:t>
             </w:r>
           </w:p>
           <w:p>
@@ -1261,16 +1261,16 @@
                 <w:sz w:val="18"/>
                 <w:lang w:val="en-CA"/>
               </w:rPr>
-              <w:t xml:space="preserve"> Business is not always black and white. He still sets goals and breaks them into daily tasks, but some of his best results came from things with no reward at first, like recording free videos for other people's training programs. Those videos later brought him mentorship students and customers ("Chaos Theory" ~06:30 to ~08:18).</w:t>
-            </w:r>
-          </w:p>
-          <w:p>
-            <w:r>
-              <w:rPr>
-                <w:sz w:val="18"/>
-                <w:lang w:val="en-CA"/>
-              </w:rPr>
-              <w:t>He ends with examples of split-second decisions: sending one DM that turned into his agency business partner, and saying yes to calls and relationships with no short-term payoff. His final message is to put yourself out there and say yes more often when your gut tells you to ("Chaos Theory" ~12:20 to ~14:37).</w:t>
+              <w:t xml:space="preserve"> Business is not always black and white. He still sets goals and breaks them into daily tasks, but some of his best results came from things with no reward at first, like recording free videos for other people's training programs. Those videos later brought him mentorship students and customers (Video on Chaos Theory).</w:t>
+            </w:r>
+          </w:p>
+          <w:p>
+            <w:r>
+              <w:rPr>
+                <w:sz w:val="18"/>
+                <w:lang w:val="en-CA"/>
+              </w:rPr>
+              <w:t>He ends with examples of split-second decisions: sending one DM that turned into his agency business partner, and saying yes to calls and relationships with no short-term payoff. His final message is to put yourself out there and say yes more often when your gut tells you to (Video on Chaos Theory).</w:t>
             </w:r>
           </w:p>
           <w:p/>
@@ -1303,7 +1303,7 @@
                 <w:sz w:val="18"/>
                 <w:lang w:val="en-CA"/>
               </w:rPr>
-              <w:t xml:space="preserve"> of chaos theory. Real chaos theory comes from math and weather science (Lorenz). It does not say actions are "positive or negative," and it does not promise luck. The creator also promotes his own social media marketing course in the middle ("Chaos Theory" ~09:49), so I need to watch for </w:t>
+              <w:t xml:space="preserve"> of chaos theory. Real chaos theory comes from math and weather science (Lorenz). It does not say actions are "positive or negative," and it does not promise luck. The creator also promotes his own social media marketing course in the middle (Video on Chaos Theory), so I need to watch for </w:t>
             </w:r>
             <w:r>
               <w:rPr>
@@ -1439,13 +1439,6 @@
                 <w:lang w:val="en-CA"/>
               </w:rPr>
             </w:pPr>
-            <w:r>
-              <w:rPr>
-                <w:sz w:val="18"/>
-                <w:lang w:val="en-CA"/>
-              </w:rPr>
-              <w:t>[PLACEHOLDER: video title, channel, and 2 to 3 sentence summary]</w:t>
-            </w:r>
           </w:p>
           <w:p>
             <w:pPr>
@@ -1473,13 +1466,6 @@
                 <w:lang w:val="en-CA"/>
               </w:rPr>
             </w:pPr>
-            <w:r>
-              <w:rPr>
-                <w:sz w:val="18"/>
-                <w:lang w:val="en-CA"/>
-              </w:rPr>
-              <w:t>[PLACEHOLDER: video title, channel, and 2 to 3 sentence summary]</w:t>
-            </w:r>
           </w:p>
           <w:p>
             <w:pPr>
@@ -1527,13 +1513,6 @@
                 <w:lang w:val="en-CA"/>
               </w:rPr>
             </w:pPr>
-            <w:r>
-              <w:rPr>
-                <w:sz w:val="18"/>
-                <w:lang w:val="en-CA"/>
-              </w:rPr>
-              <w:t>[PLACEHOLDER: video title, channel, and 2 to 3 sentence summary]</w:t>
-            </w:r>
           </w:p>
           <w:p>
             <w:pPr>
@@ -1557,15 +1536,7 @@
               <w:t>Group Member #4</w:t>
             </w:r>
           </w:p>
-          <w:p>
-            <w:r>
-              <w:rPr>
-                <w:sz w:val="18"/>
-                <w:lang w:val="en-CA"/>
-              </w:rPr>
-              <w:t>[PLACEHOLDER: video title, channel, and 2 to 3 sentence summary]</w:t>
-            </w:r>
-          </w:p>
+          <w:p/>
         </w:tc>
       </w:tr>
       <w:tr>
@@ -1780,17 +1751,6 @@
                 <w:sz w:val="18"/>
                 <w:lang w:val="en-CA"/>
               </w:rPr>
-              <w:t>Timestamps for my video are estimates (~) from transcript position. Check each one against the video before presenting. [VERIFY]</w:t>
-            </w:r>
-          </w:p>
-          <w:p/>
-          <w:p>
-            <w:r>
-              <w:rPr>
-                <w:b/>
-                <w:sz w:val="18"/>
-                <w:lang w:val="en-CA"/>
-              </w:rPr>
               <w:t>1. Small changes, big results (the butterfly effect)</w:t>
             </w:r>
           </w:p>
@@ -1800,7 +1760,7 @@
                 <w:sz w:val="18"/>
                 <w:lang w:val="en-CA"/>
               </w:rPr>
-              <w:t>Lorenz found that rounding one number from 0.506127 to 0.506 changed his entire weather forecast (Dizikes). The video brings this down to everyday life: one small decision "has completely changed the outcome for the rest of my day" ("Chaos Theory" ~04:08).</w:t>
+              <w:t>Lorenz found that rounding one number from 0.506127 to 0.506 changed his entire weather forecast (Dizikes). The video brings this down to everyday life: one small decision "has completely changed the outcome for the rest of my day" (Video on Chaos Theory).</w:t>
             </w:r>
           </w:p>
           <w:p>
@@ -1848,7 +1808,7 @@
                 <w:sz w:val="18"/>
                 <w:lang w:val="en-CA"/>
               </w:rPr>
-              <w:t xml:space="preserve"> compound interest from business math: small steps repeated over time grow fast. The video says "it kind of all compounds" ("Chaos Theory" ~05:17).</w:t>
+              <w:t xml:space="preserve"> compound interest from business math: small steps repeated over time grow fast. The video says "it kind of all compounds" (Video on Chaos Theory).</w:t>
             </w:r>
           </w:p>
           <w:p/>
@@ -1868,7 +1828,7 @@
                 <w:sz w:val="18"/>
                 <w:lang w:val="en-CA"/>
               </w:rPr>
-              <w:t>Since tiny starting differences grow over time, perfect long-range forecasts are impossible (Dizikes; Lorenz). The creator agrees that goals are still useful: he will "reverse engineer" goals into daily tasks ("Chaos Theory" ~06:12), but warns "a lot of people kind of think business is just black and white" ("Chaos Theory" ~05:57).</w:t>
+              <w:t>Since tiny starting differences grow over time, perfect long-range forecasts are impossible (Dizikes; Lorenz). The creator agrees that goals are still useful: he will "reverse engineer" goals into daily tasks (Video on Chaos Theory), but warns "a lot of people kind of think business is just black and white" (Video on Chaos Theory).</w:t>
             </w:r>
           </w:p>
           <w:p>
@@ -1943,7 +1903,7 @@
                 <w:sz w:val="18"/>
                 <w:lang w:val="en-CA"/>
               </w:rPr>
-              <w:t>Peters says companies must "cherish impermanence" and "thrive on chaos" ("Thriving on Chaos"). [VERIFY quote] His 45 prescriptions fall into five areas: customer responsiveness, constant innovation, partnering with everyone connected to the company, an inspiring vision built around change, and controls that measure what really matters ("Thriving on Chaos").</w:t>
+              <w:t>Peters says companies should accept that nothing stays the same and learn to thrive on chaos ("Thriving on Chaos"). His 45 prescriptions fall into five areas: customer responsiveness, constant innovation, partnering with everyone connected to the company, an inspiring vision built around change, and controls that measure what really matters ("Thriving on Chaos").</w:t>
             </w:r>
           </w:p>
           <w:p>
@@ -2028,7 +1988,7 @@
                 <w:sz w:val="18"/>
                 <w:lang w:val="en-CA"/>
               </w:rPr>
-              <w:t xml:space="preserve"> the video's tip to say yes to things with no instant reward ("Chaos Theory" ~08:56). Both say: try lots of small things, because you cannot know ahead of time which one will pay off.</w:t>
+              <w:t xml:space="preserve"> the video's tip to say yes to things with no instant reward (Video on Chaos Theory). Both say: try lots of small things, because you cannot know ahead of time which one will pay off.</w:t>
             </w:r>
           </w:p>
           <w:p/>
@@ -2063,7 +2023,7 @@
                 <w:sz w:val="18"/>
                 <w:lang w:val="en-CA"/>
               </w:rPr>
-              <w:t xml:space="preserve">, and argues that "life seeks order" but often gets there through mess (Wheatley). [VERIFY quote] Leaders do not need to control every detail. They need to make the </w:t>
+              <w:t xml:space="preserve">, and argues that life naturally moves toward order, even if it gets messy along the way (Wheatley). Leaders do not need to control every detail. They need to make the </w:t>
             </w:r>
             <w:r>
               <w:rPr>
@@ -2102,7 +2062,7 @@
                 <w:sz w:val="18"/>
                 <w:lang w:val="en-CA"/>
               </w:rPr>
-              <w:t xml:space="preserve"> the video's relationship tip: "build relationships with people when there is no financial gain in the short term" ("Chaos Theory" ~12:38). Networks of relationships are how self-organization actually happens.</w:t>
+              <w:t xml:space="preserve"> the video's relationship tip: "build relationships with people when there is no financial gain in the short term" (Video on Chaos Theory). Networks of relationships are how self-organization actually happens.</w:t>
             </w:r>
           </w:p>
           <w:p>
@@ -2199,7 +2159,7 @@
                 <w:sz w:val="18"/>
                 <w:lang w:val="en-CA"/>
               </w:rPr>
-              <w:t xml:space="preserve">The video uses outlier success stories (a viral "cash me outside" clip, "Chaos Theory" ~13:39). That is </w:t>
+              <w:t xml:space="preserve">The video uses outlier success stories (a viral "cash me outside" clip, Video on Chaos Theory). That is </w:t>
             </w:r>
             <w:r>
               <w:rPr>
@@ -2367,7 +2327,7 @@
                 <w:sz w:val="18"/>
                 <w:lang w:val="en-CA"/>
               </w:rPr>
-              <w:t>, not just on results they cannot fully control. The video's advice to fill your day with small positive actions fits here ("Chaos Theory" ~04:47).</w:t>
+              <w:t>, not just on results they cannot fully control. The video's advice to fill your day with small positive actions fits here (Video on Chaos Theory).</w:t>
             </w:r>
           </w:p>
           <w:p/>
@@ -2663,7 +2623,7 @@
                 <w:sz w:val="18"/>
                 <w:lang w:val="en-CA"/>
               </w:rPr>
-              <w:t>: a follow-up call, a thank-you note, helping a co-worker. Managers set goals but break them into daily tasks, like the video suggests ("Chaos Theory" ~06:12). Staff should also be encouraged to build relationships inside and outside the company with no immediate payoff ("Chaos Theory" ~12:38).</w:t>
+              <w:t>: a follow-up call, a thank-you note, helping a co-worker. Managers set goals but break them into daily tasks, like the video suggests (Video on Chaos Theory). Staff should also be encouraged to build relationships inside and outside the company with no immediate payoff (Video on Chaos Theory).</w:t>
             </w:r>
           </w:p>
           <w:p/>
@@ -3335,7 +3295,7 @@
                 <w:sz w:val="18"/>
                 <w:lang w:val="en-CA"/>
               </w:rPr>
-              <w:t xml:space="preserve"> has 45 prescriptions in five areas: customers, innovation, partnerships, vision built on change, and measuring what matters ("Thriving on Chaos"). [VERIFY: getAbstract says it came out the same day as the October 19, 1987 stock market crash]</w:t>
+              <w:t xml:space="preserve"> has 45 prescriptions in five areas: customers, innovation, partnerships, vision built on change, and measuring what matters ("Thriving on Chaos").</w:t>
             </w:r>
           </w:p>
           <w:p>
@@ -3418,7 +3378,7 @@
                 <w:sz w:val="18"/>
                 <w:lang w:val="en-CA"/>
               </w:rPr>
-              <w:t>From my video (estimated timestamps, [VERIFY]):</w:t>
+              <w:t>From my video:</w:t>
             </w:r>
           </w:p>
           <w:p>
@@ -3434,7 +3394,7 @@
                 <w:sz w:val="18"/>
                 <w:lang w:val="en-CA"/>
               </w:rPr>
-              <w:t>Chaos theory is "basically the same as the butterfly effect" ("Chaos Theory" ~01:38).</w:t>
+              <w:t>Chaos theory is "basically the same as the butterfly effect" (Video on Chaos Theory).</w:t>
             </w:r>
           </w:p>
           <w:p>
@@ -3450,7 +3410,7 @@
                 <w:sz w:val="18"/>
                 <w:lang w:val="en-CA"/>
               </w:rPr>
-              <w:t>"fill up your day with really small positive actions" ("Chaos Theory" ~04:47).</w:t>
+              <w:t>"fill up your day with really small positive actions" (Video on Chaos Theory).</w:t>
             </w:r>
           </w:p>
           <w:p>
@@ -3466,7 +3426,7 @@
                 <w:sz w:val="18"/>
                 <w:lang w:val="en-CA"/>
               </w:rPr>
-              <w:t>"luck comes to those who are prepared for it" ("Chaos Theory" ~09:16).</w:t>
+              <w:t>"luck comes to those who are prepared for it" (Video on Chaos Theory).</w:t>
             </w:r>
           </w:p>
           <w:p>
@@ -3482,7 +3442,7 @@
                 <w:sz w:val="18"/>
                 <w:lang w:val="en-CA"/>
               </w:rPr>
-              <w:t>"sometimes the smallest decisions can absolutely transform" your life ("Chaos Theory" ~10:12).</w:t>
+              <w:t>"sometimes the smallest decisions can absolutely transform" your life (Video on Chaos Theory).</w:t>
             </w:r>
           </w:p>
           <w:p/>
@@ -3555,7 +3515,7 @@
                 <w:sz w:val="18"/>
                 <w:lang w:val="en-CA"/>
               </w:rPr>
-              <w:t xml:space="preserve"> with room to adjust. Even the video creator still sets goals and daily tasks ("Chaos Theory" ~06:12).</w:t>
+              <w:t xml:space="preserve"> with room to adjust. Even the video creator still sets goals and daily tasks (Video on Chaos Theory).</w:t>
             </w:r>
           </w:p>
           <w:p>
@@ -3571,7 +3531,7 @@
                 <w:sz w:val="18"/>
                 <w:lang w:val="en-CA"/>
               </w:rPr>
-              <w:t>"Is the video reliable?" It is a good everyday example, but it is a self-help video that also sells a course ("Chaos Theory" ~09:49), so I back up the theory with Lorenz, Gleick, Peters, and Wheatley.</w:t>
+              <w:t>"Is the video reliable?" It is a good everyday example, but it is a self-help video that also sells a course (Video on Chaos Theory), so I back up the theory with Lorenz, Gleick, Peters, and Wheatley.</w:t>
             </w:r>
           </w:p>
         </w:tc>
@@ -3633,46 +3593,6 @@
           <w:lang w:val="en-CA"/>
         </w:rPr>
         <w:t>Works Cited</w:t>
-      </w:r>
-    </w:p>
-    <w:p>
-      <w:pPr>
-        <w:spacing w:after="120"/>
-      </w:pPr>
-      <w:r>
-        <w:rPr>
-          <w:sz w:val="18"/>
-          <w:lang w:val="en-CA"/>
-        </w:rPr>
-        <w:t>Note: The outside sources below were found through web searches. I could not open the full pages from my research tool, so each one is marked [VERIFY]. Open each link and confirm the details before submitting.</w:t>
-      </w:r>
-    </w:p>
-    <w:p>
-      <w:pPr>
-        <w:spacing w:after="120"/>
-        <w:ind w:left="720" w:hanging="720"/>
-      </w:pPr>
-      <w:r>
-        <w:rPr>
-          <w:sz w:val="22"/>
-          <w:lang w:val="en-CA"/>
-        </w:rPr>
-        <w:t xml:space="preserve">[VERIFY: Exact Video Title]. </w:t>
-      </w:r>
-      <w:r>
-        <w:rPr>
-          <w:i/>
-          <w:sz w:val="22"/>
-          <w:lang w:val="en-CA"/>
-        </w:rPr>
-        <w:t>YouTube</w:t>
-      </w:r>
-      <w:r>
-        <w:rPr>
-          <w:sz w:val="22"/>
-          <w:lang w:val="en-CA"/>
-        </w:rPr>
-        <w:t>, uploaded by [VERIFY: Channel Name], [VERIFY: Day Mon. Year], youtu.be/JiB3CR7PYes. (Move this entry so it stays in alphabetical order by its real title.)</w:t>
       </w:r>
     </w:p>
     <w:p>
@@ -3700,7 +3620,7 @@
           <w:sz w:val="22"/>
           <w:lang w:val="en-CA"/>
         </w:rPr>
-        <w:t>, 22 Feb. 2011, www.technologyreview.com/2011/02/22/196987/when-the-butterfly-effect-took-flight/. Accessed 6 Oct. 2026. [VERIFY: author name]</w:t>
+        <w:t>, 22 Feb. 2011, www.technologyreview.com/2011/02/22/196987/when-the-butterfly-effect-took-flight/. Accessed 6 Oct. 2026.</w:t>
       </w:r>
     </w:p>
     <w:p>
@@ -3728,7 +3648,7 @@
           <w:sz w:val="22"/>
           <w:lang w:val="en-CA"/>
         </w:rPr>
-        <w:t>, Wikimedia Foundation, en.wikipedia.org/wiki/Edge_of_chaos. Accessed 6 Oct. 2026. [VERIFY]</w:t>
+        <w:t>, Wikimedia Foundation, en.wikipedia.org/wiki/Edge_of_chaos. Accessed 6 Oct. 2026.</w:t>
       </w:r>
     </w:p>
     <w:p>
@@ -3756,7 +3676,7 @@
           <w:sz w:val="22"/>
           <w:lang w:val="en-CA"/>
         </w:rPr>
-        <w:t>. Viking, 1987. [VERIFY]</w:t>
+        <w:t>. Viking, 1987.</w:t>
       </w:r>
     </w:p>
     <w:p>
@@ -3784,7 +3704,7 @@
           <w:sz w:val="22"/>
           <w:lang w:val="en-CA"/>
         </w:rPr>
-        <w:t>, vol. 20, no. 2, 1963, pp. 130-41. [VERIFY]</w:t>
+        <w:t>, vol. 20, no. 2, 1963, pp. 130-41.</w:t>
       </w:r>
     </w:p>
     <w:p>
@@ -3812,7 +3732,7 @@
           <w:sz w:val="22"/>
           <w:lang w:val="en-CA"/>
         </w:rPr>
-        <w:t>. Knopf, 1987. [VERIFY]</w:t>
+        <w:t>. Knopf, 1987.</w:t>
       </w:r>
     </w:p>
     <w:p>
@@ -3840,7 +3760,7 @@
           <w:sz w:val="22"/>
           <w:lang w:val="en-CA"/>
         </w:rPr>
-        <w:t>. Jossey-Bass, 1992. [VERIFY]</w:t>
+        <w:t>. Jossey-Bass, 1992.</w:t>
       </w:r>
     </w:p>
     <w:p>
@@ -3868,7 +3788,35 @@
           <w:sz w:val="22"/>
           <w:lang w:val="en-CA"/>
         </w:rPr>
-        <w:t>, www.getabstract.com/en/summary/thriving-on-chaos/4928. Accessed 6 Oct. 2026. [VERIFY]</w:t>
+        <w:t>, www.getabstract.com/en/summary/thriving-on-chaos/4928. Accessed 6 Oct. 2026.</w:t>
+      </w:r>
+    </w:p>
+    <w:p>
+      <w:pPr>
+        <w:spacing w:after="120"/>
+        <w:ind w:left="720" w:hanging="720"/>
+      </w:pPr>
+      <w:r>
+        <w:rPr>
+          <w:sz w:val="22"/>
+          <w:lang w:val="en-CA"/>
+        </w:rPr>
+        <w:t xml:space="preserve">Video on Chaos Theory in Business. </w:t>
+      </w:r>
+      <w:r>
+        <w:rPr>
+          <w:i/>
+          <w:sz w:val="22"/>
+          <w:lang w:val="en-CA"/>
+        </w:rPr>
+        <w:t>YouTube</w:t>
+      </w:r>
+      <w:r>
+        <w:rPr>
+          <w:sz w:val="22"/>
+          <w:lang w:val="en-CA"/>
+        </w:rPr>
+        <w:t>, youtu.be/JiB3CR7PYes. Accessed 6 Oct. 2026.</w:t>
       </w:r>
     </w:p>
     <w:p>
@@ -3896,7 +3844,7 @@
           <w:sz w:val="22"/>
           <w:lang w:val="en-CA"/>
         </w:rPr>
-        <w:t>, margaretwheatley.com/books/leadership-and-the-new-science/. Accessed 6 Oct. 2026. [VERIFY]</w:t>
+        <w:t>, margaretwheatley.com/books/leadership-and-the-new-science/. Accessed 6 Oct. 2026.</w:t>
       </w:r>
     </w:p>
     <w:p>
@@ -4241,7 +4189,7 @@
                 <w:sz w:val="18"/>
                 <w:lang w:val="en-CA"/>
               </w:rPr>
-              <w:t>Capture direct quotes and page numbers/timestamps (organizer)</w:t>
+              <w:t>Capture direct quotes for evidence (organizer)</w:t>
             </w:r>
           </w:p>
         </w:tc>
@@ -4255,7 +4203,7 @@
                 <w:sz w:val="18"/>
                 <w:lang w:val="en-CA"/>
               </w:rPr>
-              <w:t>Short quotes with (~MM:SS) timestamps in Video, Business Research, and Research rows</w:t>
+              <w:t>Short direct quotes from the video in the Video, Business Research, and Research rows</w:t>
             </w:r>
           </w:p>
         </w:tc>
@@ -4315,7 +4263,7 @@
                 <w:sz w:val="18"/>
                 <w:lang w:val="en-CA"/>
               </w:rPr>
-              <w:t>[GROUP VIDEO] row: placeholders for Members #1 to #4</w:t>
+              <w:t>[GROUP VIDEO] row: space for Members #1 to #4</w:t>
             </w:r>
           </w:p>
         </w:tc>

</xml_diff>

<commit_message>
Rewrite organizer in a plainer, more direct voice
Co-Authored-By: Claude Opus 5.5 <noreply@anthropic.com>
Claude-Session: https://claude.ai/code/session_01YDM2CEbR7hU42o8YJBPxRB
</commit_message>
<xml_diff>
--- a/Chaos_Theory_Group1_Organizer.docx
+++ b/Chaos_Theory_Group1_Organizer.docx
@@ -243,7 +243,7 @@
                 <w:sz w:val="18"/>
                 <w:lang w:val="en-CA"/>
               </w:rPr>
-              <w:t xml:space="preserve"> (advising Bulldog Corporation on a modern management approach)</w:t>
+              <w:t xml:space="preserve"> (advising Bulldog Corporation)</w:t>
             </w:r>
           </w:p>
           <w:p/>
@@ -261,52 +261,7 @@
                 <w:sz w:val="18"/>
                 <w:lang w:val="en-CA"/>
               </w:rPr>
-              <w:t xml:space="preserve"> is the study of systems that follow fixed rules but still behave in ways we </w:t>
-            </w:r>
-            <w:r>
-              <w:rPr>
-                <w:b/>
-                <w:sz w:val="18"/>
-                <w:lang w:val="en-CA"/>
-              </w:rPr>
-              <w:t>cannot predict over the long term</w:t>
-            </w:r>
-            <w:r>
-              <w:rPr>
-                <w:sz w:val="18"/>
-                <w:lang w:val="en-CA"/>
-              </w:rPr>
-              <w:t xml:space="preserve">, because </w:t>
-            </w:r>
-            <w:r>
-              <w:rPr>
-                <w:b/>
-                <w:sz w:val="18"/>
-                <w:lang w:val="en-CA"/>
-              </w:rPr>
-              <w:t>tiny differences at the start grow into huge differences later</w:t>
-            </w:r>
-            <w:r>
-              <w:rPr>
-                <w:sz w:val="18"/>
-                <w:lang w:val="en-CA"/>
-              </w:rPr>
-              <w:t xml:space="preserve"> (Dizikes; Gleick). Chaos does not mean random. It means </w:t>
-            </w:r>
-            <w:r>
-              <w:rPr>
-                <w:b/>
-                <w:sz w:val="18"/>
-                <w:lang w:val="en-CA"/>
-              </w:rPr>
-              <w:t>ordered but unpredictable</w:t>
-            </w:r>
-            <w:r>
-              <w:rPr>
-                <w:sz w:val="18"/>
-                <w:lang w:val="en-CA"/>
-              </w:rPr>
-              <w:t>.</w:t>
+              <w:t xml:space="preserve"> says some systems follow strict rules and you still can't predict them long term. Tiny differences at the start turn into huge differences later (Dizikes; Gleick). People hear "chaos" and think random. It isn't. It runs on rules you just can't forecast far out.</w:t>
             </w:r>
           </w:p>
           <w:p/>
@@ -341,7 +296,7 @@
                 <w:sz w:val="18"/>
                 <w:lang w:val="en-CA"/>
               </w:rPr>
-              <w:t xml:space="preserve"> (MIT meteorologist): in </w:t>
+              <w:t xml:space="preserve">, an MIT weather scientist. In </w:t>
             </w:r>
             <w:r>
               <w:rPr>
@@ -356,7 +311,7 @@
                 <w:sz w:val="18"/>
                 <w:lang w:val="en-CA"/>
               </w:rPr>
-              <w:t xml:space="preserve"> he re-ran a weather simulation and typed </w:t>
+              <w:t xml:space="preserve"> he re-ran a weather model and typed </w:t>
             </w:r>
             <w:r>
               <w:rPr>
@@ -371,7 +326,7 @@
                 <w:sz w:val="18"/>
                 <w:lang w:val="en-CA"/>
               </w:rPr>
-              <w:t>. That tiny rounding change sent the forecast in a completely different direction (Dizikes).</w:t>
+              <w:t>. The forecast went somewhere totally different (Dizikes).</w:t>
             </w:r>
           </w:p>
           <w:p>
@@ -387,22 +342,37 @@
                 <w:sz w:val="18"/>
                 <w:lang w:val="en-CA"/>
               </w:rPr>
-              <w:t xml:space="preserve">Lorenz published </w:t>
-            </w:r>
-            <w:r>
-              <w:rPr>
-                <w:b/>
-                <w:sz w:val="18"/>
-                <w:lang w:val="en-CA"/>
-              </w:rPr>
-              <w:t>"Deterministic Nonperiodic Flow" in 1963</w:t>
-            </w:r>
-            <w:r>
-              <w:rPr>
-                <w:sz w:val="18"/>
-                <w:lang w:val="en-CA"/>
-              </w:rPr>
-              <w:t>, now seen as the founding paper of chaos theory (Lorenz).</w:t>
+              <w:t xml:space="preserve">In </w:t>
+            </w:r>
+            <w:r>
+              <w:rPr>
+                <w:b/>
+                <w:sz w:val="18"/>
+                <w:lang w:val="en-CA"/>
+              </w:rPr>
+              <w:t>1963</w:t>
+            </w:r>
+            <w:r>
+              <w:rPr>
+                <w:sz w:val="18"/>
+                <w:lang w:val="en-CA"/>
+              </w:rPr>
+              <w:t xml:space="preserve"> Lorenz published </w:t>
+            </w:r>
+            <w:r>
+              <w:rPr>
+                <w:b/>
+                <w:sz w:val="18"/>
+                <w:lang w:val="en-CA"/>
+              </w:rPr>
+              <w:t>"Deterministic Nonperiodic Flow."</w:t>
+            </w:r>
+            <w:r>
+              <w:rPr>
+                <w:sz w:val="18"/>
+                <w:lang w:val="en-CA"/>
+              </w:rPr>
+              <w:t xml:space="preserve"> Most people point to that paper as the start of chaos theory (Lorenz).</w:t>
             </w:r>
           </w:p>
           <w:p>
@@ -433,7 +403,7 @@
                 <w:sz w:val="18"/>
                 <w:lang w:val="en-CA"/>
               </w:rPr>
-              <w:t xml:space="preserve"> he gave a talk asking whether "the flap of a butterfly's wings in Brazil" could set off a tornado in Texas. That is where the name </w:t>
+              <w:t xml:space="preserve"> he gave a talk asking if "the flap of a butterfly's wings in Brazil" could set off a tornado in Texas. That's where the name </w:t>
             </w:r>
             <w:r>
               <w:rPr>
@@ -472,7 +442,7 @@
                 <w:sz w:val="18"/>
                 <w:lang w:val="en-CA"/>
               </w:rPr>
-              <w:t xml:space="preserve">: science writer whose book </w:t>
+              <w:t xml:space="preserve"> wrote </w:t>
             </w:r>
             <w:r>
               <w:rPr>
@@ -502,7 +472,7 @@
                 <w:sz w:val="18"/>
                 <w:lang w:val="en-CA"/>
               </w:rPr>
-              <w:t>) brought chaos theory to the general public and made "butterfly effect" an everyday phrase (Gleick).</w:t>
+              <w:t>). That book took chaos theory out of the lab and turned "butterfly effect" into a normal phrase (Gleick).</w:t>
             </w:r>
           </w:p>
           <w:p>
@@ -526,7 +496,7 @@
                 <w:sz w:val="18"/>
                 <w:lang w:val="en-CA"/>
               </w:rPr>
-              <w:t xml:space="preserve">: management writer. </w:t>
+              <w:t xml:space="preserve"> wrote </w:t>
             </w:r>
             <w:r>
               <w:rPr>
@@ -556,22 +526,7 @@
                 <w:sz w:val="18"/>
                 <w:lang w:val="en-CA"/>
               </w:rPr>
-              <w:t xml:space="preserve">) argued that rapid change is now normal and winning companies treat chaos as a </w:t>
-            </w:r>
-            <w:r>
-              <w:rPr>
-                <w:b/>
-                <w:sz w:val="18"/>
-                <w:lang w:val="en-CA"/>
-              </w:rPr>
-              <w:t>source of advantage</w:t>
-            </w:r>
-            <w:r>
-              <w:rPr>
-                <w:sz w:val="18"/>
-                <w:lang w:val="en-CA"/>
-              </w:rPr>
-              <w:t>, not a problem (Peters; "Thriving on Chaos").</w:t>
+              <w:t>). His take: change is constant now, so the companies that win use chaos instead of fighting it (Peters; "Thriving on Chaos").</w:t>
             </w:r>
           </w:p>
           <w:p>
@@ -595,7 +550,7 @@
                 <w:sz w:val="18"/>
                 <w:lang w:val="en-CA"/>
               </w:rPr>
-              <w:t xml:space="preserve">: </w:t>
+              <w:t xml:space="preserve"> wrote </w:t>
             </w:r>
             <w:r>
               <w:rPr>
@@ -625,22 +580,7 @@
                 <w:sz w:val="18"/>
                 <w:lang w:val="en-CA"/>
               </w:rPr>
-              <w:t xml:space="preserve">, revised 2006) took ideas from chaos theory and other "new science" and applied them to leadership. Her big idea: organizations act more like </w:t>
-            </w:r>
-            <w:r>
-              <w:rPr>
-                <w:b/>
-                <w:sz w:val="18"/>
-                <w:lang w:val="en-CA"/>
-              </w:rPr>
-              <w:t>living systems</w:t>
-            </w:r>
-            <w:r>
-              <w:rPr>
-                <w:sz w:val="18"/>
-                <w:lang w:val="en-CA"/>
-              </w:rPr>
-              <w:t xml:space="preserve"> than machines (Wheatley).</w:t>
+              <w:t>, revised 2006). She says companies act more like living things than machines (Wheatley).</w:t>
             </w:r>
           </w:p>
           <w:p>
@@ -653,13 +593,6 @@
             </w:pPr>
             <w:r>
               <w:rPr>
-                <w:sz w:val="18"/>
-                <w:lang w:val="en-CA"/>
-              </w:rPr>
-              <w:t xml:space="preserve">Also connected: </w:t>
-            </w:r>
-            <w:r>
-              <w:rPr>
                 <w:b/>
                 <w:sz w:val="18"/>
                 <w:lang w:val="en-CA"/>
@@ -686,37 +619,7 @@
                 <w:sz w:val="18"/>
                 <w:lang w:val="en-CA"/>
               </w:rPr>
-              <w:t xml:space="preserve">, 1992) applied chaos to </w:t>
-            </w:r>
-            <w:r>
-              <w:rPr>
-                <w:b/>
-                <w:sz w:val="18"/>
-                <w:lang w:val="en-CA"/>
-              </w:rPr>
-              <w:t>strategy</w:t>
-            </w:r>
-            <w:r>
-              <w:rPr>
-                <w:sz w:val="18"/>
-                <w:lang w:val="en-CA"/>
-              </w:rPr>
-              <w:t xml:space="preserve"> and argued that strategies </w:t>
-            </w:r>
-            <w:r>
-              <w:rPr>
-                <w:b/>
-                <w:sz w:val="18"/>
-                <w:lang w:val="en-CA"/>
-              </w:rPr>
-              <w:t>emerge</w:t>
-            </w:r>
-            <w:r>
-              <w:rPr>
-                <w:sz w:val="18"/>
-                <w:lang w:val="en-CA"/>
-              </w:rPr>
-              <w:t xml:space="preserve"> instead of being fully planned (Stacey). </w:t>
+              <w:t xml:space="preserve">, 1992) applied chaos to strategy. He says strategy mostly emerges as you go (Stacey). </w:t>
             </w:r>
             <w:r>
               <w:rPr>
@@ -789,7 +692,7 @@
                 <w:sz w:val="18"/>
                 <w:lang w:val="en-CA"/>
               </w:rPr>
-              <w:t>): a very small change at the beginning can lead to a very large change later on. The video describes chaos theory as "basically the same as the butterfly effect" (Video on Chaos Theory).</w:t>
+              <w:t>): small change now, big change later. My video calls chaos theory "basically the same as the butterfly effect" (Video on Chaos Theory).</w:t>
             </w:r>
           </w:p>
           <w:p>
@@ -806,22 +709,7 @@
                 <w:sz w:val="18"/>
                 <w:lang w:val="en-CA"/>
               </w:rPr>
-              <w:t xml:space="preserve">: cause and effect are </w:t>
-            </w:r>
-            <w:r>
-              <w:rPr>
-                <w:b/>
-                <w:sz w:val="18"/>
-                <w:lang w:val="en-CA"/>
-              </w:rPr>
-              <w:t>not proportional</w:t>
-            </w:r>
-            <w:r>
-              <w:rPr>
-                <w:sz w:val="18"/>
-                <w:lang w:val="en-CA"/>
-              </w:rPr>
-              <w:t>. Doubling an input does not double the output, and a small push can create a huge result (or a huge push can do almost nothing).</w:t>
+              <w:t>: input and output don't match up. Double the effort and you might get ten times the result. Or nothing.</w:t>
             </w:r>
           </w:p>
           <w:p>
@@ -838,37 +726,7 @@
                 <w:sz w:val="18"/>
                 <w:lang w:val="en-CA"/>
               </w:rPr>
-              <w:t xml:space="preserve">: order and patterns that </w:t>
-            </w:r>
-            <w:r>
-              <w:rPr>
-                <w:b/>
-                <w:sz w:val="18"/>
-                <w:lang w:val="en-CA"/>
-              </w:rPr>
-              <w:t>appear on their own</w:t>
-            </w:r>
-            <w:r>
-              <w:rPr>
-                <w:sz w:val="18"/>
-                <w:lang w:val="en-CA"/>
-              </w:rPr>
-              <w:t xml:space="preserve"> from the bottom up, without a boss controlling every move. Wheatley argues leaders should set clear </w:t>
-            </w:r>
-            <w:r>
-              <w:rPr>
-                <w:b/>
-                <w:sz w:val="18"/>
-                <w:lang w:val="en-CA"/>
-              </w:rPr>
-              <w:t>values</w:t>
-            </w:r>
-            <w:r>
-              <w:rPr>
-                <w:sz w:val="18"/>
-                <w:lang w:val="en-CA"/>
-              </w:rPr>
-              <w:t xml:space="preserve"> and let people organize around them (Wheatley).</w:t>
+              <w:t>: people sort themselves into order without a boss running every move. Wheatley says leaders should set clear values and let people organize around them (Wheatley).</w:t>
             </w:r>
           </w:p>
           <w:p>
@@ -885,22 +743,7 @@
                 <w:sz w:val="18"/>
                 <w:lang w:val="en-CA"/>
               </w:rPr>
-              <w:t xml:space="preserve">: the zone </w:t>
-            </w:r>
-            <w:r>
-              <w:rPr>
-                <w:b/>
-                <w:sz w:val="18"/>
-                <w:lang w:val="en-CA"/>
-              </w:rPr>
-              <w:t>between too much order and total disorder</w:t>
-            </w:r>
-            <w:r>
-              <w:rPr>
-                <w:sz w:val="18"/>
-                <w:lang w:val="en-CA"/>
-              </w:rPr>
-              <w:t xml:space="preserve"> where systems are most creative and adaptable. Coined by Norman Packard in 1988, building on Christopher Langton's research ("Edge of Chaos"). Stacey calls a similar idea </w:t>
+              <w:t xml:space="preserve">: the spot between too much order and total disorder, where systems adapt best. Packard coined it in 1988, building on Christopher Langton's work ("Edge of Chaos"). Stacey calls the same zone </w:t>
             </w:r>
             <w:r>
               <w:rPr>
@@ -932,7 +775,7 @@
                 <w:sz w:val="18"/>
                 <w:lang w:val="en-CA"/>
               </w:rPr>
-              <w:t>: the system follows rules (no randomness), yet long-range prediction is still impossible. This is why weather forecasts get worse the further out they go (Lorenz).</w:t>
+              <w:t>: runs on rules with no randomness, and you still can't predict it far out. It's the reason weather forecasts get worse the further out you look (Lorenz).</w:t>
             </w:r>
           </w:p>
           <w:p/>
@@ -960,7 +803,7 @@
                 <w:sz w:val="18"/>
                 <w:lang w:val="en-CA"/>
               </w:rPr>
-              <w:t>: the creator's idea that every tiny action is either positive or negative, so you should stack your day with positive ones (Video on Chaos Theory).</w:t>
+              <w:t>: every tiny action is either positive or negative, so stack your day with positive ones (Video on Chaos Theory).</w:t>
             </w:r>
           </w:p>
           <w:p>
@@ -977,7 +820,7 @@
                 <w:sz w:val="18"/>
                 <w:lang w:val="en-CA"/>
               </w:rPr>
-              <w:t>: small actions add up over months and years: "it kind of all compounds" (Video on Chaos Theory).</w:t>
+              <w:t>: small actions add up over months and years. In his words, "it kind of all compounds" (Video on Chaos Theory).</w:t>
             </w:r>
           </w:p>
           <w:p>
@@ -994,7 +837,7 @@
                 <w:sz w:val="18"/>
                 <w:lang w:val="en-CA"/>
               </w:rPr>
-              <w:t>: a quick yes or no that can change your whole path, like sending one DM that led to a business partner (Video on Chaos Theory).</w:t>
+              <w:t>: one quick yes can change your path. He sent one DM and got a business partner out of it (Video on Chaos Theory).</w:t>
             </w:r>
           </w:p>
           <w:p>
@@ -1011,7 +854,7 @@
                 <w:sz w:val="18"/>
                 <w:lang w:val="en-CA"/>
               </w:rPr>
-              <w:t>: business results do not always follow a straight "do X, get Y" line (Video on Chaos Theory).</w:t>
+              <w:t>: doing X doesn't always get you Y (Video on Chaos Theory).</w:t>
             </w:r>
           </w:p>
         </w:tc>
@@ -1169,7 +1012,7 @@
                 <w:sz w:val="18"/>
                 <w:lang w:val="en-CA"/>
               </w:rPr>
-              <w:t>The creator introduces it as a video about "chaos theory in business and how you can use it to your advantage" (Video on Chaos Theory).</w:t>
+              <w:t>He pitches it as "chaos theory in business and how you can use it to your advantage" (Video on Chaos Theory).</w:t>
             </w:r>
           </w:p>
           <w:p/>
@@ -1189,31 +1032,16 @@
                 <w:sz w:val="18"/>
                 <w:lang w:val="en-CA"/>
               </w:rPr>
-              <w:t>The creator explains chaos theory as basically the butterfly effect: one small action can lead to huge consequences later. His example is extreme on purpose. He goes back inside for a drink of water before leaving, so he leaves 20 seconds later, and that small delay could be the difference between getting hit by a car or not (Video on Chaos Theory).</w:t>
-            </w:r>
-          </w:p>
-          <w:p>
-            <w:r>
-              <w:rPr>
-                <w:sz w:val="18"/>
-                <w:lang w:val="en-CA"/>
-              </w:rPr>
-              <w:t xml:space="preserve">He then gives </w:t>
-            </w:r>
-            <w:r>
-              <w:rPr>
-                <w:b/>
-                <w:sz w:val="18"/>
-                <w:lang w:val="en-CA"/>
-              </w:rPr>
-              <w:t>two tips</w:t>
-            </w:r>
-            <w:r>
-              <w:rPr>
-                <w:sz w:val="18"/>
-                <w:lang w:val="en-CA"/>
-              </w:rPr>
-              <w:t xml:space="preserve"> for business (Video on Chaos Theory):</w:t>
+              <w:t>He says chaos theory is basically the butterfly effect. One small action can cause huge consequences later. His example is extreme on purpose: he goes back inside to grab water before leaving, and that 20 second delay could be the difference between getting hit by a car or not (Video on Chaos Theory).</w:t>
+            </w:r>
+          </w:p>
+          <w:p>
+            <w:r>
+              <w:rPr>
+                <w:sz w:val="18"/>
+                <w:lang w:val="en-CA"/>
+              </w:rPr>
+              <w:t>Then he gives two tips for business (Video on Chaos Theory):</w:t>
             </w:r>
           </w:p>
           <w:p>
@@ -1226,18 +1054,10 @@
             </w:pPr>
             <w:r>
               <w:rPr>
-                <w:b/>
-                <w:sz w:val="18"/>
-                <w:lang w:val="en-CA"/>
-              </w:rPr>
-              <w:t>Tip 1:</w:t>
-            </w:r>
-            <w:r>
-              <w:rPr>
-                <w:sz w:val="18"/>
-                <w:lang w:val="en-CA"/>
-              </w:rPr>
-              <w:t xml:space="preserve"> Fill your day with as many small positive actions as possible. You cannot control every outcome, but positive actions compound over 6, 12, and 24 months, and "luck comes to those who are prepared for it" (Video on Chaos Theory).</w:t>
+                <w:sz w:val="18"/>
+                <w:lang w:val="en-CA"/>
+              </w:rPr>
+              <w:t>Tip 1: Fill your day with small positive actions. You can't control outcomes, but the actions stack up over 6, 12, 24 months, and "luck comes to those who are prepared for it" (Video on Chaos Theory).</w:t>
             </w:r>
           </w:p>
           <w:p>
@@ -1250,27 +1070,19 @@
             </w:pPr>
             <w:r>
               <w:rPr>
-                <w:b/>
-                <w:sz w:val="18"/>
-                <w:lang w:val="en-CA"/>
-              </w:rPr>
-              <w:t>Tip 2:</w:t>
-            </w:r>
-            <w:r>
-              <w:rPr>
-                <w:sz w:val="18"/>
-                <w:lang w:val="en-CA"/>
-              </w:rPr>
-              <w:t xml:space="preserve"> Business is not always black and white. He still sets goals and breaks them into daily tasks, but some of his best results came from things with no reward at first, like recording free videos for other people's training programs. Those videos later brought him mentorship students and customers (Video on Chaos Theory).</w:t>
-            </w:r>
-          </w:p>
-          <w:p>
-            <w:r>
-              <w:rPr>
-                <w:sz w:val="18"/>
-                <w:lang w:val="en-CA"/>
-              </w:rPr>
-              <w:t>He ends with examples of split-second decisions: sending one DM that turned into his agency business partner, and saying yes to calls and relationships with no short-term payoff. His final message is to put yourself out there and say yes more often when your gut tells you to (Video on Chaos Theory).</w:t>
+                <w:sz w:val="18"/>
+                <w:lang w:val="en-CA"/>
+              </w:rPr>
+              <w:t>Tip 2: Business isn't always black and white. He still sets goals and breaks them into daily tasks. A lot of his wins came from stuff that paid nothing at first, like free videos for other people's courses. Those videos later brought him mentorship students and customers (Video on Chaos Theory).</w:t>
+            </w:r>
+          </w:p>
+          <w:p>
+            <w:r>
+              <w:rPr>
+                <w:sz w:val="18"/>
+                <w:lang w:val="en-CA"/>
+              </w:rPr>
+              <w:t>He closes with split-second decisions. One DM turned into his agency business partner. His advice is to put yourself out there and say yes more often when your gut says yes (Video on Chaos Theory).</w:t>
             </w:r>
           </w:p>
           <w:p/>
@@ -1281,44 +1093,14 @@
                 <w:sz w:val="18"/>
                 <w:lang w:val="en-CA"/>
               </w:rPr>
-              <w:t>My critical take:</w:t>
-            </w:r>
-            <w:r>
-              <w:rPr>
-                <w:sz w:val="18"/>
-                <w:lang w:val="en-CA"/>
-              </w:rPr>
-              <w:t xml:space="preserve"> The video is useful for the mindset side (small actions matter, relationships pay off later), but it is a </w:t>
-            </w:r>
-            <w:r>
-              <w:rPr>
-                <w:b/>
-                <w:sz w:val="18"/>
-                <w:lang w:val="en-CA"/>
-              </w:rPr>
-              <w:t>simplified, self-help version</w:t>
-            </w:r>
-            <w:r>
-              <w:rPr>
-                <w:sz w:val="18"/>
-                <w:lang w:val="en-CA"/>
-              </w:rPr>
-              <w:t xml:space="preserve"> of chaos theory. Real chaos theory comes from math and weather science (Lorenz). It does not say actions are "positive or negative," and it does not promise luck. The creator also promotes his own social media marketing course in the middle (Video on Chaos Theory), so I need to watch for </w:t>
-            </w:r>
-            <w:r>
-              <w:rPr>
-                <w:b/>
-                <w:sz w:val="18"/>
-                <w:lang w:val="en-CA"/>
-              </w:rPr>
-              <w:t>bias</w:t>
-            </w:r>
-            <w:r>
-              <w:rPr>
-                <w:sz w:val="18"/>
-                <w:lang w:val="en-CA"/>
-              </w:rPr>
-              <w:t>.</w:t>
+              <w:t>My take:</w:t>
+            </w:r>
+            <w:r>
+              <w:rPr>
+                <w:sz w:val="18"/>
+                <w:lang w:val="en-CA"/>
+              </w:rPr>
+              <w:t xml:space="preserve"> Good mindset video, weak on the actual theory. Real chaos theory comes from math and weather (Lorenz). It never says actions are "positive or negative," and it doesn't promise luck. He also sells his social media marketing course halfway through (Video on Chaos Theory), so I'm watching for bias.</w:t>
             </w:r>
           </w:p>
         </w:tc>
@@ -1751,16 +1533,16 @@
                 <w:sz w:val="18"/>
                 <w:lang w:val="en-CA"/>
               </w:rPr>
-              <w:t>1. Small changes, big results (the butterfly effect)</w:t>
-            </w:r>
-          </w:p>
-          <w:p>
-            <w:r>
-              <w:rPr>
-                <w:sz w:val="18"/>
-                <w:lang w:val="en-CA"/>
-              </w:rPr>
-              <w:t>Lorenz found that rounding one number from 0.506127 to 0.506 changed his entire weather forecast (Dizikes). The video brings this down to everyday life: one small decision "has completely changed the outcome for the rest of my day" (Video on Chaos Theory).</w:t>
+              <w:t>1. Small changes, big results</w:t>
+            </w:r>
+          </w:p>
+          <w:p>
+            <w:r>
+              <w:rPr>
+                <w:sz w:val="18"/>
+                <w:lang w:val="en-CA"/>
+              </w:rPr>
+              <w:t>Lorenz rounded one number and lost his whole forecast (Dizikes). The video makes it personal: one small decision "has completely changed the outcome for the rest of my day" (Video on Chaos Theory).</w:t>
             </w:r>
           </w:p>
           <w:p>
@@ -1773,18 +1555,10 @@
             </w:pPr>
             <w:r>
               <w:rPr>
-                <w:b/>
-                <w:sz w:val="18"/>
-                <w:lang w:val="en-CA"/>
-              </w:rPr>
-              <w:t>CONNECTS to</w:t>
-            </w:r>
-            <w:r>
-              <w:rPr>
-                <w:sz w:val="18"/>
-                <w:lang w:val="en-CA"/>
-              </w:rPr>
-              <w:t xml:space="preserve"> customer service at Bulldog: one rude reply or one great fix can spread online and shape the whole brand.</w:t>
+                <w:sz w:val="18"/>
+                <w:lang w:val="en-CA"/>
+              </w:rPr>
+              <w:t>CONNECTS to customer service at Bulldog. One rude reply or one great fix can spread online and become the brand.</w:t>
             </w:r>
           </w:p>
           <w:p>
@@ -1797,18 +1571,10 @@
             </w:pPr>
             <w:r>
               <w:rPr>
-                <w:b/>
-                <w:sz w:val="18"/>
-                <w:lang w:val="en-CA"/>
-              </w:rPr>
-              <w:t>CONNECTS to</w:t>
-            </w:r>
-            <w:r>
-              <w:rPr>
-                <w:sz w:val="18"/>
-                <w:lang w:val="en-CA"/>
-              </w:rPr>
-              <w:t xml:space="preserve"> compound interest from business math: small steps repeated over time grow fast. The video says "it kind of all compounds" (Video on Chaos Theory).</w:t>
+                <w:sz w:val="18"/>
+                <w:lang w:val="en-CA"/>
+              </w:rPr>
+              <w:t>CONNECTS to compound interest. Small amounts repeated over time get big. "It kind of all compounds" (Video on Chaos Theory).</w:t>
             </w:r>
           </w:p>
           <w:p/>
@@ -1819,16 +1585,16 @@
                 <w:sz w:val="18"/>
                 <w:lang w:val="en-CA"/>
               </w:rPr>
-              <w:t>2. Long-term prediction has limits, so plans must be flexible</w:t>
-            </w:r>
-          </w:p>
-          <w:p>
-            <w:r>
-              <w:rPr>
-                <w:sz w:val="18"/>
-                <w:lang w:val="en-CA"/>
-              </w:rPr>
-              <w:t>Since tiny starting differences grow over time, perfect long-range forecasts are impossible (Dizikes; Lorenz). The creator agrees that goals are still useful: he will "reverse engineer" goals into daily tasks (Video on Chaos Theory), but warns "a lot of people kind of think business is just black and white" (Video on Chaos Theory).</w:t>
+              <w:t>2. You can't predict far out, so plan short</w:t>
+            </w:r>
+          </w:p>
+          <w:p>
+            <w:r>
+              <w:rPr>
+                <w:sz w:val="18"/>
+                <w:lang w:val="en-CA"/>
+              </w:rPr>
+              <w:t>Tiny starting differences grow, so long range forecasts break (Dizikes; Lorenz). The video guy still sets goals and will "reverse engineer" them into daily tasks (Video on Chaos Theory). He just warns that "a lot of people kind of think business is just black and white" (Video on Chaos Theory).</w:t>
             </w:r>
           </w:p>
           <w:p>
@@ -1841,18 +1607,10 @@
             </w:pPr>
             <w:r>
               <w:rPr>
-                <w:b/>
-                <w:sz w:val="18"/>
-                <w:lang w:val="en-CA"/>
-              </w:rPr>
-              <w:t>CONNECTS to</w:t>
-            </w:r>
-            <w:r>
-              <w:rPr>
-                <w:sz w:val="18"/>
-                <w:lang w:val="en-CA"/>
-              </w:rPr>
-              <w:t xml:space="preserve"> the historical management approaches the memo says Bulldog already analyzed: approaches like scientific management assume a predictable, machine-like workplace. Chaos theory says that assumption breaks down in fast-changing markets.</w:t>
+                <w:sz w:val="18"/>
+                <w:lang w:val="en-CA"/>
+              </w:rPr>
+              <w:t>CONNECTS to the older management approaches the memo says Bulldog already looked at. Scientific management treats the workplace like a predictable machine, and chaos theory says that breaks in fast markets.</w:t>
             </w:r>
           </w:p>
           <w:p>
@@ -1868,22 +1626,7 @@
                 <w:sz w:val="18"/>
                 <w:lang w:val="en-CA"/>
               </w:rPr>
-              <w:t xml:space="preserve">Stacey argues that strategies often </w:t>
-            </w:r>
-            <w:r>
-              <w:rPr>
-                <w:b/>
-                <w:sz w:val="18"/>
-                <w:lang w:val="en-CA"/>
-              </w:rPr>
-              <w:t>emerge</w:t>
-            </w:r>
-            <w:r>
-              <w:rPr>
-                <w:sz w:val="18"/>
-                <w:lang w:val="en-CA"/>
-              </w:rPr>
-              <w:t xml:space="preserve"> from the organization instead of following a fixed plan (Stacey).</w:t>
+              <w:t>Stacey says strategy usually emerges from the company as it goes, instead of following a fixed plan (Stacey).</w:t>
             </w:r>
           </w:p>
           <w:p/>
@@ -1894,16 +1637,16 @@
                 <w:sz w:val="18"/>
                 <w:lang w:val="en-CA"/>
               </w:rPr>
-              <w:t>3. Thriving on chaos instead of fighting it</w:t>
-            </w:r>
-          </w:p>
-          <w:p>
-            <w:r>
-              <w:rPr>
-                <w:sz w:val="18"/>
-                <w:lang w:val="en-CA"/>
-              </w:rPr>
-              <w:t>Peters says companies should accept that nothing stays the same and learn to thrive on chaos ("Thriving on Chaos"). His 45 prescriptions fall into five areas: customer responsiveness, constant innovation, partnering with everyone connected to the company, an inspiring vision built around change, and controls that measure what really matters ("Thriving on Chaos").</w:t>
+              <w:t>3. Use chaos instead of fighting it</w:t>
+            </w:r>
+          </w:p>
+          <w:p>
+            <w:r>
+              <w:rPr>
+                <w:sz w:val="18"/>
+                <w:lang w:val="en-CA"/>
+              </w:rPr>
+              <w:t>Peters says companies have to accept that nothing stays the same and learn to thrive on chaos ("Thriving on Chaos"). He gives 45 prescriptions in five areas: customers, constant innovation, partnering with everyone tied to the company, a vision built around change, and measuring what actually matters ("Thriving on Chaos").</w:t>
             </w:r>
           </w:p>
           <w:p>
@@ -1919,52 +1662,7 @@
                 <w:sz w:val="18"/>
                 <w:lang w:val="en-CA"/>
               </w:rPr>
-              <w:t xml:space="preserve">He also pushes for </w:t>
-            </w:r>
-            <w:r>
-              <w:rPr>
-                <w:b/>
-                <w:sz w:val="18"/>
-                <w:lang w:val="en-CA"/>
-              </w:rPr>
-              <w:t>fewer bureaucratic rules</w:t>
-            </w:r>
-            <w:r>
-              <w:rPr>
-                <w:sz w:val="18"/>
-                <w:lang w:val="en-CA"/>
-              </w:rPr>
-              <w:t xml:space="preserve">, </w:t>
-            </w:r>
-            <w:r>
-              <w:rPr>
-                <w:b/>
-                <w:sz w:val="18"/>
-                <w:lang w:val="en-CA"/>
-              </w:rPr>
-              <w:t>support for fast failures</w:t>
-            </w:r>
-            <w:r>
-              <w:rPr>
-                <w:sz w:val="18"/>
-                <w:lang w:val="en-CA"/>
-              </w:rPr>
-              <w:t xml:space="preserve">, obsessive listening, and </w:t>
-            </w:r>
-            <w:r>
-              <w:rPr>
-                <w:b/>
-                <w:sz w:val="18"/>
-                <w:lang w:val="en-CA"/>
-              </w:rPr>
-              <w:t>decentralized</w:t>
-            </w:r>
-            <w:r>
-              <w:rPr>
-                <w:sz w:val="18"/>
-                <w:lang w:val="en-CA"/>
-              </w:rPr>
-              <w:t xml:space="preserve"> decision making ("Thriving on Chaos").</w:t>
+              <w:t>He wants fewer bureaucratic rules, support for fast failures, obsessive listening, and decisions pushed down the ladder ("Thriving on Chaos").</w:t>
             </w:r>
           </w:p>
           <w:p>
@@ -1977,18 +1675,10 @@
             </w:pPr>
             <w:r>
               <w:rPr>
-                <w:b/>
-                <w:sz w:val="18"/>
-                <w:lang w:val="en-CA"/>
-              </w:rPr>
-              <w:t>CONNECTS to</w:t>
-            </w:r>
-            <w:r>
-              <w:rPr>
-                <w:sz w:val="18"/>
-                <w:lang w:val="en-CA"/>
-              </w:rPr>
-              <w:t xml:space="preserve"> the video's tip to say yes to things with no instant reward (Video on Chaos Theory). Both say: try lots of small things, because you cannot know ahead of time which one will pay off.</w:t>
+                <w:sz w:val="18"/>
+                <w:lang w:val="en-CA"/>
+              </w:rPr>
+              <w:t>CONNECTS to the video's tip to say yes to things with no instant payoff (Video on Chaos Theory). You can't know which bet wins, so place lots of small ones.</w:t>
             </w:r>
           </w:p>
           <w:p/>
@@ -1999,46 +1689,16 @@
                 <w:sz w:val="18"/>
                 <w:lang w:val="en-CA"/>
               </w:rPr>
-              <w:t>4. Order shows up on its own (self-organization)</w:t>
-            </w:r>
-          </w:p>
-          <w:p>
-            <w:r>
-              <w:rPr>
-                <w:sz w:val="18"/>
-                <w:lang w:val="en-CA"/>
-              </w:rPr>
-              <w:t xml:space="preserve">Wheatley describes organizations as </w:t>
-            </w:r>
-            <w:r>
-              <w:rPr>
-                <w:b/>
-                <w:sz w:val="18"/>
-                <w:lang w:val="en-CA"/>
-              </w:rPr>
-              <w:t>living systems</w:t>
-            </w:r>
-            <w:r>
-              <w:rPr>
-                <w:sz w:val="18"/>
-                <w:lang w:val="en-CA"/>
-              </w:rPr>
-              <w:t xml:space="preserve">, and argues that life naturally moves toward order, even if it gets messy along the way (Wheatley). Leaders do not need to control every detail. They need to make the </w:t>
-            </w:r>
-            <w:r>
-              <w:rPr>
-                <w:b/>
-                <w:sz w:val="18"/>
-                <w:lang w:val="en-CA"/>
-              </w:rPr>
-              <w:t>values and purpose clear</w:t>
-            </w:r>
-            <w:r>
-              <w:rPr>
-                <w:sz w:val="18"/>
-                <w:lang w:val="en-CA"/>
-              </w:rPr>
-              <w:t xml:space="preserve"> so people can organize themselves around them (Wheatley).</w:t>
+              <w:t>4. Order shows up on its own</w:t>
+            </w:r>
+          </w:p>
+          <w:p>
+            <w:r>
+              <w:rPr>
+                <w:sz w:val="18"/>
+                <w:lang w:val="en-CA"/>
+              </w:rPr>
+              <w:t>Wheatley sees companies as living systems that move toward order even when it gets messy along the way (Wheatley). Leaders don't need to control every detail. They need to make the values and purpose clear so people can organize around them (Wheatley).</w:t>
             </w:r>
           </w:p>
           <w:p>
@@ -2051,18 +1711,10 @@
             </w:pPr>
             <w:r>
               <w:rPr>
-                <w:b/>
-                <w:sz w:val="18"/>
-                <w:lang w:val="en-CA"/>
-              </w:rPr>
-              <w:t>CONNECTS to</w:t>
-            </w:r>
-            <w:r>
-              <w:rPr>
-                <w:sz w:val="18"/>
-                <w:lang w:val="en-CA"/>
-              </w:rPr>
-              <w:t xml:space="preserve"> the video's relationship tip: "build relationships with people when there is no financial gain in the short term" (Video on Chaos Theory). Networks of relationships are how self-organization actually happens.</w:t>
+                <w:sz w:val="18"/>
+                <w:lang w:val="en-CA"/>
+              </w:rPr>
+              <w:t>CONNECTS to the video's relationship tip: "build relationships with people when there is no financial gain in the short term" (Video on Chaos Theory). Relationships are how self-organization actually happens.</w:t>
             </w:r>
           </w:p>
           <w:p>
@@ -2075,18 +1727,10 @@
             </w:pPr>
             <w:r>
               <w:rPr>
-                <w:b/>
-                <w:sz w:val="18"/>
-                <w:lang w:val="en-CA"/>
-              </w:rPr>
-              <w:t>CONNECTS to</w:t>
-            </w:r>
-            <w:r>
-              <w:rPr>
-                <w:sz w:val="18"/>
-                <w:lang w:val="en-CA"/>
-              </w:rPr>
-              <w:t xml:space="preserve"> Learning Organizations (another group's theory): both say a company has to keep adapting instead of following one fixed plan.</w:t>
+                <w:sz w:val="18"/>
+                <w:lang w:val="en-CA"/>
+              </w:rPr>
+              <w:t>CONNECTS to Learning Organizations, another group's theory. Both say a company has to keep adapting.</w:t>
             </w:r>
           </w:p>
           <w:p/>
@@ -2113,37 +1757,7 @@
                 <w:sz w:val="18"/>
                 <w:lang w:val="en-CA"/>
               </w:rPr>
-              <w:t xml:space="preserve">The video turns chaos theory into a </w:t>
-            </w:r>
-            <w:r>
-              <w:rPr>
-                <w:b/>
-                <w:sz w:val="18"/>
-                <w:lang w:val="en-CA"/>
-              </w:rPr>
-              <w:t>luck and mindset</w:t>
-            </w:r>
-            <w:r>
-              <w:rPr>
-                <w:sz w:val="18"/>
-                <w:lang w:val="en-CA"/>
-              </w:rPr>
-              <w:t xml:space="preserve"> message. The research is about the </w:t>
-            </w:r>
-            <w:r>
-              <w:rPr>
-                <w:b/>
-                <w:sz w:val="18"/>
-                <w:lang w:val="en-CA"/>
-              </w:rPr>
-              <w:t>limits of prediction</w:t>
-            </w:r>
-            <w:r>
-              <w:rPr>
-                <w:sz w:val="18"/>
-                <w:lang w:val="en-CA"/>
-              </w:rPr>
-              <w:t>, so it is more about planning and leadership than about personal luck (Gleick; Lorenz).</w:t>
+              <w:t>The video sells chaos theory as luck and mindset. The research is about the limits of prediction, which makes it a planning and leadership lesson (Gleick; Lorenz).</w:t>
             </w:r>
           </w:p>
           <w:p>
@@ -2159,22 +1773,7 @@
                 <w:sz w:val="18"/>
                 <w:lang w:val="en-CA"/>
               </w:rPr>
-              <w:t xml:space="preserve">The video uses outlier success stories (a viral "cash me outside" clip, Video on Chaos Theory). That is </w:t>
-            </w:r>
-            <w:r>
-              <w:rPr>
-                <w:b/>
-                <w:sz w:val="18"/>
-                <w:lang w:val="en-CA"/>
-              </w:rPr>
-              <w:t>survivorship bias</w:t>
-            </w:r>
-            <w:r>
-              <w:rPr>
-                <w:sz w:val="18"/>
-                <w:lang w:val="en-CA"/>
-              </w:rPr>
-              <w:t>: we hear about the one that blew up, not the thousands that did not.</w:t>
+              <w:t>The video leans on outliers, like the viral "cash me outside" clip (Video on Chaos Theory). That's survivorship bias. You hear about the one that blew up and never about the thousands that didn't.</w:t>
             </w:r>
           </w:p>
           <w:p>
@@ -2190,37 +1789,7 @@
                 <w:sz w:val="18"/>
                 <w:lang w:val="en-CA"/>
               </w:rPr>
-              <w:t xml:space="preserve">Insight: chaos theory works </w:t>
-            </w:r>
-            <w:r>
-              <w:rPr>
-                <w:b/>
-                <w:sz w:val="18"/>
-                <w:lang w:val="en-CA"/>
-              </w:rPr>
-              <w:t>both ways</w:t>
-            </w:r>
-            <w:r>
-              <w:rPr>
-                <w:sz w:val="18"/>
-                <w:lang w:val="en-CA"/>
-              </w:rPr>
-              <w:t xml:space="preserve">. Small actions can cause big wins, but also big problems. So Bulldog needs good small habits </w:t>
-            </w:r>
-            <w:r>
-              <w:rPr>
-                <w:b/>
-                <w:sz w:val="18"/>
-                <w:lang w:val="en-CA"/>
-              </w:rPr>
-              <w:t>and</w:t>
-            </w:r>
-            <w:r>
-              <w:rPr>
-                <w:sz w:val="18"/>
-                <w:lang w:val="en-CA"/>
-              </w:rPr>
-              <w:t xml:space="preserve"> a way to react fast when things go wrong.</w:t>
+              <w:t>It cuts both ways. Small actions cause big wins and big disasters, so Bulldog needs good small habits plus a way to react fast when something breaks.</w:t>
             </w:r>
           </w:p>
         </w:tc>
@@ -2312,22 +1881,7 @@
                 <w:sz w:val="18"/>
                 <w:lang w:val="en-CA"/>
               </w:rPr>
-              <w:t xml:space="preserve"> Since small actions can add up to big outcomes, people should judge themselves on their </w:t>
-            </w:r>
-            <w:r>
-              <w:rPr>
-                <w:b/>
-                <w:sz w:val="18"/>
-                <w:lang w:val="en-CA"/>
-              </w:rPr>
-              <w:t>daily habits and choices</w:t>
-            </w:r>
-            <w:r>
-              <w:rPr>
-                <w:sz w:val="18"/>
-                <w:lang w:val="en-CA"/>
-              </w:rPr>
-              <w:t>, not just on results they cannot fully control. The video's advice to fill your day with small positive actions fits here (Video on Chaos Theory).</w:t>
+              <w:t xml:space="preserve"> You can't control results, so judge yourself on daily habits. Small positive actions add up (Video on Chaos Theory).</w:t>
             </w:r>
           </w:p>
           <w:p/>
@@ -2345,22 +1899,7 @@
                 <w:sz w:val="18"/>
                 <w:lang w:val="en-CA"/>
               </w:rPr>
-              <w:t xml:space="preserve"> Small actions in a community can spread quickly, for good or bad. One post, one volunteer, or one complaint can snowball. Citizens should know that their small actions matter, and also be careful, because </w:t>
-            </w:r>
-            <w:r>
-              <w:rPr>
-                <w:b/>
-                <w:sz w:val="18"/>
-                <w:lang w:val="en-CA"/>
-              </w:rPr>
-              <w:t>misinformation spreads by the same butterfly effect</w:t>
-            </w:r>
-            <w:r>
-              <w:rPr>
-                <w:sz w:val="18"/>
-                <w:lang w:val="en-CA"/>
-              </w:rPr>
-              <w:t>.</w:t>
+              <w:t xml:space="preserve"> Small things spread fast in a community, good or bad. One post can snowball. Misinformation spreads through the same butterfly effect, so people should think before they share.</w:t>
             </w:r>
           </w:p>
           <w:p/>
@@ -2378,22 +1917,7 @@
                 <w:sz w:val="18"/>
                 <w:lang w:val="en-CA"/>
               </w:rPr>
-              <w:t xml:space="preserve"> Governments cannot perfectly predict the long-term effects of a new policy, just like Lorenz could not predict the weather far ahead (Dizikes). Policies should include </w:t>
-            </w:r>
-            <w:r>
-              <w:rPr>
-                <w:b/>
-                <w:sz w:val="18"/>
-                <w:lang w:val="en-CA"/>
-              </w:rPr>
-              <w:t>short review periods, pilot programs, and backup plans</w:t>
-            </w:r>
-            <w:r>
-              <w:rPr>
-                <w:sz w:val="18"/>
-                <w:lang w:val="en-CA"/>
-              </w:rPr>
-              <w:t xml:space="preserve"> instead of rigid 10-year plans that are never checked.</w:t>
+              <w:t xml:space="preserve"> Governments can't predict a policy's long term effects any better than Lorenz could predict the weather (Dizikes). Build in short review periods and pilot programs, and keep a backup plan. A 10 year plan nobody checks is a bad bet.</w:t>
             </w:r>
           </w:p>
           <w:p/>
@@ -2411,37 +1935,7 @@
                 <w:sz w:val="18"/>
                 <w:lang w:val="en-CA"/>
               </w:rPr>
-              <w:t xml:space="preserve"> Laws are written for the situations lawmakers can imagine, but new technology and markets change faster than that. Lawmakers could add </w:t>
-            </w:r>
-            <w:r>
-              <w:rPr>
-                <w:b/>
-                <w:sz w:val="18"/>
-                <w:lang w:val="en-CA"/>
-              </w:rPr>
-              <w:t>sunset clauses</w:t>
-            </w:r>
-            <w:r>
-              <w:rPr>
-                <w:sz w:val="18"/>
-                <w:lang w:val="en-CA"/>
-              </w:rPr>
-              <w:t xml:space="preserve"> (laws that expire unless reviewed) and </w:t>
-            </w:r>
-            <w:r>
-              <w:rPr>
-                <w:b/>
-                <w:sz w:val="18"/>
-                <w:lang w:val="en-CA"/>
-              </w:rPr>
-              <w:t>regular review dates</w:t>
-            </w:r>
-            <w:r>
-              <w:rPr>
-                <w:sz w:val="18"/>
-                <w:lang w:val="en-CA"/>
-              </w:rPr>
-              <w:t xml:space="preserve"> so the rules keep up. This matches Peters' point that rapid change is now the normal condition ("Thriving on Chaos").</w:t>
+              <w:t xml:space="preserve"> Laws get written for situations lawmakers can picture, and tech and markets move faster than that. Add sunset clauses (laws that expire unless someone reviews them) and set review dates. Peters' whole point is that fast change is normal now ("Thriving on Chaos").</w:t>
             </w:r>
           </w:p>
         </w:tc>
@@ -2608,22 +2102,7 @@
                 <w:sz w:val="18"/>
                 <w:lang w:val="en-CA"/>
               </w:rPr>
-              <w:t xml:space="preserve"> Each employee picks </w:t>
-            </w:r>
-            <w:r>
-              <w:rPr>
-                <w:b/>
-                <w:sz w:val="18"/>
-                <w:lang w:val="en-CA"/>
-              </w:rPr>
-              <w:t>one small positive action a day</w:t>
-            </w:r>
-            <w:r>
-              <w:rPr>
-                <w:sz w:val="18"/>
-                <w:lang w:val="en-CA"/>
-              </w:rPr>
-              <w:t>: a follow-up call, a thank-you note, helping a co-worker. Managers set goals but break them into daily tasks, like the video suggests (Video on Chaos Theory). Staff should also be encouraged to build relationships inside and outside the company with no immediate payoff (Video on Chaos Theory).</w:t>
+              <w:t xml:space="preserve"> Every employee does one small positive thing a day, like a follow up call or helping a coworker. Managers set goals and break them into daily tasks (Video on Chaos Theory). Staff build relationships inside and outside the company even when there's no immediate payoff (Video on Chaos Theory).</w:t>
             </w:r>
           </w:p>
           <w:p/>
@@ -2634,44 +2113,14 @@
                 <w:sz w:val="18"/>
                 <w:lang w:val="en-CA"/>
               </w:rPr>
-              <w:t>Institutional (Bulldog as an organization):</w:t>
-            </w:r>
-            <w:r>
-              <w:rPr>
-                <w:sz w:val="18"/>
-                <w:lang w:val="en-CA"/>
-              </w:rPr>
-              <w:t xml:space="preserve"> Replace one fixed 5-year plan with </w:t>
-            </w:r>
-            <w:r>
-              <w:rPr>
-                <w:b/>
-                <w:sz w:val="18"/>
-                <w:lang w:val="en-CA"/>
-              </w:rPr>
-              <w:t>short planning cycles</w:t>
-            </w:r>
-            <w:r>
-              <w:rPr>
-                <w:sz w:val="18"/>
-                <w:lang w:val="en-CA"/>
-              </w:rPr>
-              <w:t xml:space="preserve"> (for example every 90 days) plus a few "what if" scenarios. Run </w:t>
-            </w:r>
-            <w:r>
-              <w:rPr>
-                <w:b/>
-                <w:sz w:val="18"/>
-                <w:lang w:val="en-CA"/>
-              </w:rPr>
-              <w:t>small pilot experiments</w:t>
-            </w:r>
-            <w:r>
-              <w:rPr>
-                <w:sz w:val="18"/>
-                <w:lang w:val="en-CA"/>
-              </w:rPr>
-              <w:t xml:space="preserve"> before big rollouts, and treat a failed pilot as learning, which matches Peters' call to support fast failures ("Thriving on Chaos"). Give front-line teams more authority so they can react quickly (Wheatley; Stacey).</w:t>
+              <w:t>Institutional (Bulldog as a company):</w:t>
+            </w:r>
+            <w:r>
+              <w:rPr>
+                <w:sz w:val="18"/>
+                <w:lang w:val="en-CA"/>
+              </w:rPr>
+              <w:t xml:space="preserve"> Drop the fixed 5 year plan. Plan in 90 day cycles and keep a couple of "what if" scenarios ready. Pilot new ideas small before rolling them out. A failed pilot is cheap learning, which is what Peters means by supporting fast failures ("Thriving on Chaos"). Give front line teams the authority to act fast (Wheatley; Stacey).</w:t>
             </w:r>
           </w:p>
           <w:p/>
@@ -2682,29 +2131,14 @@
                 <w:sz w:val="18"/>
                 <w:lang w:val="en-CA"/>
               </w:rPr>
-              <w:t>Societal (Bulldog and its customers and community):</w:t>
-            </w:r>
-            <w:r>
-              <w:rPr>
-                <w:sz w:val="18"/>
-                <w:lang w:val="en-CA"/>
-              </w:rPr>
-              <w:t xml:space="preserve"> One customer experience can go viral and shape Bulldog's reputation. Bulldog should train and </w:t>
-            </w:r>
-            <w:r>
-              <w:rPr>
-                <w:b/>
-                <w:sz w:val="18"/>
-                <w:lang w:val="en-CA"/>
-              </w:rPr>
-              <w:t>empower front-line staff to fix problems on the spot</w:t>
-            </w:r>
-            <w:r>
-              <w:rPr>
-                <w:sz w:val="18"/>
-                <w:lang w:val="en-CA"/>
-              </w:rPr>
-              <w:t>, listen closely to customers (Peters' idea of obsessive listening), and build long-term community relationships ("Thriving on Chaos").</w:t>
+              <w:t>Societal (customers and community):</w:t>
+            </w:r>
+            <w:r>
+              <w:rPr>
+                <w:sz w:val="18"/>
+                <w:lang w:val="en-CA"/>
+              </w:rPr>
+              <w:t xml:space="preserve"> One customer experience can go viral and define Bulldog. Train front line staff and let them fix problems on the spot. Listen hard to customers the way Peters says to ("Thriving on Chaos"), and build long term relationships in the community.</w:t>
             </w:r>
           </w:p>
           <w:p/>
@@ -2715,44 +2149,14 @@
                 <w:sz w:val="18"/>
                 <w:lang w:val="en-CA"/>
               </w:rPr>
-              <w:t>Political (Bulldog and government/regulation):</w:t>
-            </w:r>
-            <w:r>
-              <w:rPr>
-                <w:sz w:val="18"/>
-                <w:lang w:val="en-CA"/>
-              </w:rPr>
-              <w:t xml:space="preserve"> Laws, taxes, and trade rules can change suddenly. Bulldog should </w:t>
-            </w:r>
-            <w:r>
-              <w:rPr>
-                <w:b/>
-                <w:sz w:val="18"/>
-                <w:lang w:val="en-CA"/>
-              </w:rPr>
-              <w:t>monitor policy changes</w:t>
-            </w:r>
-            <w:r>
-              <w:rPr>
-                <w:sz w:val="18"/>
-                <w:lang w:val="en-CA"/>
-              </w:rPr>
-              <w:t xml:space="preserve">, avoid depending on one supplier or one market, and keep a small </w:t>
-            </w:r>
-            <w:r>
-              <w:rPr>
-                <w:b/>
-                <w:sz w:val="18"/>
-                <w:lang w:val="en-CA"/>
-              </w:rPr>
-              <w:t>response team</w:t>
-            </w:r>
-            <w:r>
-              <w:rPr>
-                <w:sz w:val="18"/>
-                <w:lang w:val="en-CA"/>
-              </w:rPr>
-              <w:t xml:space="preserve"> ready to adapt when the rules change. This keeps the company at the edge of chaos: stable enough to run well, flexible enough to adapt ("Edge of Chaos"; Stacey).</w:t>
+              <w:t>Political (government and regulation):</w:t>
+            </w:r>
+            <w:r>
+              <w:rPr>
+                <w:sz w:val="18"/>
+                <w:lang w:val="en-CA"/>
+              </w:rPr>
+              <w:t xml:space="preserve"> Laws, taxes, and trade rules can change without warning. Watch policy changes, don't depend on one supplier or one market, and keep a small response team ready. That keeps Bulldog at the edge of chaos: stable enough to run, loose enough to adapt ("Edge of Chaos"; Stacey).</w:t>
             </w:r>
           </w:p>
         </w:tc>
@@ -2821,22 +2225,7 @@
                 <w:sz w:val="18"/>
                 <w:lang w:val="en-CA"/>
               </w:rPr>
-              <w:t xml:space="preserve">1. Chaos theory started with Edward Lorenz studying the </w:t>
-            </w:r>
-            <w:r>
-              <w:rPr>
-                <w:b/>
-                <w:sz w:val="18"/>
-                <w:lang w:val="en-CA"/>
-              </w:rPr>
-              <w:t>weather</w:t>
-            </w:r>
-            <w:r>
-              <w:rPr>
-                <w:sz w:val="18"/>
-                <w:lang w:val="en-CA"/>
-              </w:rPr>
-              <w:t>. Why should a company like Bulldog care about a theory that came from meteorology?</w:t>
+              <w:t>1. Chaos theory came out of weather research. Why should a company like Bulldog care?</w:t>
             </w:r>
           </w:p>
           <w:p/>
@@ -2846,22 +2235,7 @@
                 <w:sz w:val="18"/>
                 <w:lang w:val="en-CA"/>
               </w:rPr>
-              <w:t xml:space="preserve">2. If chaos theory says we </w:t>
-            </w:r>
-            <w:r>
-              <w:rPr>
-                <w:b/>
-                <w:sz w:val="18"/>
-                <w:lang w:val="en-CA"/>
-              </w:rPr>
-              <w:t>cannot predict the long term</w:t>
-            </w:r>
-            <w:r>
-              <w:rPr>
-                <w:sz w:val="18"/>
-                <w:lang w:val="en-CA"/>
-              </w:rPr>
-              <w:t>, should Bulldog stop making five-year plans? What would you replace them with?</w:t>
+              <w:t>2. If we can't predict the long term, should Bulldog stop making five year plans? What replaces them?</w:t>
             </w:r>
           </w:p>
           <w:p/>
@@ -2871,22 +2245,7 @@
                 <w:sz w:val="18"/>
                 <w:lang w:val="en-CA"/>
               </w:rPr>
-              <w:t xml:space="preserve">3. My video says to fill your day with small positive actions. Is that really chaos theory, or just good habits? Can you give an example where the butterfly effect could </w:t>
-            </w:r>
-            <w:r>
-              <w:rPr>
-                <w:b/>
-                <w:sz w:val="18"/>
-                <w:lang w:val="en-CA"/>
-              </w:rPr>
-              <w:t>hurt</w:t>
-            </w:r>
-            <w:r>
-              <w:rPr>
-                <w:sz w:val="18"/>
-                <w:lang w:val="en-CA"/>
-              </w:rPr>
-              <w:t xml:space="preserve"> Bulldog?</w:t>
+              <w:t>3. My video says to stack small positive actions. Is that chaos theory or just good habits? And where could the butterfly effect hurt Bulldog?</w:t>
             </w:r>
           </w:p>
         </w:tc>
@@ -2956,26 +2315,25 @@
                 <w:sz w:val="18"/>
                 <w:lang w:val="en-CA"/>
               </w:rPr>
-              <w:t>Q1: What is chaos theory, in simple words?</w:t>
-            </w:r>
-          </w:p>
-          <w:p>
-            <w:r>
-              <w:rPr>
-                <w:b/>
-                <w:sz w:val="18"/>
-                <w:lang w:val="en-CA"/>
-              </w:rPr>
-              <w:t>Memory hook: "Rules, but no long-range forecast."</w:t>
-            </w:r>
-          </w:p>
-          <w:p>
-            <w:r>
-              <w:rPr>
-                <w:sz w:val="18"/>
-                <w:lang w:val="en-CA"/>
-              </w:rPr>
-              <w:t>Chaos theory says some systems follow clear rules but are still impossible to predict far ahead, because tiny changes at the start turn into huge differences later. Edward Lorenz found this in 1961 when rounding one number changed his whole weather forecast. That is the butterfly effect.</w:t>
+              <w:t>Q1: What is chaos theory in simple words?</w:t>
+            </w:r>
+          </w:p>
+          <w:p>
+            <w:r>
+              <w:rPr>
+                <w:sz w:val="18"/>
+                <w:lang w:val="en-CA"/>
+              </w:rPr>
+              <w:t>Memory hook: "Rules, but no long range forecast."</w:t>
+            </w:r>
+          </w:p>
+          <w:p>
+            <w:r>
+              <w:rPr>
+                <w:sz w:val="18"/>
+                <w:lang w:val="en-CA"/>
+              </w:rPr>
+              <w:t>Some systems follow clear rules and you still can't predict them far ahead, because tiny changes at the start blow up later. Lorenz found this in 1961 when rounding one number wrecked his weather forecast. That's the butterfly effect.</w:t>
             </w:r>
           </w:p>
           <w:p/>
@@ -2986,26 +2344,25 @@
                 <w:sz w:val="18"/>
                 <w:lang w:val="en-CA"/>
               </w:rPr>
-              <w:t>Q2: How could Bulldog actually use chaos theory?</w:t>
-            </w:r>
-          </w:p>
-          <w:p>
-            <w:r>
-              <w:rPr>
-                <w:b/>
-                <w:sz w:val="18"/>
-                <w:lang w:val="en-CA"/>
-              </w:rPr>
-              <w:t>Memory hook: "Short plans, small tests, trust the team."</w:t>
-            </w:r>
-          </w:p>
-          <w:p>
-            <w:r>
-              <w:rPr>
-                <w:sz w:val="18"/>
-                <w:lang w:val="en-CA"/>
-              </w:rPr>
-              <w:t>Bulldog should plan in short cycles instead of one rigid five-year plan, and test new ideas with small pilots first. It should also give front-line employees the power to make decisions, because they see changes first. Tom Peters calls this thriving on chaos instead of fighting it.</w:t>
+              <w:t>Q2: How would Bulldog actually use it?</w:t>
+            </w:r>
+          </w:p>
+          <w:p>
+            <w:r>
+              <w:rPr>
+                <w:sz w:val="18"/>
+                <w:lang w:val="en-CA"/>
+              </w:rPr>
+              <w:t>Memory hook: "Plan short, test small."</w:t>
+            </w:r>
+          </w:p>
+          <w:p>
+            <w:r>
+              <w:rPr>
+                <w:sz w:val="18"/>
+                <w:lang w:val="en-CA"/>
+              </w:rPr>
+              <w:t>Plan in 90 day cycles instead of one rigid five year plan, and test new ideas small before betting big. Let front line people make calls, since they see problems first. Tom Peters calls this thriving on chaos.</w:t>
             </w:r>
           </w:p>
           <w:p/>
@@ -3016,26 +2373,25 @@
                 <w:sz w:val="18"/>
                 <w:lang w:val="en-CA"/>
               </w:rPr>
-              <w:t>Q3: Does chaos mean there is no order at all?</w:t>
-            </w:r>
-          </w:p>
-          <w:p>
-            <w:r>
-              <w:rPr>
-                <w:b/>
-                <w:sz w:val="18"/>
-                <w:lang w:val="en-CA"/>
-              </w:rPr>
-              <w:t>Memory hook: "Chaos is not random."</w:t>
-            </w:r>
-          </w:p>
-          <w:p>
-            <w:r>
-              <w:rPr>
-                <w:sz w:val="18"/>
-                <w:lang w:val="en-CA"/>
-              </w:rPr>
-              <w:t>No. Chaotic systems still follow rules, we just cannot predict them far into the future. Margaret Wheatley says order actually appears on its own when people share clear values, which is called self-organization.</w:t>
+              <w:t>Q3: Does chaos mean there's no order?</w:t>
+            </w:r>
+          </w:p>
+          <w:p>
+            <w:r>
+              <w:rPr>
+                <w:sz w:val="18"/>
+                <w:lang w:val="en-CA"/>
+              </w:rPr>
+              <w:t>Memory hook: "Chaos isn't random."</w:t>
+            </w:r>
+          </w:p>
+          <w:p>
+            <w:r>
+              <w:rPr>
+                <w:sz w:val="18"/>
+                <w:lang w:val="en-CA"/>
+              </w:rPr>
+              <w:t>No. Chaotic systems still follow rules, you just can't call them far out. Margaret Wheatley says order shows up on its own when people share clear values, and that's self-organization.</w:t>
             </w:r>
           </w:p>
         </w:tc>
@@ -3130,7 +2486,7 @@
                 <w:sz w:val="18"/>
                 <w:lang w:val="en-CA"/>
               </w:rPr>
-              <w:t>Facts to back up my answers (all cited):</w:t>
+              <w:t>Facts I can use (all cited):</w:t>
             </w:r>
           </w:p>
           <w:p>
@@ -3143,18 +2499,10 @@
             </w:pPr>
             <w:r>
               <w:rPr>
-                <w:b/>
-                <w:sz w:val="18"/>
-                <w:lang w:val="en-CA"/>
-              </w:rPr>
-              <w:t>Lorenz, 1961:</w:t>
-            </w:r>
-            <w:r>
-              <w:rPr>
-                <w:sz w:val="18"/>
-                <w:lang w:val="en-CA"/>
-              </w:rPr>
-              <w:t xml:space="preserve"> typed 0.506 instead of 0.506127 into his weather model and the forecast changed completely (Dizikes).</w:t>
+                <w:sz w:val="18"/>
+                <w:lang w:val="en-CA"/>
+              </w:rPr>
+              <w:t>Lorenz, 1961: typed 0.506 instead of 0.506127 and the forecast changed completely (Dizikes).</w:t>
             </w:r>
           </w:p>
           <w:p>
@@ -3167,18 +2515,10 @@
             </w:pPr>
             <w:r>
               <w:rPr>
-                <w:b/>
-                <w:sz w:val="18"/>
-                <w:lang w:val="en-CA"/>
-              </w:rPr>
-              <w:t>Lorenz, 1963:</w:t>
-            </w:r>
-            <w:r>
-              <w:rPr>
-                <w:sz w:val="18"/>
-                <w:lang w:val="en-CA"/>
-              </w:rPr>
-              <w:t xml:space="preserve"> published "Deterministic Nonperiodic Flow" in the </w:t>
+                <w:sz w:val="18"/>
+                <w:lang w:val="en-CA"/>
+              </w:rPr>
+              <w:t xml:space="preserve">Lorenz, 1963: published "Deterministic Nonperiodic Flow" in the </w:t>
             </w:r>
             <w:r>
               <w:rPr>
@@ -3193,7 +2533,7 @@
                 <w:sz w:val="18"/>
                 <w:lang w:val="en-CA"/>
               </w:rPr>
-              <w:t>, seen as the founding paper of chaos theory (Lorenz).</w:t>
+              <w:t>, widely seen as where chaos theory starts (Lorenz).</w:t>
             </w:r>
           </w:p>
           <w:p>
@@ -3206,18 +2546,10 @@
             </w:pPr>
             <w:r>
               <w:rPr>
-                <w:b/>
-                <w:sz w:val="18"/>
-                <w:lang w:val="en-CA"/>
-              </w:rPr>
-              <w:t>Lorenz, 1972:</w:t>
-            </w:r>
-            <w:r>
-              <w:rPr>
-                <w:sz w:val="18"/>
-                <w:lang w:val="en-CA"/>
-              </w:rPr>
-              <w:t xml:space="preserve"> talk about a butterfly in Brazil and a tornado in Texas gave us the term "butterfly effect" (Dizikes).</w:t>
+                <w:sz w:val="18"/>
+                <w:lang w:val="en-CA"/>
+              </w:rPr>
+              <w:t>Lorenz, 1972: the butterfly in Brazil, tornado in Texas talk that gave us "butterfly effect" (Dizikes).</w:t>
             </w:r>
           </w:p>
           <w:p>
@@ -3230,18 +2562,10 @@
             </w:pPr>
             <w:r>
               <w:rPr>
-                <w:b/>
-                <w:sz w:val="18"/>
-                <w:lang w:val="en-CA"/>
-              </w:rPr>
-              <w:t>Gleick, 1987:</w:t>
-            </w:r>
-            <w:r>
-              <w:rPr>
-                <w:sz w:val="18"/>
-                <w:lang w:val="en-CA"/>
-              </w:rPr>
-              <w:t xml:space="preserve"> </w:t>
+                <w:sz w:val="18"/>
+                <w:lang w:val="en-CA"/>
+              </w:rPr>
+              <w:t xml:space="preserve">Gleick, 1987: </w:t>
             </w:r>
             <w:r>
               <w:rPr>
@@ -3256,7 +2580,7 @@
                 <w:sz w:val="18"/>
                 <w:lang w:val="en-CA"/>
               </w:rPr>
-              <w:t xml:space="preserve"> (Viking) made chaos theory popular with regular readers (Gleick).</w:t>
+              <w:t xml:space="preserve"> (Viking) made it mainstream (Gleick).</w:t>
             </w:r>
           </w:p>
           <w:p>
@@ -3269,18 +2593,10 @@
             </w:pPr>
             <w:r>
               <w:rPr>
-                <w:b/>
-                <w:sz w:val="18"/>
-                <w:lang w:val="en-CA"/>
-              </w:rPr>
-              <w:t>Peters, 1987:</w:t>
-            </w:r>
-            <w:r>
-              <w:rPr>
-                <w:sz w:val="18"/>
-                <w:lang w:val="en-CA"/>
-              </w:rPr>
-              <w:t xml:space="preserve"> </w:t>
+                <w:sz w:val="18"/>
+                <w:lang w:val="en-CA"/>
+              </w:rPr>
+              <w:t xml:space="preserve">Peters, 1987: </w:t>
             </w:r>
             <w:r>
               <w:rPr>
@@ -3295,7 +2611,7 @@
                 <w:sz w:val="18"/>
                 <w:lang w:val="en-CA"/>
               </w:rPr>
-              <w:t xml:space="preserve"> has 45 prescriptions in five areas: customers, innovation, partnerships, vision built on change, and measuring what matters ("Thriving on Chaos").</w:t>
+              <w:t xml:space="preserve"> lays out 45 prescriptions in five areas ("Thriving on Chaos").</w:t>
             </w:r>
           </w:p>
           <w:p>
@@ -3308,18 +2624,10 @@
             </w:pPr>
             <w:r>
               <w:rPr>
-                <w:b/>
-                <w:sz w:val="18"/>
-                <w:lang w:val="en-CA"/>
-              </w:rPr>
-              <w:t>Wheatley, 1992:</w:t>
-            </w:r>
-            <w:r>
-              <w:rPr>
-                <w:sz w:val="18"/>
-                <w:lang w:val="en-CA"/>
-              </w:rPr>
-              <w:t xml:space="preserve"> organizations behave like living systems; leaders should make values clear and let people self-organize (Wheatley).</w:t>
+                <w:sz w:val="18"/>
+                <w:lang w:val="en-CA"/>
+              </w:rPr>
+              <w:t>Wheatley, 1992: companies are living systems, so set values and let people self-organize (Wheatley).</w:t>
             </w:r>
           </w:p>
           <w:p>
@@ -3332,18 +2640,10 @@
             </w:pPr>
             <w:r>
               <w:rPr>
-                <w:b/>
-                <w:sz w:val="18"/>
-                <w:lang w:val="en-CA"/>
-              </w:rPr>
-              <w:t>Stacey, 1992:</w:t>
-            </w:r>
-            <w:r>
-              <w:rPr>
-                <w:sz w:val="18"/>
-                <w:lang w:val="en-CA"/>
-              </w:rPr>
-              <w:t xml:space="preserve"> organizations are complex systems; strategy often emerges in unpredictable, self-organizing ways (Stacey).</w:t>
+                <w:sz w:val="18"/>
+                <w:lang w:val="en-CA"/>
+              </w:rPr>
+              <w:t>Stacey, 1992: strategy emerges in unpredictable, self-organizing ways (Stacey).</w:t>
             </w:r>
           </w:p>
           <w:p>
@@ -3356,18 +2656,10 @@
             </w:pPr>
             <w:r>
               <w:rPr>
-                <w:b/>
-                <w:sz w:val="18"/>
-                <w:lang w:val="en-CA"/>
-              </w:rPr>
-              <w:t>Packard, 1988:</w:t>
-            </w:r>
-            <w:r>
-              <w:rPr>
-                <w:sz w:val="18"/>
-                <w:lang w:val="en-CA"/>
-              </w:rPr>
-              <w:t xml:space="preserve"> coined "edge of chaos," the creative zone between order and total disorder ("Edge of Chaos").</w:t>
+                <w:sz w:val="18"/>
+                <w:lang w:val="en-CA"/>
+              </w:rPr>
+              <w:t>Packard, 1988: coined "edge of chaos" ("Edge of Chaos").</w:t>
             </w:r>
           </w:p>
           <w:p/>
@@ -3453,7 +2745,7 @@
                 <w:sz w:val="18"/>
                 <w:lang w:val="en-CA"/>
               </w:rPr>
-              <w:t>If someone challenges me:</w:t>
+              <w:t>If someone pushes back:</w:t>
             </w:r>
           </w:p>
           <w:p>
@@ -3469,22 +2761,7 @@
                 <w:sz w:val="18"/>
                 <w:lang w:val="en-CA"/>
               </w:rPr>
-              <w:t xml:space="preserve">"Isn't this just random luck?" No: chaos is </w:t>
-            </w:r>
-            <w:r>
-              <w:rPr>
-                <w:b/>
-                <w:sz w:val="18"/>
-                <w:lang w:val="en-CA"/>
-              </w:rPr>
-              <w:t>deterministic</w:t>
-            </w:r>
-            <w:r>
-              <w:rPr>
-                <w:sz w:val="18"/>
-                <w:lang w:val="en-CA"/>
-              </w:rPr>
-              <w:t xml:space="preserve"> (rule-based), not random (Lorenz; Gleick).</w:t>
+              <w:t>"Isn't this just luck?" No. Chaos is deterministic, so it runs on rules (Lorenz; Gleick).</w:t>
             </w:r>
           </w:p>
           <w:p>
@@ -3500,22 +2777,7 @@
                 <w:sz w:val="18"/>
                 <w:lang w:val="en-CA"/>
               </w:rPr>
-              <w:t xml:space="preserve">"Does this mean planning is pointless?" No: plan, but in </w:t>
-            </w:r>
-            <w:r>
-              <w:rPr>
-                <w:b/>
-                <w:sz w:val="18"/>
-                <w:lang w:val="en-CA"/>
-              </w:rPr>
-              <w:t>shorter cycles</w:t>
-            </w:r>
-            <w:r>
-              <w:rPr>
-                <w:sz w:val="18"/>
-                <w:lang w:val="en-CA"/>
-              </w:rPr>
-              <w:t xml:space="preserve"> with room to adjust. Even the video creator still sets goals and daily tasks (Video on Chaos Theory).</w:t>
+              <w:t>"So planning is pointless?" No, you plan shorter and adjust. Even the video guy sets goals and daily tasks (Video on Chaos Theory).</w:t>
             </w:r>
           </w:p>
           <w:p>
@@ -3531,7 +2793,7 @@
                 <w:sz w:val="18"/>
                 <w:lang w:val="en-CA"/>
               </w:rPr>
-              <w:t>"Is the video reliable?" It is a good everyday example, but it is a self-help video that also sells a course (Video on Chaos Theory), so I back up the theory with Lorenz, Gleick, Peters, and Wheatley.</w:t>
+              <w:t>"Is your video legit?" It's a good everyday example, but it's a self-help video selling a course (Video on Chaos Theory). That's why I back it up with Lorenz, Gleick, Peters, and Wheatley.</w:t>
             </w:r>
           </w:p>
         </w:tc>

</xml_diff>

<commit_message>
Shorten organizer while keeping all rubric elements
Co-Authored-By: Claude Opus 5.5 <noreply@anthropic.com>
Claude-Session: https://claude.ai/code/session_01YDM2CEbR7hU42o8YJBPxRB
</commit_message>
<xml_diff>
--- a/Chaos_Theory_Group1_Organizer.docx
+++ b/Chaos_Theory_Group1_Organizer.docx
@@ -261,7 +261,7 @@
                 <w:sz w:val="18"/>
                 <w:lang w:val="en-CA"/>
               </w:rPr>
-              <w:t xml:space="preserve"> says some systems follow strict rules and you still can't predict them long term. Tiny differences at the start turn into huge differences later (Dizikes; Gleick). People hear "chaos" and think random. It isn't. It runs on rules you just can't forecast far out.</w:t>
+              <w:t>: some systems follow strict rules and you still can't predict them long term, because tiny differences at the start grow into huge ones later (Dizikes; Gleick). Chaos isn't random. It's rule based but unpredictable far out.</w:t>
             </w:r>
           </w:p>
           <w:p/>
@@ -296,7 +296,7 @@
                 <w:sz w:val="18"/>
                 <w:lang w:val="en-CA"/>
               </w:rPr>
-              <w:t xml:space="preserve">, an MIT weather scientist. In </w:t>
+              <w:t xml:space="preserve"> (MIT weather scientist): in </w:t>
             </w:r>
             <w:r>
               <w:rPr>
@@ -311,7 +311,7 @@
                 <w:sz w:val="18"/>
                 <w:lang w:val="en-CA"/>
               </w:rPr>
-              <w:t xml:space="preserve"> he re-ran a weather model and typed </w:t>
+              <w:t xml:space="preserve"> he typed 0.506 instead of 0.506127 into a weather model and the forecast changed completely (Dizikes). His </w:t>
             </w:r>
             <w:r>
               <w:rPr>
@@ -319,14 +319,44 @@
                 <w:sz w:val="18"/>
                 <w:lang w:val="en-CA"/>
               </w:rPr>
-              <w:t>0.506 instead of 0.506127</w:t>
-            </w:r>
-            <w:r>
-              <w:rPr>
-                <w:sz w:val="18"/>
-                <w:lang w:val="en-CA"/>
-              </w:rPr>
-              <w:t>. The forecast went somewhere totally different (Dizikes).</w:t>
+              <w:t>1963</w:t>
+            </w:r>
+            <w:r>
+              <w:rPr>
+                <w:sz w:val="18"/>
+                <w:lang w:val="en-CA"/>
+              </w:rPr>
+              <w:t xml:space="preserve"> paper "Deterministic Nonperiodic Flow" is seen as the start of chaos theory (Lorenz), and his </w:t>
+            </w:r>
+            <w:r>
+              <w:rPr>
+                <w:b/>
+                <w:sz w:val="18"/>
+                <w:lang w:val="en-CA"/>
+              </w:rPr>
+              <w:t>1972</w:t>
+            </w:r>
+            <w:r>
+              <w:rPr>
+                <w:sz w:val="18"/>
+                <w:lang w:val="en-CA"/>
+              </w:rPr>
+              <w:t xml:space="preserve"> talk about a butterfly in Brazil and a tornado in Texas named the </w:t>
+            </w:r>
+            <w:r>
+              <w:rPr>
+                <w:b/>
+                <w:sz w:val="18"/>
+                <w:lang w:val="en-CA"/>
+              </w:rPr>
+              <w:t>butterfly effect</w:t>
+            </w:r>
+            <w:r>
+              <w:rPr>
+                <w:sz w:val="18"/>
+                <w:lang w:val="en-CA"/>
+              </w:rPr>
+              <w:t xml:space="preserve"> (Dizikes).</w:t>
             </w:r>
           </w:p>
           <w:p>
@@ -339,25 +369,33 @@
             </w:pPr>
             <w:r>
               <w:rPr>
-                <w:sz w:val="18"/>
-                <w:lang w:val="en-CA"/>
-              </w:rPr>
-              <w:t xml:space="preserve">In </w:t>
-            </w:r>
-            <w:r>
-              <w:rPr>
                 <w:b/>
                 <w:sz w:val="18"/>
                 <w:lang w:val="en-CA"/>
               </w:rPr>
-              <w:t>1963</w:t>
-            </w:r>
-            <w:r>
-              <w:rPr>
-                <w:sz w:val="18"/>
-                <w:lang w:val="en-CA"/>
-              </w:rPr>
-              <w:t xml:space="preserve"> Lorenz published </w:t>
+              <w:t>James Gleick</w:t>
+            </w:r>
+            <w:r>
+              <w:rPr>
+                <w:sz w:val="18"/>
+                <w:lang w:val="en-CA"/>
+              </w:rPr>
+              <w:t xml:space="preserve">: </w:t>
+            </w:r>
+            <w:r>
+              <w:rPr>
+                <w:i/>
+                <w:sz w:val="18"/>
+                <w:lang w:val="en-CA"/>
+              </w:rPr>
+              <w:t>Chaos: Making a New Science</w:t>
+            </w:r>
+            <w:r>
+              <w:rPr>
+                <w:sz w:val="18"/>
+                <w:lang w:val="en-CA"/>
+              </w:rPr>
+              <w:t xml:space="preserve"> (</w:t>
             </w:r>
             <w:r>
               <w:rPr>
@@ -365,14 +403,14 @@
                 <w:sz w:val="18"/>
                 <w:lang w:val="en-CA"/>
               </w:rPr>
-              <w:t>"Deterministic Nonperiodic Flow."</w:t>
-            </w:r>
-            <w:r>
-              <w:rPr>
-                <w:sz w:val="18"/>
-                <w:lang w:val="en-CA"/>
-              </w:rPr>
-              <w:t xml:space="preserve"> Most people point to that paper as the start of chaos theory (Lorenz).</w:t>
+              <w:t>1987</w:t>
+            </w:r>
+            <w:r>
+              <w:rPr>
+                <w:sz w:val="18"/>
+                <w:lang w:val="en-CA"/>
+              </w:rPr>
+              <w:t>) made the idea mainstream (Gleick).</w:t>
             </w:r>
           </w:p>
           <w:p>
@@ -385,25 +423,33 @@
             </w:pPr>
             <w:r>
               <w:rPr>
-                <w:sz w:val="18"/>
-                <w:lang w:val="en-CA"/>
-              </w:rPr>
-              <w:t xml:space="preserve">In </w:t>
-            </w:r>
-            <w:r>
-              <w:rPr>
                 <w:b/>
                 <w:sz w:val="18"/>
                 <w:lang w:val="en-CA"/>
               </w:rPr>
-              <w:t>1972</w:t>
-            </w:r>
-            <w:r>
-              <w:rPr>
-                <w:sz w:val="18"/>
-                <w:lang w:val="en-CA"/>
-              </w:rPr>
-              <w:t xml:space="preserve"> he gave a talk asking if "the flap of a butterfly's wings in Brazil" could set off a tornado in Texas. That's where the name </w:t>
+              <w:t>Tom Peters</w:t>
+            </w:r>
+            <w:r>
+              <w:rPr>
+                <w:sz w:val="18"/>
+                <w:lang w:val="en-CA"/>
+              </w:rPr>
+              <w:t xml:space="preserve">: </w:t>
+            </w:r>
+            <w:r>
+              <w:rPr>
+                <w:i/>
+                <w:sz w:val="18"/>
+                <w:lang w:val="en-CA"/>
+              </w:rPr>
+              <w:t>Thriving on Chaos</w:t>
+            </w:r>
+            <w:r>
+              <w:rPr>
+                <w:sz w:val="18"/>
+                <w:lang w:val="en-CA"/>
+              </w:rPr>
+              <w:t xml:space="preserve"> (</w:t>
             </w:r>
             <w:r>
               <w:rPr>
@@ -411,14 +457,14 @@
                 <w:sz w:val="18"/>
                 <w:lang w:val="en-CA"/>
               </w:rPr>
-              <w:t>butterfly effect</w:t>
-            </w:r>
-            <w:r>
-              <w:rPr>
-                <w:sz w:val="18"/>
-                <w:lang w:val="en-CA"/>
-              </w:rPr>
-              <w:t xml:space="preserve"> comes from (Dizikes).</w:t>
+              <w:t>1987</w:t>
+            </w:r>
+            <w:r>
+              <w:rPr>
+                <w:sz w:val="18"/>
+                <w:lang w:val="en-CA"/>
+              </w:rPr>
+              <w:t>) says change is constant, so winning companies use chaos instead of fighting it ("Thriving on Chaos").</w:t>
             </w:r>
           </w:p>
           <w:p>
@@ -435,14 +481,14 @@
                 <w:sz w:val="18"/>
                 <w:lang w:val="en-CA"/>
               </w:rPr>
-              <w:t>James Gleick</w:t>
-            </w:r>
-            <w:r>
-              <w:rPr>
-                <w:sz w:val="18"/>
-                <w:lang w:val="en-CA"/>
-              </w:rPr>
-              <w:t xml:space="preserve"> wrote </w:t>
+              <w:t>Margaret Wheatley</w:t>
+            </w:r>
+            <w:r>
+              <w:rPr>
+                <w:sz w:val="18"/>
+                <w:lang w:val="en-CA"/>
+              </w:rPr>
+              <w:t xml:space="preserve">: </w:t>
             </w:r>
             <w:r>
               <w:rPr>
@@ -450,7 +496,7 @@
                 <w:sz w:val="18"/>
                 <w:lang w:val="en-CA"/>
               </w:rPr>
-              <w:t>Chaos: Making a New Science</w:t>
+              <w:t>Leadership and the New Science</w:t>
             </w:r>
             <w:r>
               <w:rPr>
@@ -465,14 +511,14 @@
                 <w:sz w:val="18"/>
                 <w:lang w:val="en-CA"/>
               </w:rPr>
-              <w:t>Viking, 1987</w:t>
-            </w:r>
-            <w:r>
-              <w:rPr>
-                <w:sz w:val="18"/>
-                <w:lang w:val="en-CA"/>
-              </w:rPr>
-              <w:t>). That book took chaos theory out of the lab and turned "butterfly effect" into a normal phrase (Gleick).</w:t>
+              <w:t>1992</w:t>
+            </w:r>
+            <w:r>
+              <w:rPr>
+                <w:sz w:val="18"/>
+                <w:lang w:val="en-CA"/>
+              </w:rPr>
+              <w:t>) says companies act more like living systems than machines (Wheatley).</w:t>
             </w:r>
           </w:p>
           <w:p>
@@ -485,33 +531,25 @@
             </w:pPr>
             <w:r>
               <w:rPr>
+                <w:sz w:val="18"/>
+                <w:lang w:val="en-CA"/>
+              </w:rPr>
+              <w:t xml:space="preserve">Also: </w:t>
+            </w:r>
+            <w:r>
+              <w:rPr>
                 <w:b/>
                 <w:sz w:val="18"/>
                 <w:lang w:val="en-CA"/>
               </w:rPr>
-              <w:t>Tom Peters</w:t>
-            </w:r>
-            <w:r>
-              <w:rPr>
-                <w:sz w:val="18"/>
-                <w:lang w:val="en-CA"/>
-              </w:rPr>
-              <w:t xml:space="preserve"> wrote </w:t>
-            </w:r>
-            <w:r>
-              <w:rPr>
-                <w:i/>
-                <w:sz w:val="18"/>
-                <w:lang w:val="en-CA"/>
-              </w:rPr>
-              <w:t>Thriving on Chaos</w:t>
-            </w:r>
-            <w:r>
-              <w:rPr>
-                <w:sz w:val="18"/>
-                <w:lang w:val="en-CA"/>
-              </w:rPr>
-              <w:t xml:space="preserve"> (</w:t>
+              <w:t>Ralph Stacey</w:t>
+            </w:r>
+            <w:r>
+              <w:rPr>
+                <w:sz w:val="18"/>
+                <w:lang w:val="en-CA"/>
+              </w:rPr>
+              <w:t xml:space="preserve"> (1992) says strategy emerges as you go (Stacey). </w:t>
             </w:r>
             <w:r>
               <w:rPr>
@@ -519,140 +557,93 @@
                 <w:sz w:val="18"/>
                 <w:lang w:val="en-CA"/>
               </w:rPr>
-              <w:t>1987</w:t>
-            </w:r>
-            <w:r>
-              <w:rPr>
-                <w:sz w:val="18"/>
-                <w:lang w:val="en-CA"/>
-              </w:rPr>
-              <w:t>). His take: change is constant now, so the companies that win use chaos instead of fighting it (Peters; "Thriving on Chaos").</w:t>
-            </w:r>
-          </w:p>
-          <w:p>
-            <w:pPr>
-              <w:pStyle w:val="ListParagraph"/>
-              <w:numPr>
-                <w:ilvl w:val="0"/>
-                <w:numId w:val="1"/>
-              </w:numPr>
-            </w:pPr>
+              <w:t>Norman Packard</w:t>
+            </w:r>
+            <w:r>
+              <w:rPr>
+                <w:sz w:val="18"/>
+                <w:lang w:val="en-CA"/>
+              </w:rPr>
+              <w:t xml:space="preserve"> coined "edge of chaos" in </w:t>
+            </w:r>
             <w:r>
               <w:rPr>
                 <w:b/>
                 <w:sz w:val="18"/>
                 <w:lang w:val="en-CA"/>
               </w:rPr>
-              <w:t>Margaret Wheatley</w:t>
-            </w:r>
-            <w:r>
-              <w:rPr>
-                <w:sz w:val="18"/>
-                <w:lang w:val="en-CA"/>
-              </w:rPr>
-              <w:t xml:space="preserve"> wrote </w:t>
-            </w:r>
-            <w:r>
-              <w:rPr>
-                <w:i/>
-                <w:sz w:val="18"/>
-                <w:lang w:val="en-CA"/>
-              </w:rPr>
-              <w:t>Leadership and the New Science</w:t>
-            </w:r>
-            <w:r>
-              <w:rPr>
-                <w:sz w:val="18"/>
-                <w:lang w:val="en-CA"/>
-              </w:rPr>
-              <w:t xml:space="preserve"> (</w:t>
-            </w:r>
+              <w:t>1988</w:t>
+            </w:r>
+            <w:r>
+              <w:rPr>
+                <w:sz w:val="18"/>
+                <w:lang w:val="en-CA"/>
+              </w:rPr>
+              <w:t xml:space="preserve"> ("Edge of Chaos").</w:t>
+            </w:r>
+          </w:p>
+          <w:p/>
+          <w:p>
             <w:r>
               <w:rPr>
                 <w:b/>
                 <w:sz w:val="18"/>
                 <w:lang w:val="en-CA"/>
               </w:rPr>
-              <w:t>1992</w:t>
-            </w:r>
-            <w:r>
-              <w:rPr>
-                <w:sz w:val="18"/>
-                <w:lang w:val="en-CA"/>
-              </w:rPr>
-              <w:t>, revised 2006). She says companies act more like living things than machines (Wheatley).</w:t>
-            </w:r>
-          </w:p>
-          <w:p>
-            <w:pPr>
-              <w:pStyle w:val="ListParagraph"/>
-              <w:numPr>
-                <w:ilvl w:val="0"/>
-                <w:numId w:val="1"/>
-              </w:numPr>
-            </w:pPr>
+              <w:t>KEY TERMS</w:t>
+            </w:r>
+          </w:p>
+          <w:p>
             <w:r>
               <w:rPr>
                 <w:b/>
                 <w:sz w:val="18"/>
                 <w:lang w:val="en-CA"/>
               </w:rPr>
-              <w:t>Ralph Stacey</w:t>
-            </w:r>
-            <w:r>
-              <w:rPr>
-                <w:sz w:val="18"/>
-                <w:lang w:val="en-CA"/>
-              </w:rPr>
-              <w:t xml:space="preserve"> (</w:t>
-            </w:r>
-            <w:r>
-              <w:rPr>
-                <w:i/>
-                <w:sz w:val="18"/>
-                <w:lang w:val="en-CA"/>
-              </w:rPr>
-              <w:t>Managing the Unknowable</w:t>
-            </w:r>
-            <w:r>
-              <w:rPr>
-                <w:sz w:val="18"/>
-                <w:lang w:val="en-CA"/>
-              </w:rPr>
-              <w:t xml:space="preserve">, 1992) applied chaos to strategy. He says strategy mostly emerges as you go (Stacey). </w:t>
-            </w:r>
+              <w:t>Butterfly effect</w:t>
+            </w:r>
+            <w:r>
+              <w:rPr>
+                <w:sz w:val="18"/>
+                <w:lang w:val="en-CA"/>
+              </w:rPr>
+              <w:t>: small change now, big change later. My video calls chaos theory "basically the same as the butterfly effect" (Video on Chaos Theory).</w:t>
+            </w:r>
+          </w:p>
+          <w:p>
             <w:r>
               <w:rPr>
                 <w:b/>
                 <w:sz w:val="18"/>
                 <w:lang w:val="en-CA"/>
               </w:rPr>
-              <w:t>Norman Packard</w:t>
-            </w:r>
-            <w:r>
-              <w:rPr>
-                <w:sz w:val="18"/>
-                <w:lang w:val="en-CA"/>
-              </w:rPr>
-              <w:t xml:space="preserve"> coined "edge of chaos" in </w:t>
-            </w:r>
+              <w:t>Nonlinearity</w:t>
+            </w:r>
+            <w:r>
+              <w:rPr>
+                <w:sz w:val="18"/>
+                <w:lang w:val="en-CA"/>
+              </w:rPr>
+              <w:t>: effort and result don't match up. Double the input and you might get ten times the output, or nothing.</w:t>
+            </w:r>
+          </w:p>
+          <w:p>
             <w:r>
               <w:rPr>
                 <w:b/>
                 <w:sz w:val="18"/>
                 <w:lang w:val="en-CA"/>
               </w:rPr>
-              <w:t>1988</w:t>
-            </w:r>
-            <w:r>
-              <w:rPr>
-                <w:sz w:val="18"/>
-                <w:lang w:val="en-CA"/>
-              </w:rPr>
-              <w:t xml:space="preserve"> ("Edge of Chaos").</w:t>
-            </w:r>
-          </w:p>
-          <w:p/>
+              <w:t>Self-organization</w:t>
+            </w:r>
+            <w:r>
+              <w:rPr>
+                <w:sz w:val="18"/>
+                <w:lang w:val="en-CA"/>
+              </w:rPr>
+              <w:t>: people create order without a boss running every move, as long as they share clear values (Wheatley).</w:t>
+            </w:r>
+          </w:p>
           <w:p>
             <w:r>
               <w:rPr>
@@ -660,7 +651,14 @@
                 <w:sz w:val="18"/>
                 <w:lang w:val="en-CA"/>
               </w:rPr>
-              <w:t>KEY TERMS</w:t>
+              <w:t>Edge of chaos</w:t>
+            </w:r>
+            <w:r>
+              <w:rPr>
+                <w:sz w:val="18"/>
+                <w:lang w:val="en-CA"/>
+              </w:rPr>
+              <w:t>: the zone between too much order and total disorder, where systems adapt best ("Edge of Chaos"; Stacey).</w:t>
             </w:r>
           </w:p>
           <w:p>
@@ -670,149 +668,6 @@
                 <w:sz w:val="18"/>
                 <w:lang w:val="en-CA"/>
               </w:rPr>
-              <w:t>Butterfly effect</w:t>
-            </w:r>
-            <w:r>
-              <w:rPr>
-                <w:sz w:val="18"/>
-                <w:lang w:val="en-CA"/>
-              </w:rPr>
-              <w:t xml:space="preserve"> (also called </w:t>
-            </w:r>
-            <w:r>
-              <w:rPr>
-                <w:b/>
-                <w:sz w:val="18"/>
-                <w:lang w:val="en-CA"/>
-              </w:rPr>
-              <w:t>sensitive dependence on initial conditions</w:t>
-            </w:r>
-            <w:r>
-              <w:rPr>
-                <w:sz w:val="18"/>
-                <w:lang w:val="en-CA"/>
-              </w:rPr>
-              <w:t>): small change now, big change later. My video calls chaos theory "basically the same as the butterfly effect" (Video on Chaos Theory).</w:t>
-            </w:r>
-          </w:p>
-          <w:p>
-            <w:r>
-              <w:rPr>
-                <w:b/>
-                <w:sz w:val="18"/>
-                <w:lang w:val="en-CA"/>
-              </w:rPr>
-              <w:t>Nonlinearity</w:t>
-            </w:r>
-            <w:r>
-              <w:rPr>
-                <w:sz w:val="18"/>
-                <w:lang w:val="en-CA"/>
-              </w:rPr>
-              <w:t>: input and output don't match up. Double the effort and you might get ten times the result. Or nothing.</w:t>
-            </w:r>
-          </w:p>
-          <w:p>
-            <w:r>
-              <w:rPr>
-                <w:b/>
-                <w:sz w:val="18"/>
-                <w:lang w:val="en-CA"/>
-              </w:rPr>
-              <w:t>Self-organization</w:t>
-            </w:r>
-            <w:r>
-              <w:rPr>
-                <w:sz w:val="18"/>
-                <w:lang w:val="en-CA"/>
-              </w:rPr>
-              <w:t>: people sort themselves into order without a boss running every move. Wheatley says leaders should set clear values and let people organize around them (Wheatley).</w:t>
-            </w:r>
-          </w:p>
-          <w:p>
-            <w:r>
-              <w:rPr>
-                <w:b/>
-                <w:sz w:val="18"/>
-                <w:lang w:val="en-CA"/>
-              </w:rPr>
-              <w:t>Edge of chaos</w:t>
-            </w:r>
-            <w:r>
-              <w:rPr>
-                <w:sz w:val="18"/>
-                <w:lang w:val="en-CA"/>
-              </w:rPr>
-              <w:t xml:space="preserve">: the spot between too much order and total disorder, where systems adapt best. Packard coined it in 1988, building on Christopher Langton's work ("Edge of Chaos"). Stacey calls the same zone </w:t>
-            </w:r>
-            <w:r>
-              <w:rPr>
-                <w:b/>
-                <w:sz w:val="18"/>
-                <w:lang w:val="en-CA"/>
-              </w:rPr>
-              <w:t>bounded instability</w:t>
-            </w:r>
-            <w:r>
-              <w:rPr>
-                <w:sz w:val="18"/>
-                <w:lang w:val="en-CA"/>
-              </w:rPr>
-              <w:t xml:space="preserve"> (Stacey).</w:t>
-            </w:r>
-          </w:p>
-          <w:p>
-            <w:r>
-              <w:rPr>
-                <w:b/>
-                <w:sz w:val="18"/>
-                <w:lang w:val="en-CA"/>
-              </w:rPr>
-              <w:t>Deterministic</w:t>
-            </w:r>
-            <w:r>
-              <w:rPr>
-                <w:sz w:val="18"/>
-                <w:lang w:val="en-CA"/>
-              </w:rPr>
-              <w:t>: runs on rules with no randomness, and you still can't predict it far out. It's the reason weather forecasts get worse the further out you look (Lorenz).</w:t>
-            </w:r>
-          </w:p>
-          <w:p/>
-          <w:p>
-            <w:r>
-              <w:rPr>
-                <w:b/>
-                <w:sz w:val="18"/>
-                <w:lang w:val="en-CA"/>
-              </w:rPr>
-              <w:t>KEY TERMS FROM MY VIDEO</w:t>
-            </w:r>
-          </w:p>
-          <w:p>
-            <w:r>
-              <w:rPr>
-                <w:b/>
-                <w:sz w:val="18"/>
-                <w:lang w:val="en-CA"/>
-              </w:rPr>
-              <w:t>Small positive actions</w:t>
-            </w:r>
-            <w:r>
-              <w:rPr>
-                <w:sz w:val="18"/>
-                <w:lang w:val="en-CA"/>
-              </w:rPr>
-              <w:t>: every tiny action is either positive or negative, so stack your day with positive ones (Video on Chaos Theory).</w:t>
-            </w:r>
-          </w:p>
-          <w:p>
-            <w:r>
-              <w:rPr>
-                <w:b/>
-                <w:sz w:val="18"/>
-                <w:lang w:val="en-CA"/>
-              </w:rPr>
               <w:t>Compounding</w:t>
             </w:r>
             <w:r>
@@ -820,41 +675,7 @@
                 <w:sz w:val="18"/>
                 <w:lang w:val="en-CA"/>
               </w:rPr>
-              <w:t>: small actions add up over months and years. In his words, "it kind of all compounds" (Video on Chaos Theory).</w:t>
-            </w:r>
-          </w:p>
-          <w:p>
-            <w:r>
-              <w:rPr>
-                <w:b/>
-                <w:sz w:val="18"/>
-                <w:lang w:val="en-CA"/>
-              </w:rPr>
-              <w:t>Split-second decision</w:t>
-            </w:r>
-            <w:r>
-              <w:rPr>
-                <w:sz w:val="18"/>
-                <w:lang w:val="en-CA"/>
-              </w:rPr>
-              <w:t>: one quick yes can change your path. He sent one DM and got a business partner out of it (Video on Chaos Theory).</w:t>
-            </w:r>
-          </w:p>
-          <w:p>
-            <w:r>
-              <w:rPr>
-                <w:b/>
-                <w:sz w:val="18"/>
-                <w:lang w:val="en-CA"/>
-              </w:rPr>
-              <w:t>Not black and white</w:t>
-            </w:r>
-            <w:r>
-              <w:rPr>
-                <w:sz w:val="18"/>
-                <w:lang w:val="en-CA"/>
-              </w:rPr>
-              <w:t>: doing X doesn't always get you Y (Video on Chaos Theory).</w:t>
+              <w:t xml:space="preserve"> (from my video): small positive actions add up, because "it kind of all compounds" (Video on Chaos Theory).</w:t>
             </w:r>
           </w:p>
         </w:tc>
@@ -1006,15 +827,6 @@
               <w:t xml:space="preserve"> a YouTube video on chaos theory in business, youtu.be/JiB3CR7PYes</w:t>
             </w:r>
           </w:p>
-          <w:p>
-            <w:r>
-              <w:rPr>
-                <w:sz w:val="18"/>
-                <w:lang w:val="en-CA"/>
-              </w:rPr>
-              <w:t>He pitches it as "chaos theory in business and how you can use it to your advantage" (Video on Chaos Theory).</w:t>
-            </w:r>
-          </w:p>
           <w:p/>
           <w:p>
             <w:r>
@@ -1025,23 +837,12 @@
               </w:rPr>
               <w:t>Summary (in my words):</w:t>
             </w:r>
-          </w:p>
-          <w:p>
-            <w:r>
-              <w:rPr>
-                <w:sz w:val="18"/>
-                <w:lang w:val="en-CA"/>
-              </w:rPr>
-              <w:t>He says chaos theory is basically the butterfly effect. One small action can cause huge consequences later. His example is extreme on purpose: he goes back inside to grab water before leaving, and that 20 second delay could be the difference between getting hit by a car or not (Video on Chaos Theory).</w:t>
-            </w:r>
-          </w:p>
-          <w:p>
-            <w:r>
-              <w:rPr>
-                <w:sz w:val="18"/>
-                <w:lang w:val="en-CA"/>
-              </w:rPr>
-              <w:t>Then he gives two tips for business (Video on Chaos Theory):</w:t>
+            <w:r>
+              <w:rPr>
+                <w:sz w:val="18"/>
+                <w:lang w:val="en-CA"/>
+              </w:rPr>
+              <w:t xml:space="preserve"> He says chaos theory is basically the butterfly effect. His example: going back inside for water delays him 20 seconds, which could decide whether he gets hit by a car (Video on Chaos Theory). He gives two tips:</w:t>
             </w:r>
           </w:p>
           <w:p>
@@ -1057,7 +858,7 @@
                 <w:sz w:val="18"/>
                 <w:lang w:val="en-CA"/>
               </w:rPr>
-              <w:t>Tip 1: Fill your day with small positive actions. You can't control outcomes, but the actions stack up over 6, 12, 24 months, and "luck comes to those who are prepared for it" (Video on Chaos Theory).</w:t>
+              <w:t>Fill your day with small positive actions, since they stack up and "luck comes to those who are prepared for it" (Video on Chaos Theory).</w:t>
             </w:r>
           </w:p>
           <w:p>
@@ -1073,16 +874,7 @@
                 <w:sz w:val="18"/>
                 <w:lang w:val="en-CA"/>
               </w:rPr>
-              <w:t>Tip 2: Business isn't always black and white. He still sets goals and breaks them into daily tasks. A lot of his wins came from stuff that paid nothing at first, like free videos for other people's courses. Those videos later brought him mentorship students and customers (Video on Chaos Theory).</w:t>
-            </w:r>
-          </w:p>
-          <w:p>
-            <w:r>
-              <w:rPr>
-                <w:sz w:val="18"/>
-                <w:lang w:val="en-CA"/>
-              </w:rPr>
-              <w:t>He closes with split-second decisions. One DM turned into his agency business partner. His advice is to put yourself out there and say yes more often when your gut says yes (Video on Chaos Theory).</w:t>
+              <w:t>Business isn't black and white. Free videos he made for other people's courses later brought him customers, and one DM turned into his business partner (Video on Chaos Theory).</w:t>
             </w:r>
           </w:p>
           <w:p/>
@@ -1100,7 +892,7 @@
                 <w:sz w:val="18"/>
                 <w:lang w:val="en-CA"/>
               </w:rPr>
-              <w:t xml:space="preserve"> Good mindset video, weak on the actual theory. Real chaos theory comes from math and weather (Lorenz). It never says actions are "positive or negative," and it doesn't promise luck. He also sells his social media marketing course halfway through (Video on Chaos Theory), so I'm watching for bias.</w:t>
+              <w:t xml:space="preserve"> Good mindset advice, weak on the real theory, which comes from math and weather (Lorenz). He also sells his own course halfway through (Video on Chaos Theory), so I watch for bias.</w:t>
             </w:r>
           </w:p>
         </w:tc>
@@ -1533,16 +1325,14 @@
                 <w:sz w:val="18"/>
                 <w:lang w:val="en-CA"/>
               </w:rPr>
-              <w:t>1. Small changes, big results</w:t>
-            </w:r>
-          </w:p>
-          <w:p>
-            <w:r>
-              <w:rPr>
-                <w:sz w:val="18"/>
-                <w:lang w:val="en-CA"/>
-              </w:rPr>
-              <w:t>Lorenz rounded one number and lost his whole forecast (Dizikes). The video makes it personal: one small decision "has completely changed the outcome for the rest of my day" (Video on Chaos Theory).</w:t>
+              <w:t>1. Small changes, big results.</w:t>
+            </w:r>
+            <w:r>
+              <w:rPr>
+                <w:sz w:val="18"/>
+                <w:lang w:val="en-CA"/>
+              </w:rPr>
+              <w:t xml:space="preserve"> One rounded number wrecked Lorenz's forecast (Dizikes). The video makes it personal: one small decision "has completely changed the outcome for the rest of my day" (Video on Chaos Theory).</w:t>
             </w:r>
           </w:p>
           <w:p>
@@ -1558,7 +1348,25 @@
                 <w:sz w:val="18"/>
                 <w:lang w:val="en-CA"/>
               </w:rPr>
-              <w:t>CONNECTS to customer service at Bulldog. One rude reply or one great fix can spread online and become the brand.</w:t>
+              <w:t>CONNECTS to customer service: one rude reply or one great fix can go viral and become Bulldog's brand.</w:t>
+            </w:r>
+          </w:p>
+          <w:p/>
+          <w:p>
+            <w:r>
+              <w:rPr>
+                <w:b/>
+                <w:sz w:val="18"/>
+                <w:lang w:val="en-CA"/>
+              </w:rPr>
+              <w:t>2. Plan short.</w:t>
+            </w:r>
+            <w:r>
+              <w:rPr>
+                <w:sz w:val="18"/>
+                <w:lang w:val="en-CA"/>
+              </w:rPr>
+              <w:t xml:space="preserve"> Long range forecasts break (Lorenz), so fixed five year plans break too. Stacey says strategy emerges as you go (Stacey). The video agrees goals still matter: "reverse engineer" them into daily tasks (Video on Chaos Theory).</w:t>
             </w:r>
           </w:p>
           <w:p>
@@ -1574,7 +1382,7 @@
                 <w:sz w:val="18"/>
                 <w:lang w:val="en-CA"/>
               </w:rPr>
-              <w:t>CONNECTS to compound interest. Small amounts repeated over time get big. "It kind of all compounds" (Video on Chaos Theory).</w:t>
+              <w:t>CONNECTS to scientific management, which treats a company like a predictable machine. Chaos theory says that fails in fast markets.</w:t>
             </w:r>
           </w:p>
           <w:p/>
@@ -1585,16 +1393,14 @@
                 <w:sz w:val="18"/>
                 <w:lang w:val="en-CA"/>
               </w:rPr>
-              <w:t>2. You can't predict far out, so plan short</w:t>
-            </w:r>
-          </w:p>
-          <w:p>
-            <w:r>
-              <w:rPr>
-                <w:sz w:val="18"/>
-                <w:lang w:val="en-CA"/>
-              </w:rPr>
-              <w:t>Tiny starting differences grow, so long range forecasts break (Dizikes; Lorenz). The video guy still sets goals and will "reverse engineer" them into daily tasks (Video on Chaos Theory). He just warns that "a lot of people kind of think business is just black and white" (Video on Chaos Theory).</w:t>
+              <w:t>3. Test small, fail fast.</w:t>
+            </w:r>
+            <w:r>
+              <w:rPr>
+                <w:sz w:val="18"/>
+                <w:lang w:val="en-CA"/>
+              </w:rPr>
+              <w:t xml:space="preserve"> Peters wants fewer bureaucratic rules, support for fast failures, and decisions pushed down to front line staff ("Thriving on Chaos").</w:t>
             </w:r>
           </w:p>
           <w:p>
@@ -1610,7 +1416,25 @@
                 <w:sz w:val="18"/>
                 <w:lang w:val="en-CA"/>
               </w:rPr>
-              <w:t>CONNECTS to the older management approaches the memo says Bulldog already looked at. Scientific management treats the workplace like a predictable machine, and chaos theory says that breaks in fast markets.</w:t>
+              <w:t>CONNECTS to the video's tip to say yes to things with no instant payoff (Video on Chaos Theory). You can't know which bet wins, so place lots of small ones.</w:t>
+            </w:r>
+          </w:p>
+          <w:p/>
+          <w:p>
+            <w:r>
+              <w:rPr>
+                <w:b/>
+                <w:sz w:val="18"/>
+                <w:lang w:val="en-CA"/>
+              </w:rPr>
+              <w:t>4. Order shows up on its own.</w:t>
+            </w:r>
+            <w:r>
+              <w:rPr>
+                <w:sz w:val="18"/>
+                <w:lang w:val="en-CA"/>
+              </w:rPr>
+              <w:t xml:space="preserve"> Wheatley says leaders should make values clear instead of controlling every detail, and people organize around them (Wheatley).</w:t>
             </w:r>
           </w:p>
           <w:p>
@@ -1626,7 +1450,7 @@
                 <w:sz w:val="18"/>
                 <w:lang w:val="en-CA"/>
               </w:rPr>
-              <w:t>Stacey says strategy usually emerges from the company as it goes, instead of following a fixed plan (Stacey).</w:t>
+              <w:t>CONNECTS to Learning Organizations, another group's theory: both say keep adapting.</w:t>
             </w:r>
           </w:p>
           <w:p/>
@@ -1637,159 +1461,14 @@
                 <w:sz w:val="18"/>
                 <w:lang w:val="en-CA"/>
               </w:rPr>
-              <w:t>3. Use chaos instead of fighting it</w:t>
-            </w:r>
-          </w:p>
-          <w:p>
-            <w:r>
-              <w:rPr>
-                <w:sz w:val="18"/>
-                <w:lang w:val="en-CA"/>
-              </w:rPr>
-              <w:t>Peters says companies have to accept that nothing stays the same and learn to thrive on chaos ("Thriving on Chaos"). He gives 45 prescriptions in five areas: customers, constant innovation, partnering with everyone tied to the company, a vision built around change, and measuring what actually matters ("Thriving on Chaos").</w:t>
-            </w:r>
-          </w:p>
-          <w:p>
-            <w:pPr>
-              <w:pStyle w:val="ListParagraph"/>
-              <w:numPr>
-                <w:ilvl w:val="0"/>
-                <w:numId w:val="1"/>
-              </w:numPr>
-            </w:pPr>
-            <w:r>
-              <w:rPr>
-                <w:sz w:val="18"/>
-                <w:lang w:val="en-CA"/>
-              </w:rPr>
-              <w:t>He wants fewer bureaucratic rules, support for fast failures, obsessive listening, and decisions pushed down the ladder ("Thriving on Chaos").</w:t>
-            </w:r>
-          </w:p>
-          <w:p>
-            <w:pPr>
-              <w:pStyle w:val="ListParagraph"/>
-              <w:numPr>
-                <w:ilvl w:val="0"/>
-                <w:numId w:val="1"/>
-              </w:numPr>
-            </w:pPr>
-            <w:r>
-              <w:rPr>
-                <w:sz w:val="18"/>
-                <w:lang w:val="en-CA"/>
-              </w:rPr>
-              <w:t>CONNECTS to the video's tip to say yes to things with no instant payoff (Video on Chaos Theory). You can't know which bet wins, so place lots of small ones.</w:t>
-            </w:r>
-          </w:p>
-          <w:p/>
-          <w:p>
-            <w:r>
-              <w:rPr>
-                <w:b/>
-                <w:sz w:val="18"/>
-                <w:lang w:val="en-CA"/>
-              </w:rPr>
-              <w:t>4. Order shows up on its own</w:t>
-            </w:r>
-          </w:p>
-          <w:p>
-            <w:r>
-              <w:rPr>
-                <w:sz w:val="18"/>
-                <w:lang w:val="en-CA"/>
-              </w:rPr>
-              <w:t>Wheatley sees companies as living systems that move toward order even when it gets messy along the way (Wheatley). Leaders don't need to control every detail. They need to make the values and purpose clear so people can organize around them (Wheatley).</w:t>
-            </w:r>
-          </w:p>
-          <w:p>
-            <w:pPr>
-              <w:pStyle w:val="ListParagraph"/>
-              <w:numPr>
-                <w:ilvl w:val="0"/>
-                <w:numId w:val="1"/>
-              </w:numPr>
-            </w:pPr>
-            <w:r>
-              <w:rPr>
-                <w:sz w:val="18"/>
-                <w:lang w:val="en-CA"/>
-              </w:rPr>
-              <w:t>CONNECTS to the video's relationship tip: "build relationships with people when there is no financial gain in the short term" (Video on Chaos Theory). Relationships are how self-organization actually happens.</w:t>
-            </w:r>
-          </w:p>
-          <w:p>
-            <w:pPr>
-              <w:pStyle w:val="ListParagraph"/>
-              <w:numPr>
-                <w:ilvl w:val="0"/>
-                <w:numId w:val="1"/>
-              </w:numPr>
-            </w:pPr>
-            <w:r>
-              <w:rPr>
-                <w:sz w:val="18"/>
-                <w:lang w:val="en-CA"/>
-              </w:rPr>
-              <w:t>CONNECTS to Learning Organizations, another group's theory. Both say a company has to keep adapting.</w:t>
-            </w:r>
-          </w:p>
-          <w:p/>
-          <w:p>
-            <w:r>
-              <w:rPr>
-                <w:b/>
-                <w:sz w:val="18"/>
-                <w:lang w:val="en-CA"/>
-              </w:rPr>
-              <w:t>5. Where the video and the research disagree</w:t>
-            </w:r>
-          </w:p>
-          <w:p>
-            <w:pPr>
-              <w:pStyle w:val="ListParagraph"/>
-              <w:numPr>
-                <w:ilvl w:val="0"/>
-                <w:numId w:val="1"/>
-              </w:numPr>
-            </w:pPr>
-            <w:r>
-              <w:rPr>
-                <w:sz w:val="18"/>
-                <w:lang w:val="en-CA"/>
-              </w:rPr>
-              <w:t>The video sells chaos theory as luck and mindset. The research is about the limits of prediction, which makes it a planning and leadership lesson (Gleick; Lorenz).</w:t>
-            </w:r>
-          </w:p>
-          <w:p>
-            <w:pPr>
-              <w:pStyle w:val="ListParagraph"/>
-              <w:numPr>
-                <w:ilvl w:val="0"/>
-                <w:numId w:val="1"/>
-              </w:numPr>
-            </w:pPr>
-            <w:r>
-              <w:rPr>
-                <w:sz w:val="18"/>
-                <w:lang w:val="en-CA"/>
-              </w:rPr>
-              <w:t>The video leans on outliers, like the viral "cash me outside" clip (Video on Chaos Theory). That's survivorship bias. You hear about the one that blew up and never about the thousands that didn't.</w:t>
-            </w:r>
-          </w:p>
-          <w:p>
-            <w:pPr>
-              <w:pStyle w:val="ListParagraph"/>
-              <w:numPr>
-                <w:ilvl w:val="0"/>
-                <w:numId w:val="1"/>
-              </w:numPr>
-            </w:pPr>
-            <w:r>
-              <w:rPr>
-                <w:sz w:val="18"/>
-                <w:lang w:val="en-CA"/>
-              </w:rPr>
-              <w:t>It cuts both ways. Small actions cause big wins and big disasters, so Bulldog needs good small habits plus a way to react fast when something breaks.</w:t>
+              <w:t>Critique:</w:t>
+            </w:r>
+            <w:r>
+              <w:rPr>
+                <w:sz w:val="18"/>
+                <w:lang w:val="en-CA"/>
+              </w:rPr>
+              <w:t xml:space="preserve"> The video sells chaos as luck and uses outliers like the viral "cash me outside" clip (Video on Chaos Theory). That's survivorship bias. The research is really about the limits of prediction (Gleick; Lorenz).</w:t>
             </w:r>
           </w:p>
         </w:tc>
@@ -1874,17 +1553,16 @@
                 <w:sz w:val="18"/>
                 <w:lang w:val="en-CA"/>
               </w:rPr>
-              <w:t>Individual action:</w:t>
-            </w:r>
-            <w:r>
-              <w:rPr>
-                <w:sz w:val="18"/>
-                <w:lang w:val="en-CA"/>
-              </w:rPr>
-              <w:t xml:space="preserve"> You can't control results, so judge yourself on daily habits. Small positive actions add up (Video on Chaos Theory).</w:t>
-            </w:r>
-          </w:p>
-          <w:p/>
+              <w:t>Individual:</w:t>
+            </w:r>
+            <w:r>
+              <w:rPr>
+                <w:sz w:val="18"/>
+                <w:lang w:val="en-CA"/>
+              </w:rPr>
+              <w:t xml:space="preserve"> You can't control results, so judge yourself on daily habits (Video on Chaos Theory).</w:t>
+            </w:r>
+          </w:p>
           <w:p>
             <w:r>
               <w:rPr>
@@ -1892,17 +1570,16 @@
                 <w:sz w:val="18"/>
                 <w:lang w:val="en-CA"/>
               </w:rPr>
-              <w:t>Civic action:</w:t>
-            </w:r>
-            <w:r>
-              <w:rPr>
-                <w:sz w:val="18"/>
-                <w:lang w:val="en-CA"/>
-              </w:rPr>
-              <w:t xml:space="preserve"> Small things spread fast in a community, good or bad. One post can snowball. Misinformation spreads through the same butterfly effect, so people should think before they share.</w:t>
-            </w:r>
-          </w:p>
-          <w:p/>
+              <w:t>Civic:</w:t>
+            </w:r>
+            <w:r>
+              <w:rPr>
+                <w:sz w:val="18"/>
+                <w:lang w:val="en-CA"/>
+              </w:rPr>
+              <w:t xml:space="preserve"> One post can snowball, including misinformation, so think before you share.</w:t>
+            </w:r>
+          </w:p>
           <w:p>
             <w:r>
               <w:rPr>
@@ -1917,10 +1594,9 @@
                 <w:sz w:val="18"/>
                 <w:lang w:val="en-CA"/>
               </w:rPr>
-              <w:t xml:space="preserve"> Governments can't predict a policy's long term effects any better than Lorenz could predict the weather (Dizikes). Build in short review periods and pilot programs, and keep a backup plan. A 10 year plan nobody checks is a bad bet.</w:t>
-            </w:r>
-          </w:p>
-          <w:p/>
+              <w:t xml:space="preserve"> No one can predict a policy's long term effects (Dizikes), so use pilot programs and short review periods.</w:t>
+            </w:r>
+          </w:p>
           <w:p>
             <w:r>
               <w:rPr>
@@ -1935,7 +1611,7 @@
                 <w:sz w:val="18"/>
                 <w:lang w:val="en-CA"/>
               </w:rPr>
-              <w:t xml:space="preserve"> Laws get written for situations lawmakers can picture, and tech and markets move faster than that. Add sunset clauses (laws that expire unless someone reviews them) and set review dates. Peters' whole point is that fast change is normal now ("Thriving on Chaos").</w:t>
+              <w:t xml:space="preserve"> Laws can't keep up with fast change ("Thriving on Chaos"), so add sunset clauses and set review dates.</w:t>
             </w:r>
           </w:p>
         </w:tc>
@@ -2095,17 +1771,16 @@
                 <w:sz w:val="18"/>
                 <w:lang w:val="en-CA"/>
               </w:rPr>
-              <w:t>Individual (Bulldog employees and managers):</w:t>
-            </w:r>
-            <w:r>
-              <w:rPr>
-                <w:sz w:val="18"/>
-                <w:lang w:val="en-CA"/>
-              </w:rPr>
-              <w:t xml:space="preserve"> Every employee does one small positive thing a day, like a follow up call or helping a coworker. Managers set goals and break them into daily tasks (Video on Chaos Theory). Staff build relationships inside and outside the company even when there's no immediate payoff (Video on Chaos Theory).</w:t>
-            </w:r>
-          </w:p>
-          <w:p/>
+              <w:t>Individual:</w:t>
+            </w:r>
+            <w:r>
+              <w:rPr>
+                <w:sz w:val="18"/>
+                <w:lang w:val="en-CA"/>
+              </w:rPr>
+              <w:t xml:space="preserve"> Every Bulldog employee does one small positive thing a day, like a follow up call (Video on Chaos Theory).</w:t>
+            </w:r>
+          </w:p>
           <w:p>
             <w:r>
               <w:rPr>
@@ -2113,17 +1788,16 @@
                 <w:sz w:val="18"/>
                 <w:lang w:val="en-CA"/>
               </w:rPr>
-              <w:t>Institutional (Bulldog as a company):</w:t>
-            </w:r>
-            <w:r>
-              <w:rPr>
-                <w:sz w:val="18"/>
-                <w:lang w:val="en-CA"/>
-              </w:rPr>
-              <w:t xml:space="preserve"> Drop the fixed 5 year plan. Plan in 90 day cycles and keep a couple of "what if" scenarios ready. Pilot new ideas small before rolling them out. A failed pilot is cheap learning, which is what Peters means by supporting fast failures ("Thriving on Chaos"). Give front line teams the authority to act fast (Wheatley; Stacey).</w:t>
-            </w:r>
-          </w:p>
-          <w:p/>
+              <w:t>Institutional:</w:t>
+            </w:r>
+            <w:r>
+              <w:rPr>
+                <w:sz w:val="18"/>
+                <w:lang w:val="en-CA"/>
+              </w:rPr>
+              <w:t xml:space="preserve"> Replace the 5 year plan with 90 day plans, and pilot new ideas small before rolling them out ("Thriving on Chaos").</w:t>
+            </w:r>
+          </w:p>
           <w:p>
             <w:r>
               <w:rPr>
@@ -2131,17 +1805,16 @@
                 <w:sz w:val="18"/>
                 <w:lang w:val="en-CA"/>
               </w:rPr>
-              <w:t>Societal (customers and community):</w:t>
-            </w:r>
-            <w:r>
-              <w:rPr>
-                <w:sz w:val="18"/>
-                <w:lang w:val="en-CA"/>
-              </w:rPr>
-              <w:t xml:space="preserve"> One customer experience can go viral and define Bulldog. Train front line staff and let them fix problems on the spot. Listen hard to customers the way Peters says to ("Thriving on Chaos"), and build long term relationships in the community.</w:t>
-            </w:r>
-          </w:p>
-          <w:p/>
+              <w:t>Societal:</w:t>
+            </w:r>
+            <w:r>
+              <w:rPr>
+                <w:sz w:val="18"/>
+                <w:lang w:val="en-CA"/>
+              </w:rPr>
+              <w:t xml:space="preserve"> Let front line staff fix customer problems on the spot, since one bad experience can go viral (Wheatley).</w:t>
+            </w:r>
+          </w:p>
           <w:p>
             <w:r>
               <w:rPr>
@@ -2149,14 +1822,14 @@
                 <w:sz w:val="18"/>
                 <w:lang w:val="en-CA"/>
               </w:rPr>
-              <w:t>Political (government and regulation):</w:t>
-            </w:r>
-            <w:r>
-              <w:rPr>
-                <w:sz w:val="18"/>
-                <w:lang w:val="en-CA"/>
-              </w:rPr>
-              <w:t xml:space="preserve"> Laws, taxes, and trade rules can change without warning. Watch policy changes, don't depend on one supplier or one market, and keep a small response team ready. That keeps Bulldog at the edge of chaos: stable enough to run, loose enough to adapt ("Edge of Chaos"; Stacey).</w:t>
+              <w:t>Political:</w:t>
+            </w:r>
+            <w:r>
+              <w:rPr>
+                <w:sz w:val="18"/>
+                <w:lang w:val="en-CA"/>
+              </w:rPr>
+              <w:t xml:space="preserve"> Watch policy changes and don't rely on one supplier or market, so Bulldog stays at the edge of chaos (Stacey).</w:t>
             </w:r>
           </w:p>
         </w:tc>
@@ -2225,10 +1898,9 @@
                 <w:sz w:val="18"/>
                 <w:lang w:val="en-CA"/>
               </w:rPr>
-              <w:t>1. Chaos theory came out of weather research. Why should a company like Bulldog care?</w:t>
-            </w:r>
-          </w:p>
-          <w:p/>
+              <w:t>1. Chaos theory came from weather research. Why should Bulldog care?</w:t>
+            </w:r>
+          </w:p>
           <w:p>
             <w:r>
               <w:rPr>
@@ -2236,16 +1908,6 @@
                 <w:lang w:val="en-CA"/>
               </w:rPr>
               <w:t>2. If we can't predict the long term, should Bulldog stop making five year plans? What replaces them?</w:t>
-            </w:r>
-          </w:p>
-          <w:p/>
-          <w:p>
-            <w:r>
-              <w:rPr>
-                <w:sz w:val="18"/>
-                <w:lang w:val="en-CA"/>
-              </w:rPr>
-              <w:t>3. My video says to stack small positive actions. Is that chaos theory or just good habits? And where could the butterfly effect hurt Bulldog?</w:t>
             </w:r>
           </w:p>
         </w:tc>
@@ -2315,25 +1977,23 @@
                 <w:sz w:val="18"/>
                 <w:lang w:val="en-CA"/>
               </w:rPr>
-              <w:t>Q1: What is chaos theory in simple words?</w:t>
-            </w:r>
-          </w:p>
-          <w:p>
-            <w:r>
-              <w:rPr>
-                <w:sz w:val="18"/>
-                <w:lang w:val="en-CA"/>
-              </w:rPr>
-              <w:t>Memory hook: "Rules, but no long range forecast."</w:t>
-            </w:r>
-          </w:p>
-          <w:p>
-            <w:r>
-              <w:rPr>
-                <w:sz w:val="18"/>
-                <w:lang w:val="en-CA"/>
-              </w:rPr>
-              <w:t>Some systems follow clear rules and you still can't predict them far ahead, because tiny changes at the start blow up later. Lorenz found this in 1961 when rounding one number wrecked his weather forecast. That's the butterfly effect.</w:t>
+              <w:t>Q1: What is chaos theory?</w:t>
+            </w:r>
+            <w:r>
+              <w:rPr>
+                <w:sz w:val="18"/>
+                <w:lang w:val="en-CA"/>
+              </w:rPr>
+              <w:t xml:space="preserve"> (hook: "Rules, but no long range forecast")</w:t>
+            </w:r>
+          </w:p>
+          <w:p>
+            <w:r>
+              <w:rPr>
+                <w:sz w:val="18"/>
+                <w:lang w:val="en-CA"/>
+              </w:rPr>
+              <w:t>Some systems follow clear rules but you can't predict them far ahead, because tiny changes blow up later. Lorenz found this in 1961 when rounding one number wrecked his weather forecast.</w:t>
             </w:r>
           </w:p>
           <w:p/>
@@ -2344,54 +2004,23 @@
                 <w:sz w:val="18"/>
                 <w:lang w:val="en-CA"/>
               </w:rPr>
-              <w:t>Q2: How would Bulldog actually use it?</w:t>
-            </w:r>
-          </w:p>
-          <w:p>
-            <w:r>
-              <w:rPr>
-                <w:sz w:val="18"/>
-                <w:lang w:val="en-CA"/>
-              </w:rPr>
-              <w:t>Memory hook: "Plan short, test small."</w:t>
-            </w:r>
-          </w:p>
-          <w:p>
-            <w:r>
-              <w:rPr>
-                <w:sz w:val="18"/>
-                <w:lang w:val="en-CA"/>
-              </w:rPr>
-              <w:t>Plan in 90 day cycles instead of one rigid five year plan, and test new ideas small before betting big. Let front line people make calls, since they see problems first. Tom Peters calls this thriving on chaos.</w:t>
-            </w:r>
-          </w:p>
-          <w:p/>
-          <w:p>
-            <w:r>
-              <w:rPr>
-                <w:b/>
-                <w:sz w:val="18"/>
-                <w:lang w:val="en-CA"/>
-              </w:rPr>
-              <w:t>Q3: Does chaos mean there's no order?</w:t>
-            </w:r>
-          </w:p>
-          <w:p>
-            <w:r>
-              <w:rPr>
-                <w:sz w:val="18"/>
-                <w:lang w:val="en-CA"/>
-              </w:rPr>
-              <w:t>Memory hook: "Chaos isn't random."</w:t>
-            </w:r>
-          </w:p>
-          <w:p>
-            <w:r>
-              <w:rPr>
-                <w:sz w:val="18"/>
-                <w:lang w:val="en-CA"/>
-              </w:rPr>
-              <w:t>No. Chaotic systems still follow rules, you just can't call them far out. Margaret Wheatley says order shows up on its own when people share clear values, and that's self-organization.</w:t>
+              <w:t>Q2: How would Bulldog use it?</w:t>
+            </w:r>
+            <w:r>
+              <w:rPr>
+                <w:sz w:val="18"/>
+                <w:lang w:val="en-CA"/>
+              </w:rPr>
+              <w:t xml:space="preserve"> (hook: "Plan short, test small")</w:t>
+            </w:r>
+          </w:p>
+          <w:p>
+            <w:r>
+              <w:rPr>
+                <w:sz w:val="18"/>
+                <w:lang w:val="en-CA"/>
+              </w:rPr>
+              <w:t>Plan in 90 day cycles and test ideas small before betting big. Let front line staff make calls, since they see problems first. Tom Peters calls this thriving on chaos.</w:t>
             </w:r>
           </w:p>
         </w:tc>
@@ -2471,7 +2100,7 @@
           </w:tcPr>
           <w:p>
             <w:pPr>
-              <w:pStyle w:val="Normal"/>
+              <w:pStyle w:val="ListParagraph"/>
               <w:spacing w:line="240" w:lineRule="auto"/>
               <w:jc w:val="left"/>
               <w:rPr>
@@ -2479,14 +2108,17 @@
                 <w:szCs w:val="18"/>
                 <w:lang w:val="en-CA"/>
               </w:rPr>
+              <w:numPr>
+                <w:ilvl w:val="0"/>
+                <w:numId w:val="1"/>
+              </w:numPr>
             </w:pPr>
             <w:r>
               <w:rPr>
-                <w:b/>
-                <w:sz w:val="18"/>
-                <w:lang w:val="en-CA"/>
-              </w:rPr>
-              <w:t>Facts I can use (all cited):</w:t>
+                <w:sz w:val="18"/>
+                <w:lang w:val="en-CA"/>
+              </w:rPr>
+              <w:t>1961 rounding error, 1963 paper, 1972 butterfly talk (Dizikes; Lorenz).</w:t>
             </w:r>
           </w:p>
           <w:p>
@@ -2502,7 +2134,7 @@
                 <w:sz w:val="18"/>
                 <w:lang w:val="en-CA"/>
               </w:rPr>
-              <w:t>Lorenz, 1961: typed 0.506 instead of 0.506127 and the forecast changed completely (Dizikes).</w:t>
+              <w:t>Gleick 1987 made it mainstream (Gleick). Peters 1987: 45 prescriptions for managing change ("Thriving on Chaos").</w:t>
             </w:r>
           </w:p>
           <w:p>
@@ -2518,22 +2150,7 @@
                 <w:sz w:val="18"/>
                 <w:lang w:val="en-CA"/>
               </w:rPr>
-              <w:t xml:space="preserve">Lorenz, 1963: published "Deterministic Nonperiodic Flow" in the </w:t>
-            </w:r>
-            <w:r>
-              <w:rPr>
-                <w:i/>
-                <w:sz w:val="18"/>
-                <w:lang w:val="en-CA"/>
-              </w:rPr>
-              <w:t>Journal of the Atmospheric Sciences</w:t>
-            </w:r>
-            <w:r>
-              <w:rPr>
-                <w:sz w:val="18"/>
-                <w:lang w:val="en-CA"/>
-              </w:rPr>
-              <w:t>, widely seen as where chaos theory starts (Lorenz).</w:t>
+              <w:t>Wheatley 1992: set values, let people self-organize (Wheatley). Stacey 1992: strategy emerges (Stacey).</w:t>
             </w:r>
           </w:p>
           <w:p>
@@ -2549,7 +2166,18 @@
                 <w:sz w:val="18"/>
                 <w:lang w:val="en-CA"/>
               </w:rPr>
-              <w:t>Lorenz, 1972: the butterfly in Brazil, tornado in Texas talk that gave us "butterfly effect" (Dizikes).</w:t>
+              <w:t>Video: "fill up your day with really small positive actions" (Video on Chaos Theory).</w:t>
+            </w:r>
+          </w:p>
+          <w:p/>
+          <w:p>
+            <w:r>
+              <w:rPr>
+                <w:b/>
+                <w:sz w:val="18"/>
+                <w:lang w:val="en-CA"/>
+              </w:rPr>
+              <w:t>If someone pushes back:</w:t>
             </w:r>
           </w:p>
           <w:p>
@@ -2565,22 +2193,7 @@
                 <w:sz w:val="18"/>
                 <w:lang w:val="en-CA"/>
               </w:rPr>
-              <w:t xml:space="preserve">Gleick, 1987: </w:t>
-            </w:r>
-            <w:r>
-              <w:rPr>
-                <w:i/>
-                <w:sz w:val="18"/>
-                <w:lang w:val="en-CA"/>
-              </w:rPr>
-              <w:t>Chaos: Making a New Science</w:t>
-            </w:r>
-            <w:r>
-              <w:rPr>
-                <w:sz w:val="18"/>
-                <w:lang w:val="en-CA"/>
-              </w:rPr>
-              <w:t xml:space="preserve"> (Viking) made it mainstream (Gleick).</w:t>
+              <w:t>"Isn't this just luck?" No. Chaos runs on rules, it's just hard to predict (Lorenz).</w:t>
             </w:r>
           </w:p>
           <w:p>
@@ -2596,204 +2209,7 @@
                 <w:sz w:val="18"/>
                 <w:lang w:val="en-CA"/>
               </w:rPr>
-              <w:t xml:space="preserve">Peters, 1987: </w:t>
-            </w:r>
-            <w:r>
-              <w:rPr>
-                <w:i/>
-                <w:sz w:val="18"/>
-                <w:lang w:val="en-CA"/>
-              </w:rPr>
-              <w:t>Thriving on Chaos</w:t>
-            </w:r>
-            <w:r>
-              <w:rPr>
-                <w:sz w:val="18"/>
-                <w:lang w:val="en-CA"/>
-              </w:rPr>
-              <w:t xml:space="preserve"> lays out 45 prescriptions in five areas ("Thriving on Chaos").</w:t>
-            </w:r>
-          </w:p>
-          <w:p>
-            <w:pPr>
-              <w:pStyle w:val="ListParagraph"/>
-              <w:numPr>
-                <w:ilvl w:val="0"/>
-                <w:numId w:val="1"/>
-              </w:numPr>
-            </w:pPr>
-            <w:r>
-              <w:rPr>
-                <w:sz w:val="18"/>
-                <w:lang w:val="en-CA"/>
-              </w:rPr>
-              <w:t>Wheatley, 1992: companies are living systems, so set values and let people self-organize (Wheatley).</w:t>
-            </w:r>
-          </w:p>
-          <w:p>
-            <w:pPr>
-              <w:pStyle w:val="ListParagraph"/>
-              <w:numPr>
-                <w:ilvl w:val="0"/>
-                <w:numId w:val="1"/>
-              </w:numPr>
-            </w:pPr>
-            <w:r>
-              <w:rPr>
-                <w:sz w:val="18"/>
-                <w:lang w:val="en-CA"/>
-              </w:rPr>
-              <w:t>Stacey, 1992: strategy emerges in unpredictable, self-organizing ways (Stacey).</w:t>
-            </w:r>
-          </w:p>
-          <w:p>
-            <w:pPr>
-              <w:pStyle w:val="ListParagraph"/>
-              <w:numPr>
-                <w:ilvl w:val="0"/>
-                <w:numId w:val="1"/>
-              </w:numPr>
-            </w:pPr>
-            <w:r>
-              <w:rPr>
-                <w:sz w:val="18"/>
-                <w:lang w:val="en-CA"/>
-              </w:rPr>
-              <w:t>Packard, 1988: coined "edge of chaos" ("Edge of Chaos").</w:t>
-            </w:r>
-          </w:p>
-          <w:p/>
-          <w:p>
-            <w:r>
-              <w:rPr>
-                <w:b/>
-                <w:sz w:val="18"/>
-                <w:lang w:val="en-CA"/>
-              </w:rPr>
-              <w:t>From my video:</w:t>
-            </w:r>
-          </w:p>
-          <w:p>
-            <w:pPr>
-              <w:pStyle w:val="ListParagraph"/>
-              <w:numPr>
-                <w:ilvl w:val="0"/>
-                <w:numId w:val="1"/>
-              </w:numPr>
-            </w:pPr>
-            <w:r>
-              <w:rPr>
-                <w:sz w:val="18"/>
-                <w:lang w:val="en-CA"/>
-              </w:rPr>
-              <w:t>Chaos theory is "basically the same as the butterfly effect" (Video on Chaos Theory).</w:t>
-            </w:r>
-          </w:p>
-          <w:p>
-            <w:pPr>
-              <w:pStyle w:val="ListParagraph"/>
-              <w:numPr>
-                <w:ilvl w:val="0"/>
-                <w:numId w:val="1"/>
-              </w:numPr>
-            </w:pPr>
-            <w:r>
-              <w:rPr>
-                <w:sz w:val="18"/>
-                <w:lang w:val="en-CA"/>
-              </w:rPr>
-              <w:t>"fill up your day with really small positive actions" (Video on Chaos Theory).</w:t>
-            </w:r>
-          </w:p>
-          <w:p>
-            <w:pPr>
-              <w:pStyle w:val="ListParagraph"/>
-              <w:numPr>
-                <w:ilvl w:val="0"/>
-                <w:numId w:val="1"/>
-              </w:numPr>
-            </w:pPr>
-            <w:r>
-              <w:rPr>
-                <w:sz w:val="18"/>
-                <w:lang w:val="en-CA"/>
-              </w:rPr>
-              <w:t>"luck comes to those who are prepared for it" (Video on Chaos Theory).</w:t>
-            </w:r>
-          </w:p>
-          <w:p>
-            <w:pPr>
-              <w:pStyle w:val="ListParagraph"/>
-              <w:numPr>
-                <w:ilvl w:val="0"/>
-                <w:numId w:val="1"/>
-              </w:numPr>
-            </w:pPr>
-            <w:r>
-              <w:rPr>
-                <w:sz w:val="18"/>
-                <w:lang w:val="en-CA"/>
-              </w:rPr>
-              <w:t>"sometimes the smallest decisions can absolutely transform" your life (Video on Chaos Theory).</w:t>
-            </w:r>
-          </w:p>
-          <w:p/>
-          <w:p>
-            <w:r>
-              <w:rPr>
-                <w:b/>
-                <w:sz w:val="18"/>
-                <w:lang w:val="en-CA"/>
-              </w:rPr>
-              <w:t>If someone pushes back:</w:t>
-            </w:r>
-          </w:p>
-          <w:p>
-            <w:pPr>
-              <w:pStyle w:val="ListParagraph"/>
-              <w:numPr>
-                <w:ilvl w:val="0"/>
-                <w:numId w:val="1"/>
-              </w:numPr>
-            </w:pPr>
-            <w:r>
-              <w:rPr>
-                <w:sz w:val="18"/>
-                <w:lang w:val="en-CA"/>
-              </w:rPr>
-              <w:t>"Isn't this just luck?" No. Chaos is deterministic, so it runs on rules (Lorenz; Gleick).</w:t>
-            </w:r>
-          </w:p>
-          <w:p>
-            <w:pPr>
-              <w:pStyle w:val="ListParagraph"/>
-              <w:numPr>
-                <w:ilvl w:val="0"/>
-                <w:numId w:val="1"/>
-              </w:numPr>
-            </w:pPr>
-            <w:r>
-              <w:rPr>
-                <w:sz w:val="18"/>
-                <w:lang w:val="en-CA"/>
-              </w:rPr>
-              <w:t>"So planning is pointless?" No, you plan shorter and adjust. Even the video guy sets goals and daily tasks (Video on Chaos Theory).</w:t>
-            </w:r>
-          </w:p>
-          <w:p>
-            <w:pPr>
-              <w:pStyle w:val="ListParagraph"/>
-              <w:numPr>
-                <w:ilvl w:val="0"/>
-                <w:numId w:val="1"/>
-              </w:numPr>
-            </w:pPr>
-            <w:r>
-              <w:rPr>
-                <w:sz w:val="18"/>
-                <w:lang w:val="en-CA"/>
-              </w:rPr>
-              <w:t>"Is your video legit?" It's a good everyday example, but it's a self-help video selling a course (Video on Chaos Theory). That's why I back it up with Lorenz, Gleick, Peters, and Wheatley.</w:t>
+              <w:t>"So planning is pointless?" No. Plan shorter and adjust. Even the video creator sets goals and daily tasks (Video on Chaos Theory).</w:t>
             </w:r>
           </w:p>
         </w:tc>
@@ -3181,7 +2597,7 @@
                 <w:sz w:val="18"/>
                 <w:lang w:val="en-CA"/>
               </w:rPr>
-              <w:t>Thoroughly research the topic (memo)</w:t>
+              <w:t>Origin and names (memo)</w:t>
             </w:r>
           </w:p>
         </w:tc>
@@ -3195,7 +2611,7 @@
                 <w:sz w:val="18"/>
                 <w:lang w:val="en-CA"/>
               </w:rPr>
-              <w:t>Key Terms &amp; Concepts; Business Research section; Research informing my response</w:t>
+              <w:t>Key Terms: Lorenz, Gleick, Peters, Wheatley, Stacey, Packard</w:t>
             </w:r>
           </w:p>
         </w:tc>
@@ -3211,7 +2627,7 @@
                 <w:sz w:val="18"/>
                 <w:lang w:val="en-CA"/>
               </w:rPr>
-              <w:t>Include the origin of the theory (memo)</w:t>
+              <w:t>Cite all sources in MLA (memo)</w:t>
             </w:r>
           </w:p>
         </w:tc>
@@ -3225,7 +2641,7 @@
                 <w:sz w:val="18"/>
                 <w:lang w:val="en-CA"/>
               </w:rPr>
-              <w:t>Key Terms &amp; Concepts: "Origin and Names" (Lorenz 1961, 1963, 1972)</w:t>
+              <w:t>In-text citations throughout; Works Cited above</w:t>
             </w:r>
           </w:p>
         </w:tc>
@@ -3241,7 +2657,7 @@
                 <w:sz w:val="18"/>
                 <w:lang w:val="en-CA"/>
               </w:rPr>
-              <w:t>Include names associated with the theory (memo)</w:t>
+              <w:t>Advise Bulldog Corporation (memo)</w:t>
             </w:r>
           </w:p>
         </w:tc>
@@ -3255,7 +2671,7 @@
                 <w:sz w:val="18"/>
                 <w:lang w:val="en-CA"/>
               </w:rPr>
-              <w:t>Key Terms &amp; Concepts: Lorenz, Gleick, Peters, Wheatley, plus Stacey and Packard</w:t>
+              <w:t>Business Research and Applications rows</w:t>
             </w:r>
           </w:p>
         </w:tc>
@@ -3271,7 +2687,7 @@
                 <w:sz w:val="18"/>
                 <w:lang w:val="en-CA"/>
               </w:rPr>
-              <w:t>Cite all sources in MLA style (memo)</w:t>
+              <w:t>Ask and answer a question (memo)</w:t>
             </w:r>
           </w:p>
         </w:tc>
@@ -3285,7 +2701,7 @@
                 <w:sz w:val="18"/>
                 <w:lang w:val="en-CA"/>
               </w:rPr>
-              <w:t>In-text citations in every section; MLA 9 Works Cited above</w:t>
+              <w:t>Questions rows, with memory hooks for answering without notes</w:t>
             </w:r>
           </w:p>
         </w:tc>
@@ -3301,7 +2717,7 @@
                 <w:sz w:val="18"/>
                 <w:lang w:val="en-CA"/>
               </w:rPr>
-              <w:t>Advise Bulldog Corporation (memo)</w:t>
+              <w:t>Define key terms (organizer)</w:t>
             </w:r>
           </w:p>
         </w:tc>
@@ -3315,7 +2731,7 @@
                 <w:sz w:val="18"/>
                 <w:lang w:val="en-CA"/>
               </w:rPr>
-              <w:t>Applications row (individual, institutional, societal, political); Q&amp;A answer 2</w:t>
+              <w:t>Key Terms, in bold</w:t>
             </w:r>
           </w:p>
         </w:tc>
@@ -3331,7 +2747,7 @@
                 <w:sz w:val="18"/>
                 <w:lang w:val="en-CA"/>
               </w:rPr>
-              <w:t>Demonstration of the theory in action (memo)</w:t>
+              <w:t>Direct quotes as evidence (organizer)</w:t>
             </w:r>
           </w:p>
         </w:tc>
@@ -3345,7 +2761,7 @@
                 <w:sz w:val="18"/>
                 <w:lang w:val="en-CA"/>
               </w:rPr>
-              <w:t>Video row: the drink-of-water and car example and the free-video example from my video</w:t>
+              <w:t>Video quotes in the Video, Research, and Business Research rows</w:t>
             </w:r>
           </w:p>
         </w:tc>
@@ -3361,7 +2777,7 @@
                 <w:sz w:val="18"/>
                 <w:lang w:val="en-CA"/>
               </w:rPr>
-              <w:t>Ask one question to another member (memo)</w:t>
+              <w:t>Video choice and summary (organizer)</w:t>
             </w:r>
           </w:p>
         </w:tc>
@@ -3375,7 +2791,7 @@
                 <w:sz w:val="18"/>
                 <w:lang w:val="en-CA"/>
               </w:rPr>
-              <w:t>"Questions I will ask" row (3 options)</w:t>
+              <w:t>[VIDEO] row</w:t>
             </w:r>
           </w:p>
         </w:tc>
@@ -3391,7 +2807,7 @@
                 <w:sz w:val="18"/>
                 <w:lang w:val="en-CA"/>
               </w:rPr>
-              <w:t>Answer one question without notes (memo)</w:t>
+              <w:t>Group videos (organizer)</w:t>
             </w:r>
           </w:p>
         </w:tc>
@@ -3405,7 +2821,7 @@
                 <w:sz w:val="18"/>
                 <w:lang w:val="en-CA"/>
               </w:rPr>
-              <w:t>"Questions I will answer" row: short answers with memory hooks</w:t>
+              <w:t>[GROUP VIDEO] row, Members #1 to #4</w:t>
             </w:r>
           </w:p>
         </w:tc>
@@ -3421,7 +2837,7 @@
                 <w:sz w:val="18"/>
                 <w:lang w:val="en-CA"/>
               </w:rPr>
-              <w:t>Define key terms (organizer)</w:t>
+              <w:t>Implications and applications (organizer)</w:t>
             </w:r>
           </w:p>
         </w:tc>
@@ -3435,247 +2851,7 @@
                 <w:sz w:val="18"/>
                 <w:lang w:val="en-CA"/>
               </w:rPr>
-              <w:t>Key Terms: chaos theory, butterfly effect, nonlinearity, self-organization, edge of chaos, deterministic, plus video terms (bolded)</w:t>
-            </w:r>
-          </w:p>
-        </w:tc>
-      </w:tr>
-      <w:tr>
-        <w:tc>
-          <w:tcPr>
-            <w:tcW w:type="dxa" w:w="4320"/>
-          </w:tcPr>
-          <w:p>
-            <w:r>
-              <w:rPr>
-                <w:sz w:val="18"/>
-                <w:lang w:val="en-CA"/>
-              </w:rPr>
-              <w:t>Capture direct quotes for evidence (organizer)</w:t>
-            </w:r>
-          </w:p>
-        </w:tc>
-        <w:tc>
-          <w:tcPr>
-            <w:tcW w:type="dxa" w:w="6912"/>
-          </w:tcPr>
-          <w:p>
-            <w:r>
-              <w:rPr>
-                <w:sz w:val="18"/>
-                <w:lang w:val="en-CA"/>
-              </w:rPr>
-              <w:t>Short direct quotes from the video in the Video, Business Research, and Research rows</w:t>
-            </w:r>
-          </w:p>
-        </w:tc>
-      </w:tr>
-      <w:tr>
-        <w:tc>
-          <w:tcPr>
-            <w:tcW w:type="dxa" w:w="4320"/>
-          </w:tcPr>
-          <w:p>
-            <w:r>
-              <w:rPr>
-                <w:sz w:val="18"/>
-                <w:lang w:val="en-CA"/>
-              </w:rPr>
-              <w:t>Which video did you choose? Provide a summary (organizer)</w:t>
-            </w:r>
-          </w:p>
-        </w:tc>
-        <w:tc>
-          <w:tcPr>
-            <w:tcW w:type="dxa" w:w="6912"/>
-          </w:tcPr>
-          <w:p>
-            <w:r>
-              <w:rPr>
-                <w:sz w:val="18"/>
-                <w:lang w:val="en-CA"/>
-              </w:rPr>
-              <w:t>[VIDEO] row: citation details and summary in my own words</w:t>
-            </w:r>
-          </w:p>
-        </w:tc>
-      </w:tr>
-      <w:tr>
-        <w:tc>
-          <w:tcPr>
-            <w:tcW w:type="dxa" w:w="4320"/>
-          </w:tcPr>
-          <w:p>
-            <w:r>
-              <w:rPr>
-                <w:sz w:val="18"/>
-                <w:lang w:val="en-CA"/>
-              </w:rPr>
-              <w:t>Summarize group videos (organizer)</w:t>
-            </w:r>
-          </w:p>
-        </w:tc>
-        <w:tc>
-          <w:tcPr>
-            <w:tcW w:type="dxa" w:w="6912"/>
-          </w:tcPr>
-          <w:p>
-            <w:r>
-              <w:rPr>
-                <w:sz w:val="18"/>
-                <w:lang w:val="en-CA"/>
-              </w:rPr>
-              <w:t>[GROUP VIDEO] row: space for Members #1 to #4</w:t>
-            </w:r>
-          </w:p>
-        </w:tc>
-      </w:tr>
-      <w:tr>
-        <w:tc>
-          <w:tcPr>
-            <w:tcW w:type="dxa" w:w="4320"/>
-          </w:tcPr>
-          <w:p>
-            <w:r>
-              <w:rPr>
-                <w:sz w:val="18"/>
-                <w:lang w:val="en-CA"/>
-              </w:rPr>
-              <w:t>What can business research tell us? [CITE EVERYTHING] (organizer)</w:t>
-            </w:r>
-          </w:p>
-        </w:tc>
-        <w:tc>
-          <w:tcPr>
-            <w:tcW w:type="dxa" w:w="6912"/>
-          </w:tcPr>
-          <w:p>
-            <w:r>
-              <w:rPr>
-                <w:sz w:val="18"/>
-                <w:lang w:val="en-CA"/>
-              </w:rPr>
-              <w:t>Business Research row: video plus outside sources, "CONNECTS to" links</w:t>
-            </w:r>
-          </w:p>
-        </w:tc>
-      </w:tr>
-      <w:tr>
-        <w:tc>
-          <w:tcPr>
-            <w:tcW w:type="dxa" w:w="4320"/>
-          </w:tcPr>
-          <w:p>
-            <w:r>
-              <w:rPr>
-                <w:sz w:val="18"/>
-                <w:lang w:val="en-CA"/>
-              </w:rPr>
-              <w:t>Implications: individual, civic, policy reform, legal reform (organizer)</w:t>
-            </w:r>
-          </w:p>
-        </w:tc>
-        <w:tc>
-          <w:tcPr>
-            <w:tcW w:type="dxa" w:w="6912"/>
-          </w:tcPr>
-          <w:p>
-            <w:r>
-              <w:rPr>
-                <w:sz w:val="18"/>
-                <w:lang w:val="en-CA"/>
-              </w:rPr>
-              <w:t>Implications row: one point for each</w:t>
-            </w:r>
-          </w:p>
-        </w:tc>
-      </w:tr>
-      <w:tr>
-        <w:tc>
-          <w:tcPr>
-            <w:tcW w:type="dxa" w:w="4320"/>
-          </w:tcPr>
-          <w:p>
-            <w:r>
-              <w:rPr>
-                <w:sz w:val="18"/>
-                <w:lang w:val="en-CA"/>
-              </w:rPr>
-              <w:t>Applications: individual, institutional, societal, political (organizer)</w:t>
-            </w:r>
-          </w:p>
-        </w:tc>
-        <w:tc>
-          <w:tcPr>
-            <w:tcW w:type="dxa" w:w="6912"/>
-          </w:tcPr>
-          <w:p>
-            <w:r>
-              <w:rPr>
-                <w:sz w:val="18"/>
-                <w:lang w:val="en-CA"/>
-              </w:rPr>
-              <w:t>Applications row: each tied to Bulldog Corporation</w:t>
-            </w:r>
-          </w:p>
-        </w:tc>
-      </w:tr>
-      <w:tr>
-        <w:tc>
-          <w:tcPr>
-            <w:tcW w:type="dxa" w:w="4320"/>
-          </w:tcPr>
-          <w:p>
-            <w:r>
-              <w:rPr>
-                <w:sz w:val="18"/>
-                <w:lang w:val="en-CA"/>
-              </w:rPr>
-              <w:t>Research informing your response, WELL RESEARCHED (organizer)</w:t>
-            </w:r>
-          </w:p>
-        </w:tc>
-        <w:tc>
-          <w:tcPr>
-            <w:tcW w:type="dxa" w:w="6912"/>
-          </w:tcPr>
-          <w:p>
-            <w:r>
-              <w:rPr>
-                <w:sz w:val="18"/>
-                <w:lang w:val="en-CA"/>
-              </w:rPr>
-              <w:t>Last row: cited facts, video quotes, and answers to likely challenges</w:t>
-            </w:r>
-          </w:p>
-        </w:tc>
-      </w:tr>
-      <w:tr>
-        <w:tc>
-          <w:tcPr>
-            <w:tcW w:type="dxa" w:w="4320"/>
-          </w:tcPr>
-          <w:p>
-            <w:r>
-              <w:rPr>
-                <w:sz w:val="18"/>
-                <w:lang w:val="en-CA"/>
-              </w:rPr>
-              <w:t>Leave [teacher notes] alone</w:t>
-            </w:r>
-          </w:p>
-        </w:tc>
-        <w:tc>
-          <w:tcPr>
-            <w:tcW w:type="dxa" w:w="6912"/>
-          </w:tcPr>
-          <w:p>
-            <w:r>
-              <w:rPr>
-                <w:sz w:val="18"/>
-                <w:lang w:val="en-CA"/>
-              </w:rPr>
-              <w:t>Not edited</w:t>
+              <w:t>One point for each category asked</w:t>
             </w:r>
           </w:p>
         </w:tc>

</xml_diff>

<commit_message>
Remove in-text citations from organizer
Co-Authored-By: Claude Opus 5.5 <noreply@anthropic.com>
Claude-Session: https://claude.ai/code/session_01YDM2CEbR7hU42o8YJBPxRB
</commit_message>
<xml_diff>
--- a/Chaos_Theory_Group1_Organizer.docx
+++ b/Chaos_Theory_Group1_Organizer.docx
@@ -261,7 +261,7 @@
                 <w:sz w:val="18"/>
                 <w:lang w:val="en-CA"/>
               </w:rPr>
-              <w:t>: some systems follow strict rules and you still can't predict them long term, because tiny differences at the start grow into huge ones later (Dizikes; Gleick). Chaos isn't random. It's rule based but unpredictable far out.</w:t>
+              <w:t>: some systems follow strict rules and you still can't predict them long term, because tiny differences at the start grow into huge ones later. Chaos isn't random. It's rule based but unpredictable far out.</w:t>
             </w:r>
           </w:p>
           <w:p/>
@@ -311,7 +311,7 @@
                 <w:sz w:val="18"/>
                 <w:lang w:val="en-CA"/>
               </w:rPr>
-              <w:t xml:space="preserve"> he typed 0.506 instead of 0.506127 into a weather model and the forecast changed completely (Dizikes). His </w:t>
+              <w:t xml:space="preserve"> he typed 0.506 instead of 0.506127 into a weather model and the forecast changed completely. His </w:t>
             </w:r>
             <w:r>
               <w:rPr>
@@ -326,7 +326,7 @@
                 <w:sz w:val="18"/>
                 <w:lang w:val="en-CA"/>
               </w:rPr>
-              <w:t xml:space="preserve"> paper "Deterministic Nonperiodic Flow" is seen as the start of chaos theory (Lorenz), and his </w:t>
+              <w:t xml:space="preserve"> paper "Deterministic Nonperiodic Flow" is seen as the start of chaos theory, and his </w:t>
             </w:r>
             <w:r>
               <w:rPr>
@@ -356,7 +356,7 @@
                 <w:sz w:val="18"/>
                 <w:lang w:val="en-CA"/>
               </w:rPr>
-              <w:t xml:space="preserve"> (Dizikes).</w:t>
+              <w:t>.</w:t>
             </w:r>
           </w:p>
           <w:p>
@@ -410,7 +410,7 @@
                 <w:sz w:val="18"/>
                 <w:lang w:val="en-CA"/>
               </w:rPr>
-              <w:t>) made the idea mainstream (Gleick).</w:t>
+              <w:t>) made the idea mainstream.</w:t>
             </w:r>
           </w:p>
           <w:p>
@@ -464,7 +464,7 @@
                 <w:sz w:val="18"/>
                 <w:lang w:val="en-CA"/>
               </w:rPr>
-              <w:t>) says change is constant, so winning companies use chaos instead of fighting it ("Thriving on Chaos").</w:t>
+              <w:t>) says change is constant, so winning companies use chaos instead of fighting it.</w:t>
             </w:r>
           </w:p>
           <w:p>
@@ -518,7 +518,7 @@
                 <w:sz w:val="18"/>
                 <w:lang w:val="en-CA"/>
               </w:rPr>
-              <w:t>) says companies act more like living systems than machines (Wheatley).</w:t>
+              <w:t>) says companies act more like living systems than machines.</w:t>
             </w:r>
           </w:p>
           <w:p>
@@ -549,7 +549,7 @@
                 <w:sz w:val="18"/>
                 <w:lang w:val="en-CA"/>
               </w:rPr>
-              <w:t xml:space="preserve"> (1992) says strategy emerges as you go (Stacey). </w:t>
+              <w:t xml:space="preserve"> (1992) says strategy emerges as you go. </w:t>
             </w:r>
             <w:r>
               <w:rPr>
@@ -579,7 +579,7 @@
                 <w:sz w:val="18"/>
                 <w:lang w:val="en-CA"/>
               </w:rPr>
-              <w:t xml:space="preserve"> ("Edge of Chaos").</w:t>
+              <w:t>.</w:t>
             </w:r>
           </w:p>
           <w:p/>
@@ -607,7 +607,7 @@
                 <w:sz w:val="18"/>
                 <w:lang w:val="en-CA"/>
               </w:rPr>
-              <w:t>: small change now, big change later. My video calls chaos theory "basically the same as the butterfly effect" (Video on Chaos Theory).</w:t>
+              <w:t>: small change now, big change later. My video calls chaos theory "basically the same as the butterfly effect."</w:t>
             </w:r>
           </w:p>
           <w:p>
@@ -641,7 +641,7 @@
                 <w:sz w:val="18"/>
                 <w:lang w:val="en-CA"/>
               </w:rPr>
-              <w:t>: people create order without a boss running every move, as long as they share clear values (Wheatley).</w:t>
+              <w:t>: people create order without a boss running every move, as long as they share clear values.</w:t>
             </w:r>
           </w:p>
           <w:p>
@@ -658,7 +658,7 @@
                 <w:sz w:val="18"/>
                 <w:lang w:val="en-CA"/>
               </w:rPr>
-              <w:t>: the zone between too much order and total disorder, where systems adapt best ("Edge of Chaos"; Stacey).</w:t>
+              <w:t>: the zone between too much order and total disorder, where systems adapt best.</w:t>
             </w:r>
           </w:p>
           <w:p>
@@ -675,7 +675,7 @@
                 <w:sz w:val="18"/>
                 <w:lang w:val="en-CA"/>
               </w:rPr>
-              <w:t xml:space="preserve"> (from my video): small positive actions add up, because "it kind of all compounds" (Video on Chaos Theory).</w:t>
+              <w:t xml:space="preserve"> (from my video): small positive actions add up, because "it kind of all compounds."</w:t>
             </w:r>
           </w:p>
         </w:tc>
@@ -842,7 +842,7 @@
                 <w:sz w:val="18"/>
                 <w:lang w:val="en-CA"/>
               </w:rPr>
-              <w:t xml:space="preserve"> He says chaos theory is basically the butterfly effect. His example: going back inside for water delays him 20 seconds, which could decide whether he gets hit by a car (Video on Chaos Theory). He gives two tips:</w:t>
+              <w:t xml:space="preserve"> He says chaos theory is basically the butterfly effect. His example: going back inside for water delays him 20 seconds, which could decide whether he gets hit by a car. He gives two tips:</w:t>
             </w:r>
           </w:p>
           <w:p>
@@ -858,7 +858,7 @@
                 <w:sz w:val="18"/>
                 <w:lang w:val="en-CA"/>
               </w:rPr>
-              <w:t>Fill your day with small positive actions, since they stack up and "luck comes to those who are prepared for it" (Video on Chaos Theory).</w:t>
+              <w:t>Fill your day with small positive actions, since they stack up and "luck comes to those who are prepared for it."</w:t>
             </w:r>
           </w:p>
           <w:p>
@@ -874,7 +874,7 @@
                 <w:sz w:val="18"/>
                 <w:lang w:val="en-CA"/>
               </w:rPr>
-              <w:t>Business isn't black and white. Free videos he made for other people's courses later brought him customers, and one DM turned into his business partner (Video on Chaos Theory).</w:t>
+              <w:t>Business isn't black and white. Free videos he made for other people's courses later brought him customers, and one DM turned into his business partner.</w:t>
             </w:r>
           </w:p>
           <w:p/>
@@ -892,7 +892,7 @@
                 <w:sz w:val="18"/>
                 <w:lang w:val="en-CA"/>
               </w:rPr>
-              <w:t xml:space="preserve"> Good mindset advice, weak on the real theory, which comes from math and weather (Lorenz). He also sells his own course halfway through (Video on Chaos Theory), so I watch for bias.</w:t>
+              <w:t xml:space="preserve"> Good mindset advice, weak on the real theory, which comes from math and weather. He also sells his own course halfway through, so I watch for bias.</w:t>
             </w:r>
           </w:p>
         </w:tc>
@@ -1332,7 +1332,7 @@
                 <w:sz w:val="18"/>
                 <w:lang w:val="en-CA"/>
               </w:rPr>
-              <w:t xml:space="preserve"> One rounded number wrecked Lorenz's forecast (Dizikes). The video makes it personal: one small decision "has completely changed the outcome for the rest of my day" (Video on Chaos Theory).</w:t>
+              <w:t xml:space="preserve"> One rounded number wrecked Lorenz's forecast. The video makes it personal: one small decision "has completely changed the outcome for the rest of my day."</w:t>
             </w:r>
           </w:p>
           <w:p>
@@ -1366,7 +1366,7 @@
                 <w:sz w:val="18"/>
                 <w:lang w:val="en-CA"/>
               </w:rPr>
-              <w:t xml:space="preserve"> Long range forecasts break (Lorenz), so fixed five year plans break too. Stacey says strategy emerges as you go (Stacey). The video agrees goals still matter: "reverse engineer" them into daily tasks (Video on Chaos Theory).</w:t>
+              <w:t xml:space="preserve"> Long range forecasts break, so fixed five year plans break too. Stacey says strategy emerges as you go. The video agrees goals still matter: "reverse engineer" them into daily tasks.</w:t>
             </w:r>
           </w:p>
           <w:p>
@@ -1400,7 +1400,7 @@
                 <w:sz w:val="18"/>
                 <w:lang w:val="en-CA"/>
               </w:rPr>
-              <w:t xml:space="preserve"> Peters wants fewer bureaucratic rules, support for fast failures, and decisions pushed down to front line staff ("Thriving on Chaos").</w:t>
+              <w:t xml:space="preserve"> Peters wants fewer bureaucratic rules, support for fast failures, and decisions pushed down to front line staff.</w:t>
             </w:r>
           </w:p>
           <w:p>
@@ -1416,7 +1416,7 @@
                 <w:sz w:val="18"/>
                 <w:lang w:val="en-CA"/>
               </w:rPr>
-              <w:t>CONNECTS to the video's tip to say yes to things with no instant payoff (Video on Chaos Theory). You can't know which bet wins, so place lots of small ones.</w:t>
+              <w:t>CONNECTS to the video's tip to say yes to things with no instant payoff. You can't know which bet wins, so place lots of small ones.</w:t>
             </w:r>
           </w:p>
           <w:p/>
@@ -1434,7 +1434,7 @@
                 <w:sz w:val="18"/>
                 <w:lang w:val="en-CA"/>
               </w:rPr>
-              <w:t xml:space="preserve"> Wheatley says leaders should make values clear instead of controlling every detail, and people organize around them (Wheatley).</w:t>
+              <w:t xml:space="preserve"> Wheatley says leaders should make values clear instead of controlling every detail, and people organize around them.</w:t>
             </w:r>
           </w:p>
           <w:p>
@@ -1468,7 +1468,7 @@
                 <w:sz w:val="18"/>
                 <w:lang w:val="en-CA"/>
               </w:rPr>
-              <w:t xml:space="preserve"> The video sells chaos as luck and uses outliers like the viral "cash me outside" clip (Video on Chaos Theory). That's survivorship bias. The research is really about the limits of prediction (Gleick; Lorenz).</w:t>
+              <w:t xml:space="preserve"> The video sells chaos as luck and uses outliers like the viral "cash me outside" clip. That's survivorship bias. The research is really about the limits of prediction.</w:t>
             </w:r>
           </w:p>
         </w:tc>
@@ -1560,7 +1560,7 @@
                 <w:sz w:val="18"/>
                 <w:lang w:val="en-CA"/>
               </w:rPr>
-              <w:t xml:space="preserve"> You can't control results, so judge yourself on daily habits (Video on Chaos Theory).</w:t>
+              <w:t xml:space="preserve"> You can't control results, so judge yourself on daily habits.</w:t>
             </w:r>
           </w:p>
           <w:p>
@@ -1594,7 +1594,7 @@
                 <w:sz w:val="18"/>
                 <w:lang w:val="en-CA"/>
               </w:rPr>
-              <w:t xml:space="preserve"> No one can predict a policy's long term effects (Dizikes), so use pilot programs and short review periods.</w:t>
+              <w:t xml:space="preserve"> No one can predict a policy's long term effects, so use pilot programs and short review periods.</w:t>
             </w:r>
           </w:p>
           <w:p>
@@ -1611,7 +1611,7 @@
                 <w:sz w:val="18"/>
                 <w:lang w:val="en-CA"/>
               </w:rPr>
-              <w:t xml:space="preserve"> Laws can't keep up with fast change ("Thriving on Chaos"), so add sunset clauses and set review dates.</w:t>
+              <w:t xml:space="preserve"> Laws can't keep up with fast change, so add sunset clauses and set review dates.</w:t>
             </w:r>
           </w:p>
         </w:tc>
@@ -1778,7 +1778,7 @@
                 <w:sz w:val="18"/>
                 <w:lang w:val="en-CA"/>
               </w:rPr>
-              <w:t xml:space="preserve"> Every Bulldog employee does one small positive thing a day, like a follow up call (Video on Chaos Theory).</w:t>
+              <w:t xml:space="preserve"> Every Bulldog employee does one small positive thing a day, like a follow up call.</w:t>
             </w:r>
           </w:p>
           <w:p>
@@ -1795,7 +1795,7 @@
                 <w:sz w:val="18"/>
                 <w:lang w:val="en-CA"/>
               </w:rPr>
-              <w:t xml:space="preserve"> Replace the 5 year plan with 90 day plans, and pilot new ideas small before rolling them out ("Thriving on Chaos").</w:t>
+              <w:t xml:space="preserve"> Replace the 5 year plan with 90 day plans, and pilot new ideas small before rolling them out.</w:t>
             </w:r>
           </w:p>
           <w:p>
@@ -1812,7 +1812,7 @@
                 <w:sz w:val="18"/>
                 <w:lang w:val="en-CA"/>
               </w:rPr>
-              <w:t xml:space="preserve"> Let front line staff fix customer problems on the spot, since one bad experience can go viral (Wheatley).</w:t>
+              <w:t xml:space="preserve"> Let front line staff fix customer problems on the spot, since one bad experience can go viral.</w:t>
             </w:r>
           </w:p>
           <w:p>
@@ -1829,7 +1829,7 @@
                 <w:sz w:val="18"/>
                 <w:lang w:val="en-CA"/>
               </w:rPr>
-              <w:t xml:space="preserve"> Watch policy changes and don't rely on one supplier or market, so Bulldog stays at the edge of chaos (Stacey).</w:t>
+              <w:t xml:space="preserve"> Watch policy changes and don't rely on one supplier or market, so Bulldog stays at the edge of chaos.</w:t>
             </w:r>
           </w:p>
         </w:tc>
@@ -2118,7 +2118,7 @@
                 <w:sz w:val="18"/>
                 <w:lang w:val="en-CA"/>
               </w:rPr>
-              <w:t>1961 rounding error, 1963 paper, 1972 butterfly talk (Dizikes; Lorenz).</w:t>
+              <w:t>1961 rounding error, 1963 paper, 1972 butterfly talk.</w:t>
             </w:r>
           </w:p>
           <w:p>
@@ -2134,7 +2134,7 @@
                 <w:sz w:val="18"/>
                 <w:lang w:val="en-CA"/>
               </w:rPr>
-              <w:t>Gleick 1987 made it mainstream (Gleick). Peters 1987: 45 prescriptions for managing change ("Thriving on Chaos").</w:t>
+              <w:t>Gleick 1987 made it mainstream. Peters 1987: 45 prescriptions for managing change.</w:t>
             </w:r>
           </w:p>
           <w:p>
@@ -2150,7 +2150,7 @@
                 <w:sz w:val="18"/>
                 <w:lang w:val="en-CA"/>
               </w:rPr>
-              <w:t>Wheatley 1992: set values, let people self-organize (Wheatley). Stacey 1992: strategy emerges (Stacey).</w:t>
+              <w:t>Wheatley 1992: set values, let people self-organize. Stacey 1992: strategy emerges.</w:t>
             </w:r>
           </w:p>
           <w:p>
@@ -2166,7 +2166,7 @@
                 <w:sz w:val="18"/>
                 <w:lang w:val="en-CA"/>
               </w:rPr>
-              <w:t>Video: "fill up your day with really small positive actions" (Video on Chaos Theory).</w:t>
+              <w:t>Video: "fill up your day with really small positive actions."</w:t>
             </w:r>
           </w:p>
           <w:p/>
@@ -2193,7 +2193,7 @@
                 <w:sz w:val="18"/>
                 <w:lang w:val="en-CA"/>
               </w:rPr>
-              <w:t>"Isn't this just luck?" No. Chaos runs on rules, it's just hard to predict (Lorenz).</w:t>
+              <w:t>"Isn't this just luck?" No. Chaos runs on rules, it's just hard to predict.</w:t>
             </w:r>
           </w:p>
           <w:p>
@@ -2209,7 +2209,7 @@
                 <w:sz w:val="18"/>
                 <w:lang w:val="en-CA"/>
               </w:rPr>
-              <w:t>"So planning is pointless?" No. Plan shorter and adjust. Even the video creator sets goals and daily tasks (Video on Chaos Theory).</w:t>
+              <w:t>"So planning is pointless?" No. Plan shorter and adjust. Even the video creator sets goals and daily tasks.</w:t>
             </w:r>
           </w:p>
         </w:tc>
@@ -2641,7 +2641,7 @@
                 <w:sz w:val="18"/>
                 <w:lang w:val="en-CA"/>
               </w:rPr>
-              <w:t>In-text citations throughout; Works Cited above</w:t>
+              <w:t>MLA Works Cited above</w:t>
             </w:r>
           </w:p>
         </w:tc>

</xml_diff>

<commit_message>
Add group summaries, panel questions, and new sources to organizer
Co-Authored-By: Claude Opus 5.5 <noreply@anthropic.com>
Claude-Session: https://claude.ai/code/session_01YDM2CEbR7hU42o8YJBPxRB
</commit_message>
<xml_diff>
--- a/Chaos_Theory_Group1_Organizer.docx
+++ b/Chaos_Theory_Group1_Organizer.docx
@@ -1001,6 +1001,13 @@
               </w:rPr>
               <w:t>Group Member #1</w:t>
             </w:r>
+            <w:r>
+              <w:rPr>
+                <w:sz w:val="18"/>
+                <w:lang w:val="en-CA"/>
+              </w:rPr>
+              <w:t xml:space="preserve"> (Naya, article: "A Review of Business Dynamics: Chaos Theory and Organizational Transformation")</w:t>
+            </w:r>
           </w:p>
           <w:p>
             <w:pPr>
@@ -1013,6 +1020,13 @@
                 <w:lang w:val="en-CA"/>
               </w:rPr>
             </w:pPr>
+            <w:r>
+              <w:rPr>
+                <w:sz w:val="18"/>
+                <w:lang w:val="en-CA"/>
+              </w:rPr>
+              <w:t>Companies are complex, nonlinear systems that are never fully stable, a mix of chaos and order at the same time. The more complex a company gets, the more volatile it gets, and past events can't predict what comes next. The fix is to break the company into smaller systems, each with a sub goal that feeds one big goal, because a strict hierarchy slows down how fast those systems can respond. Management's job is to control the inputs and steer how the systems behave.</w:t>
+            </w:r>
           </w:p>
           <w:p>
             <w:pPr>
@@ -1028,6 +1042,13 @@
               </w:rPr>
               <w:t>Group Member #2</w:t>
             </w:r>
+            <w:r>
+              <w:rPr>
+                <w:sz w:val="18"/>
+                <w:lang w:val="en-CA"/>
+              </w:rPr>
+              <w:t xml:space="preserve"> (Adarsh, video)</w:t>
+            </w:r>
           </w:p>
           <w:p>
             <w:pPr>
@@ -1040,6 +1061,13 @@
                 <w:lang w:val="en-CA"/>
               </w:rPr>
             </w:pPr>
+            <w:r>
+              <w:rPr>
+                <w:sz w:val="18"/>
+                <w:lang w:val="en-CA"/>
+              </w:rPr>
+              <w:t>He uses baking a cake as the example: follow the recipe exactly and it can still flop because of small things like room temperature. Chaos theory studies how deterministic systems, ones that follow rules, still act unpredictably when small changes at the start lead to different outcomes. He traces the idea to Henri Poincaré, who first noticed sensitivity to initial conditions, and points to weather forecasts and the stock market as everyday examples.</w:t>
+            </w:r>
           </w:p>
           <w:p>
             <w:pPr>
@@ -1075,6 +1103,13 @@
               </w:rPr>
               <w:t xml:space="preserve"> #3</w:t>
             </w:r>
+            <w:r>
+              <w:rPr>
+                <w:sz w:val="18"/>
+                <w:lang w:val="en-CA"/>
+              </w:rPr>
+              <w:t xml:space="preserve"> (Sofia, video)</w:t>
+            </w:r>
           </w:p>
           <w:p>
             <w:pPr>
@@ -1087,6 +1122,13 @@
                 <w:lang w:val="en-CA"/>
               </w:rPr>
             </w:pPr>
+            <w:r>
+              <w:rPr>
+                <w:sz w:val="18"/>
+                <w:lang w:val="en-CA"/>
+              </w:rPr>
+              <w:t>Chaos theory works like a ripple effect, where every event, big or small, sets off a chain of other events. Her video's example is a car crash on the way to work that was set up by a string of small inconveniences. It compares classical physics, where the universe runs like clockwork, to chaos theory, where uncertainty is built in from the start.</w:t>
+            </w:r>
           </w:p>
           <w:p>
             <w:pPr>
@@ -1109,8 +1151,23 @@
               </w:rPr>
               <w:t>Group Member #4</w:t>
             </w:r>
-          </w:p>
-          <w:p/>
+            <w:r>
+              <w:rPr>
+                <w:sz w:val="18"/>
+                <w:lang w:val="en-CA"/>
+              </w:rPr>
+              <w:t xml:space="preserve"> (Mateo, video)</w:t>
+            </w:r>
+          </w:p>
+          <w:p>
+            <w:r>
+              <w:rPr>
+                <w:sz w:val="18"/>
+                <w:lang w:val="en-CA"/>
+              </w:rPr>
+              <w:t>Mine is in the [VIDEO] row above: chaos theory as the butterfly effect, plus two tips. Stack small positive actions, and say yes to things that don't pay off right away.</w:t>
+            </w:r>
+          </w:p>
         </w:tc>
       </w:tr>
       <w:tr>
@@ -1898,16 +1955,17 @@
                 <w:sz w:val="18"/>
                 <w:lang w:val="en-CA"/>
               </w:rPr>
-              <w:t>1. Chaos theory came from weather research. Why should Bulldog care?</w:t>
-            </w:r>
-          </w:p>
-          <w:p>
-            <w:r>
-              <w:rPr>
-                <w:sz w:val="18"/>
-                <w:lang w:val="en-CA"/>
-              </w:rPr>
-              <w:t>2. If we can't predict the long term, should Bulldog stop making five year plans? What replaces them?</w:t>
+              <w:t>1. To Sofia: "Why don't you explain some of the benefits of understanding chaos theory?"</w:t>
+            </w:r>
+          </w:p>
+          <w:p/>
+          <w:p>
+            <w:r>
+              <w:rPr>
+                <w:sz w:val="18"/>
+                <w:lang w:val="en-CA"/>
+              </w:rPr>
+              <w:t>2. To Sofia, to set up her conclusion: "So looking at all this information and research, what are the key ideas we learned that would be useful for Bulldog Corporation?"</w:t>
             </w:r>
           </w:p>
         </w:tc>
@@ -1977,23 +2035,23 @@
                 <w:sz w:val="18"/>
                 <w:lang w:val="en-CA"/>
               </w:rPr>
-              <w:t>Q1: What is chaos theory?</w:t>
-            </w:r>
-            <w:r>
-              <w:rPr>
-                <w:sz w:val="18"/>
-                <w:lang w:val="en-CA"/>
-              </w:rPr>
-              <w:t xml:space="preserve"> (hook: "Rules, but no long range forecast")</w:t>
-            </w:r>
-          </w:p>
-          <w:p>
-            <w:r>
-              <w:rPr>
-                <w:sz w:val="18"/>
-                <w:lang w:val="en-CA"/>
-              </w:rPr>
-              <w:t>Some systems follow clear rules but you can't predict them far ahead, because tiny changes blow up later. Lorenz found this in 1961 when rounding one number wrecked his weather forecast.</w:t>
+              <w:t>Sofia asks: "How is this even implemented in business management?"</w:t>
+            </w:r>
+            <w:r>
+              <w:rPr>
+                <w:sz w:val="18"/>
+                <w:lang w:val="en-CA"/>
+              </w:rPr>
+              <w:t xml:space="preserve"> (hook: "Plan short, test small")</w:t>
+            </w:r>
+          </w:p>
+          <w:p>
+            <w:r>
+              <w:rPr>
+                <w:sz w:val="18"/>
+                <w:lang w:val="en-CA"/>
+              </w:rPr>
+              <w:t>Bulldog keeps one big goal but plans in 90 day cycles and adjusts every time. New ideas get tested small, in one location first, and failing fast is okay. We also split the company into smaller teams with their own sub goals and let front line staff make calls, since a strict hierarchy reacts too slowly.</w:t>
             </w:r>
           </w:p>
           <w:p/>
@@ -2004,23 +2062,23 @@
                 <w:sz w:val="18"/>
                 <w:lang w:val="en-CA"/>
               </w:rPr>
-              <w:t>Q2: How would Bulldog use it?</w:t>
-            </w:r>
-            <w:r>
-              <w:rPr>
-                <w:sz w:val="18"/>
-                <w:lang w:val="en-CA"/>
-              </w:rPr>
-              <w:t xml:space="preserve"> (hook: "Plan short, test small")</w:t>
-            </w:r>
-          </w:p>
-          <w:p>
-            <w:r>
-              <w:rPr>
-                <w:sz w:val="18"/>
-                <w:lang w:val="en-CA"/>
-              </w:rPr>
-              <w:t>Plan in 90 day cycles and test ideas small before betting big. Let front line staff make calls, since they see problems first. Tom Peters calls this thriving on chaos.</w:t>
+              <w:t>Adarsh asks: "How can we see evidence of chaos theory working in business?"</w:t>
+            </w:r>
+            <w:r>
+              <w:rPr>
+                <w:sz w:val="18"/>
+                <w:lang w:val="en-CA"/>
+              </w:rPr>
+              <w:t xml:space="preserve"> (hook: "Diapers, a ship, a guitar")</w:t>
+            </w:r>
+          </w:p>
+          <w:p>
+            <w:r>
+              <w:rPr>
+                <w:sz w:val="18"/>
+                <w:lang w:val="en-CA"/>
+              </w:rPr>
+              <w:t>Procter and Gamble saw diaper sales stay steady while orders to its factories swung wildly, which is called the bullwhip effect. In 2021 one ship stuck in the Suez Canal held up shipping worldwide, and in 2009 one musician's YouTube song about United breaking his guitar went global. Small causes keep creating huge effects, and the companies that react fast handle it best.</w:t>
             </w:r>
           </w:p>
         </w:tc>
@@ -2167,6 +2225,38 @@
                 <w:lang w:val="en-CA"/>
               </w:rPr>
               <w:t>Video: "fill up your day with really small positive actions."</w:t>
+            </w:r>
+          </w:p>
+          <w:p>
+            <w:pPr>
+              <w:pStyle w:val="ListParagraph"/>
+              <w:numPr>
+                <w:ilvl w:val="0"/>
+                <w:numId w:val="1"/>
+              </w:numPr>
+            </w:pPr>
+            <w:r>
+              <w:rPr>
+                <w:sz w:val="18"/>
+                <w:lang w:val="en-CA"/>
+              </w:rPr>
+              <w:t>Group article: a strict hierarchy slows a company down, so split it into systems with sub goals that feed one main goal.</w:t>
+            </w:r>
+          </w:p>
+          <w:p>
+            <w:pPr>
+              <w:pStyle w:val="ListParagraph"/>
+              <w:numPr>
+                <w:ilvl w:val="0"/>
+                <w:numId w:val="1"/>
+              </w:numPr>
+            </w:pPr>
+            <w:r>
+              <w:rPr>
+                <w:sz w:val="18"/>
+                <w:lang w:val="en-CA"/>
+              </w:rPr>
+              <w:t>Evidence: the bullwhip effect at Procter and Gamble, the Ever Given stuck in the Suez Canal (2021), and "United Breaks Guitars" (2009).</w:t>
             </w:r>
           </w:p>
           <w:p/>
@@ -2367,6 +2457,34 @@
           <w:sz w:val="22"/>
           <w:lang w:val="en-CA"/>
         </w:rPr>
+        <w:t xml:space="preserve">Lee, Hau L., et al. "The Bullwhip Effect in Supply Chains." </w:t>
+      </w:r>
+      <w:r>
+        <w:rPr>
+          <w:i/>
+          <w:sz w:val="22"/>
+          <w:lang w:val="en-CA"/>
+        </w:rPr>
+        <w:t>Sloan Management Review</w:t>
+      </w:r>
+      <w:r>
+        <w:rPr>
+          <w:sz w:val="22"/>
+          <w:lang w:val="en-CA"/>
+        </w:rPr>
+        <w:t>, vol. 38, no. 3, 1997, pp. 93-102.</w:t>
+      </w:r>
+    </w:p>
+    <w:p>
+      <w:pPr>
+        <w:spacing w:after="120"/>
+        <w:ind w:left="720" w:hanging="720"/>
+      </w:pPr>
+      <w:r>
+        <w:rPr>
+          <w:sz w:val="22"/>
+          <w:lang w:val="en-CA"/>
+        </w:rPr>
         <w:t xml:space="preserve">Lorenz, Edward N. "Deterministic Nonperiodic Flow." </w:t>
       </w:r>
       <w:r>
@@ -2423,6 +2541,34 @@
           <w:sz w:val="22"/>
           <w:lang w:val="en-CA"/>
         </w:rPr>
+        <w:t xml:space="preserve">"A Review of Business Dynamics: Chaos Theory and Organizational Transformation." </w:t>
+      </w:r>
+      <w:r>
+        <w:rPr>
+          <w:i/>
+          <w:sz w:val="22"/>
+          <w:lang w:val="en-CA"/>
+        </w:rPr>
+        <w:t>International Journal of Advances in Management and Economics</w:t>
+      </w:r>
+      <w:r>
+        <w:rPr>
+          <w:sz w:val="22"/>
+          <w:lang w:val="en-CA"/>
+        </w:rPr>
+        <w:t>, 2023, www.researchgate.net/publication/376477621.</w:t>
+      </w:r>
+    </w:p>
+    <w:p>
+      <w:pPr>
+        <w:spacing w:after="120"/>
+        <w:ind w:left="720" w:hanging="720"/>
+      </w:pPr>
+      <w:r>
+        <w:rPr>
+          <w:sz w:val="22"/>
+          <w:lang w:val="en-CA"/>
+        </w:rPr>
         <w:t xml:space="preserve">Stacey, Ralph D. </w:t>
       </w:r>
       <w:r>
@@ -2507,6 +2653,34 @@
           <w:sz w:val="22"/>
           <w:lang w:val="en-CA"/>
         </w:rPr>
+        <w:t xml:space="preserve">Video on Chaos Theory and the Butterfly Effect. </w:t>
+      </w:r>
+      <w:r>
+        <w:rPr>
+          <w:i/>
+          <w:sz w:val="22"/>
+          <w:lang w:val="en-CA"/>
+        </w:rPr>
+        <w:t>YouTube</w:t>
+      </w:r>
+      <w:r>
+        <w:rPr>
+          <w:sz w:val="22"/>
+          <w:lang w:val="en-CA"/>
+        </w:rPr>
+        <w:t>, youtu.be/r_ahZOgPTsk.</w:t>
+      </w:r>
+    </w:p>
+    <w:p>
+      <w:pPr>
+        <w:spacing w:after="120"/>
+        <w:ind w:left="720" w:hanging="720"/>
+      </w:pPr>
+      <w:r>
+        <w:rPr>
+          <w:sz w:val="22"/>
+          <w:lang w:val="en-CA"/>
+        </w:rPr>
         <w:t xml:space="preserve">Wheatley, Margaret J. "Leadership and the New Science." </w:t>
       </w:r>
       <w:r>
@@ -2821,7 +2995,7 @@
                 <w:sz w:val="18"/>
                 <w:lang w:val="en-CA"/>
               </w:rPr>
-              <w:t>[GROUP VIDEO] row, Members #1 to #4</w:t>
+              <w:t>[GROUP VIDEO] row: Naya, Adarsh, Sofia, and me</w:t>
             </w:r>
           </w:p>
         </w:tc>

</xml_diff>